<commit_message>
feat(legal): add Mandato PJ/PN template routing and database migration
- Add document service routing for pl_co_mandato_pj and pl_co_mandato_pn
  to use the same template as pl_co_mandato_no_aval
- Create database migration to insert template records for both types
- Update Paga Local contract templates (Crédito and Mandato)

All three Mandato contract types now share the same template file:
FK COL paga local - Fin. COP - K° Mandato.docx

🤖 Generated with [Claude Code](https://claude.com/claude-code)

Co-Authored-By: Claude Opus 4.5 <noreply@anthropic.com>
</commit_message>
<xml_diff>
--- a/backend/templates/FK COL paga local - Fin. COP - K° Crédito (Aval PN).docx
+++ b/backend/templates/FK COL paga local - Fin. COP - K° Crédito (Aval PN).docx
@@ -1,6 +1,6 @@
 
 <file path=word/document.xml><?xml version="1.0" encoding="utf-8"?>
-<w:document xmlns:wpc="http://schemas.microsoft.com/office/word/2010/wordprocessingCanvas" xmlns:cx="http://schemas.microsoft.com/office/drawing/2014/chartex" xmlns:cx1="http://schemas.microsoft.com/office/drawing/2015/9/8/chartex" xmlns:cx2="http://schemas.microsoft.com/office/drawing/2015/10/21/chartex" xmlns:cx3="http://schemas.microsoft.com/office/drawing/2016/5/9/chartex" xmlns:cx4="http://schemas.microsoft.com/office/drawing/2016/5/10/chartex" xmlns:cx5="http://schemas.microsoft.com/office/drawing/2016/5/11/chartex" xmlns:cx6="http://schemas.microsoft.com/office/drawing/2016/5/12/chartex" xmlns:cx7="http://schemas.microsoft.com/office/drawing/2016/5/13/chartex" xmlns:cx8="http://schemas.microsoft.com/office/drawing/2016/5/14/chartex" xmlns:mc="http://schemas.openxmlformats.org/markup-compatibility/2006" xmlns:aink="http://schemas.microsoft.com/office/drawing/2016/ink" xmlns:am3d="http://schemas.microsoft.com/office/drawing/2017/model3d" xmlns:o="urn:schemas-microsoft-com:office:office" xmlns:oel="http://schemas.microsoft.com/office/2019/extlst" xmlns:r="http://schemas.openxmlformats.org/officeDocument/2006/relationships" xmlns:m="http://schemas.openxmlformats.org/officeDocument/2006/math" xmlns:v="urn:schemas-microsoft-com:vml" xmlns:wp14="http://schemas.microsoft.com/office/word/2010/wordprocessingDrawing" xmlns:wp="http://schemas.openxmlformats.org/drawingml/2006/wordprocessingDrawing" xmlns:w10="urn:schemas-microsoft-com:office:word" xmlns:w="http://schemas.openxmlformats.org/wordprocessingml/2006/main" xmlns:w14="http://schemas.microsoft.com/office/word/2010/wordml" xmlns:w15="http://schemas.microsoft.com/office/word/2012/wordml" xmlns:w16cex="http://schemas.microsoft.com/office/word/2018/wordml/cex" xmlns:w16cid="http://schemas.microsoft.com/office/word/2016/wordml/cid" xmlns:w16="http://schemas.microsoft.com/office/word/2018/wordml" xmlns:w16du="http://schemas.microsoft.com/office/word/2023/wordml/word16du" xmlns:w16sdtdh="http://schemas.microsoft.com/office/word/2020/wordml/sdtdatahash" xmlns:w16sdtfl="http://schemas.microsoft.com/office/word/2024/wordml/sdtformatlock" xmlns:w16se="http://schemas.microsoft.com/office/word/2015/wordml/symex" xmlns:wpg="http://schemas.microsoft.com/office/word/2010/wordprocessingGroup" xmlns:wpi="http://schemas.microsoft.com/office/word/2010/wordprocessingInk" xmlns:wne="http://schemas.microsoft.com/office/word/2006/wordml" xmlns:wps="http://schemas.microsoft.com/office/word/2010/wordprocessingShape" mc:Ignorable="w14 w15 w16se w16cid w16 w16cex w16sdtdh w16sdtfl w16du wp14">
+<w:document xmlns:wpc="http://schemas.microsoft.com/office/word/2010/wordprocessingCanvas" xmlns:cx="http://schemas.microsoft.com/office/drawing/2014/chartex" xmlns:cx1="http://schemas.microsoft.com/office/drawing/2015/9/8/chartex" xmlns:cx2="http://schemas.microsoft.com/office/drawing/2015/10/21/chartex" xmlns:cx3="http://schemas.microsoft.com/office/drawing/2016/5/9/chartex" xmlns:cx4="http://schemas.microsoft.com/office/drawing/2016/5/10/chartex" xmlns:cx5="http://schemas.microsoft.com/office/drawing/2016/5/11/chartex" xmlns:cx6="http://schemas.microsoft.com/office/drawing/2016/5/12/chartex" xmlns:cx7="http://schemas.microsoft.com/office/drawing/2016/5/13/chartex" xmlns:cx8="http://schemas.microsoft.com/office/drawing/2016/5/14/chartex" xmlns:mc="http://schemas.openxmlformats.org/markup-compatibility/2006" xmlns:aink="http://schemas.microsoft.com/office/drawing/2016/ink" xmlns:am3d="http://schemas.microsoft.com/office/drawing/2017/model3d" xmlns:o="urn:schemas-microsoft-com:office:office" xmlns:r="http://schemas.openxmlformats.org/officeDocument/2006/relationships" xmlns:m="http://schemas.openxmlformats.org/officeDocument/2006/math" xmlns:v="urn:schemas-microsoft-com:vml" xmlns:wp14="http://schemas.microsoft.com/office/word/2010/wordprocessingDrawing" xmlns:wp="http://schemas.openxmlformats.org/drawingml/2006/wordprocessingDrawing" xmlns:w10="urn:schemas-microsoft-com:office:word" xmlns:w="http://schemas.openxmlformats.org/wordprocessingml/2006/main" xmlns:w14="http://schemas.microsoft.com/office/word/2010/wordml" xmlns:w15="http://schemas.microsoft.com/office/word/2012/wordml" xmlns:w16cex="http://schemas.microsoft.com/office/word/2018/wordml/cex" xmlns:w16cid="http://schemas.microsoft.com/office/word/2016/wordml/cid" xmlns:w16="http://schemas.microsoft.com/office/word/2018/wordml" xmlns:w16se="http://schemas.microsoft.com/office/word/2015/wordml/symex" xmlns:wpg="http://schemas.microsoft.com/office/word/2010/wordprocessingGroup" xmlns:wpi="http://schemas.microsoft.com/office/word/2010/wordprocessingInk" xmlns:wne="http://schemas.microsoft.com/office/word/2006/wordml" xmlns:wps="http://schemas.microsoft.com/office/word/2010/wordprocessingShape" mc:Ignorable="w14 w15 w16se w16cid w16 w16cex wp14">
   <w:body>
     <w:p>
       <w:pPr>
@@ -114,25 +114,29 @@
       <w:r>
         <w:rPr>
           <w:rFonts w:cs="Open Sans"/>
+        </w:rPr>
+        <w:t>[</w:t>
+      </w:r>
+      <w:proofErr w:type="gramEnd"/>
+      <w:r>
+        <w:rPr>
+          <w:rFonts w:cs="Open Sans"/>
           <w:highlight w:val="yellow"/>
         </w:rPr>
         <w:t>NIT</w:t>
       </w:r>
-      <w:proofErr w:type="gramEnd"/>
-      <w:r>
-        <w:rPr>
-          <w:rFonts w:cs="Open Sans"/>
-        </w:rPr>
-        <w:t>:1:D:</w:t>
-      </w:r>
-      <w:proofErr w:type="gramStart"/>
-      <w:r>
-        <w:rPr>
-          <w:rFonts w:cs="Open Sans"/>
-        </w:rPr>
-        <w:t>M:DOM</w:t>
-      </w:r>
-      <w:proofErr w:type="gramEnd"/>
+      <w:r>
+        <w:rPr>
+          <w:rFonts w:cs="Open Sans"/>
+        </w:rPr>
+        <w:t>]</w:t>
+      </w:r>
+      <w:r>
+        <w:rPr>
+          <w:rFonts w:cs="Open Sans"/>
+        </w:rPr>
+        <w:t>:1:D:M:DOM</w:t>
+      </w:r>
     </w:p>
     <w:p>
       <w:pPr>
@@ -452,11 +456,11 @@
       <w:r>
         <w:rPr>
           <w:rFonts w:eastAsia="Open Sans" w:cs="Open Sans"/>
-          <w:b/>
+          <w:bCs/>
           <w:color w:val="000000"/>
           <w:szCs w:val="20"/>
         </w:rPr>
-        <w:t>FINKARGO COLOMBIA S.A.S.</w:t>
+        <w:t>FINKARGO COLOMBIA S.A.S.,</w:t>
       </w:r>
       <w:r>
         <w:rPr>
@@ -464,7 +468,7 @@
           <w:color w:val="000000"/>
           <w:szCs w:val="20"/>
         </w:rPr>
-        <w:t xml:space="preserve">, sociedad comercial, debidamente constituida y válidamente existente de conformidad con las leyes de Colombia, con domicilio en la ciudad de Bogotá D.C., identificada con NIT 901.456.364-1, y representada para todos los efectos de este Contrato de Crédito por John Elvis Jiménez </w:t>
+        <w:t xml:space="preserve"> sociedad comercial, debidamente constituida y válidamente existente de conformidad con las leyes de Colombia, con domicilio en la ciudad de Bogotá D.C., identificada con NIT 901.456.364-1, y representada para todos los efectos de este Contrato de Crédito por John Elvis Jiménez </w:t>
       </w:r>
       <w:proofErr w:type="spellStart"/>
       <w:r>
@@ -484,6 +488,7 @@
         </w:rPr>
         <w:t>, identificado como aparece al pie de su firma (“</w:t>
       </w:r>
+      <w:proofErr w:type="spellStart"/>
       <w:r>
         <w:rPr>
           <w:rFonts w:eastAsia="Open Sans" w:cs="Open Sans"/>
@@ -493,6 +498,7 @@
         </w:rPr>
         <w:t>Finkargo</w:t>
       </w:r>
+      <w:proofErr w:type="spellEnd"/>
       <w:r>
         <w:rPr>
           <w:rFonts w:eastAsia="Open Sans" w:cs="Open Sans"/>
@@ -520,7 +526,7 @@
       <w:r>
         <w:rPr>
           <w:rFonts w:eastAsia="Open Sans" w:cs="Open Sans"/>
-          <w:b/>
+          <w:bCs/>
           <w:color w:val="000000"/>
           <w:szCs w:val="20"/>
         </w:rPr>
@@ -529,7 +535,7 @@
       <w:r>
         <w:rPr>
           <w:rFonts w:eastAsia="Open Sans" w:cs="Open Sans"/>
-          <w:b/>
+          <w:bCs/>
           <w:color w:val="000000"/>
           <w:szCs w:val="20"/>
           <w:highlight w:val="yellow"/>
@@ -539,7 +545,7 @@
       <w:r>
         <w:rPr>
           <w:rFonts w:eastAsia="Open Sans" w:cs="Open Sans"/>
-          <w:b/>
+          <w:bCs/>
           <w:color w:val="000000"/>
           <w:szCs w:val="20"/>
         </w:rPr>
@@ -719,7 +725,7 @@
       <w:r>
         <w:rPr>
           <w:rFonts w:eastAsia="Open Sans" w:cs="Open Sans"/>
-          <w:b/>
+          <w:bCs/>
           <w:color w:val="000000"/>
           <w:szCs w:val="20"/>
         </w:rPr>
@@ -728,7 +734,7 @@
       <w:r>
         <w:rPr>
           <w:rFonts w:eastAsia="Open Sans" w:cs="Open Sans"/>
-          <w:b/>
+          <w:bCs/>
           <w:color w:val="000000"/>
           <w:szCs w:val="20"/>
           <w:highlight w:val="yellow"/>
@@ -738,11 +744,11 @@
       <w:r>
         <w:rPr>
           <w:rFonts w:eastAsia="Open Sans" w:cs="Open Sans"/>
-          <w:b/>
+          <w:bCs/>
           <w:color w:val="000000"/>
           <w:szCs w:val="20"/>
         </w:rPr>
-        <w:t>]</w:t>
+        <w:t>],</w:t>
       </w:r>
       <w:r>
         <w:rPr>
@@ -750,7 +756,7 @@
           <w:color w:val="000000"/>
           <w:szCs w:val="20"/>
         </w:rPr>
-        <w:t xml:space="preserve">, </w:t>
+        <w:t xml:space="preserve"> </w:t>
       </w:r>
       <w:r>
         <w:rPr>
@@ -1519,7 +1525,21 @@
         <w:rPr>
           <w:rFonts w:cs="Open Sans"/>
         </w:rPr>
-        <w:t xml:space="preserve">QUE, Finkargo es una compañía que, en desarrollo de su objeto social, </w:t>
+        <w:t xml:space="preserve">QUE, </w:t>
+      </w:r>
+      <w:proofErr w:type="spellStart"/>
+      <w:r>
+        <w:rPr>
+          <w:rFonts w:cs="Open Sans"/>
+        </w:rPr>
+        <w:t>Finkargo</w:t>
+      </w:r>
+      <w:proofErr w:type="spellEnd"/>
+      <w:r>
+        <w:rPr>
+          <w:rFonts w:cs="Open Sans"/>
+        </w:rPr>
+        <w:t xml:space="preserve"> es una compañía que, en desarrollo de su objeto social, </w:t>
       </w:r>
       <w:r>
         <w:rPr>
@@ -1630,7 +1650,21 @@
         <w:rPr>
           <w:rFonts w:cs="Open Sans"/>
         </w:rPr>
-        <w:t xml:space="preserve"> por Finkargo con el fin de </w:t>
+        <w:t xml:space="preserve"> por </w:t>
+      </w:r>
+      <w:proofErr w:type="spellStart"/>
+      <w:r>
+        <w:rPr>
+          <w:rFonts w:cs="Open Sans"/>
+        </w:rPr>
+        <w:t>Finkargo</w:t>
+      </w:r>
+      <w:proofErr w:type="spellEnd"/>
+      <w:r>
+        <w:rPr>
+          <w:rFonts w:cs="Open Sans"/>
+        </w:rPr>
+        <w:t xml:space="preserve"> con el fin de </w:t>
       </w:r>
       <w:r>
         <w:rPr>
@@ -2654,7 +2688,15 @@
         <w:t xml:space="preserve"> </w:t>
       </w:r>
       <w:r>
-        <w:t>respecto de Finkargo, cualquier Persona que no sea una Persona Sancionada.</w:t>
+        <w:t xml:space="preserve">respecto de </w:t>
+      </w:r>
+      <w:proofErr w:type="spellStart"/>
+      <w:r>
+        <w:t>Finkargo</w:t>
+      </w:r>
+      <w:proofErr w:type="spellEnd"/>
+      <w:r>
+        <w:t>, cualquier Persona que no sea una Persona Sancionada.</w:t>
       </w:r>
     </w:p>
     <w:p>
@@ -2753,7 +2795,15 @@
         <w:t>,</w:t>
       </w:r>
       <w:r>
-        <w:t xml:space="preserve"> el costo correspondiente al pago del gravamen a los movimientos financieros en que incurre Finkargo por realizar dicho </w:t>
+        <w:t xml:space="preserve"> el costo correspondiente al pago del gravamen a los movimientos financieros en que incurre </w:t>
+      </w:r>
+      <w:proofErr w:type="spellStart"/>
+      <w:r>
+        <w:t>Finkargo</w:t>
+      </w:r>
+      <w:proofErr w:type="spellEnd"/>
+      <w:r>
+        <w:t xml:space="preserve"> por realizar dicho </w:t>
       </w:r>
       <w:r>
         <w:t>Desembolso</w:t>
@@ -2800,7 +2850,15 @@
         <w:t>, respecto de cada Desembolso,</w:t>
       </w:r>
       <w:r>
-        <w:t xml:space="preserve"> el costo en que incurre Finkargo por realizar </w:t>
+        <w:t xml:space="preserve"> el costo en que incurre </w:t>
+      </w:r>
+      <w:proofErr w:type="spellStart"/>
+      <w:r>
+        <w:t>Finkargo</w:t>
+      </w:r>
+      <w:proofErr w:type="spellEnd"/>
+      <w:r>
+        <w:t xml:space="preserve"> por realizar </w:t>
       </w:r>
       <w:r>
         <w:t>la estructuración necesaria para llevar el mismo</w:t>
@@ -2838,7 +2896,15 @@
         <w:t>r</w:t>
       </w:r>
       <w:r>
-        <w:t xml:space="preserve"> una o más Obligaciones, la cual es recaudada por Finkargo por cuenta de la Afianzadora.</w:t>
+        <w:t xml:space="preserve"> una o más Obligaciones, la cual es recaudada por </w:t>
+      </w:r>
+      <w:proofErr w:type="spellStart"/>
+      <w:r>
+        <w:t>Finkargo</w:t>
+      </w:r>
+      <w:proofErr w:type="spellEnd"/>
+      <w:r>
+        <w:t xml:space="preserve"> por cuenta de la Afianzadora.</w:t>
       </w:r>
     </w:p>
     <w:p>
@@ -3159,7 +3225,15 @@
         <w:t xml:space="preserve">ránsito, en Zona Franca o en Zona Primaria Aduanera, según sea el caso, </w:t>
       </w:r>
       <w:r>
-        <w:t xml:space="preserve">y que sea suscrito por Finkargo, el Cliente y el Operador Logístico encargado de retener y custodiar </w:t>
+        <w:t xml:space="preserve">y que sea suscrito por </w:t>
+      </w:r>
+      <w:proofErr w:type="spellStart"/>
+      <w:r>
+        <w:t>Finkargo</w:t>
+      </w:r>
+      <w:proofErr w:type="spellEnd"/>
+      <w:r>
+        <w:t xml:space="preserve">, el Cliente y el Operador Logístico encargado de retener y custodiar </w:t>
       </w:r>
       <w:r>
         <w:t xml:space="preserve">la </w:t>
@@ -3185,7 +3259,15 @@
         <w:t>” significa un contrato de garantía mobiliaria en primer orden de prelación, sobre el Inventario,</w:t>
       </w:r>
       <w:r>
-        <w:t xml:space="preserve"> que sea suscrito por Finkargo, el Cliente y el Operador Logístico encargado de retener y custodiar el Inventario</w:t>
+        <w:t xml:space="preserve"> que sea suscrito por </w:t>
+      </w:r>
+      <w:proofErr w:type="spellStart"/>
+      <w:r>
+        <w:t>Finkargo</w:t>
+      </w:r>
+      <w:proofErr w:type="spellEnd"/>
+      <w:r>
+        <w:t>, el Cliente y el Operador Logístico encargado de retener y custodiar el Inventario</w:t>
       </w:r>
       <w:r>
         <w:t>.</w:t>
@@ -3294,7 +3376,15 @@
         <w:t>con ocasión</w:t>
       </w:r>
       <w:r>
-        <w:t xml:space="preserve"> de las cuales, el Cliente, actuando en calidad de mandante, otorga mandato(s) sin representación a Finkargo para que, éste último, en calidad de mandatario, realice determinado(s) Desembolso(s) </w:t>
+        <w:t xml:space="preserve"> de las cuales, el Cliente, actuando en calidad de mandante, otorga mandato(s) sin representación a </w:t>
+      </w:r>
+      <w:proofErr w:type="spellStart"/>
+      <w:r>
+        <w:t>Finkargo</w:t>
+      </w:r>
+      <w:proofErr w:type="spellEnd"/>
+      <w:r>
+        <w:t xml:space="preserve"> para que, éste último, en calidad de mandatario, realice determinado(s) Desembolso(s) </w:t>
       </w:r>
       <w:r>
         <w:t>en favor de determinado(s) Acreedor</w:t>
@@ -3544,21 +3634,21 @@
         <w:rPr>
           <w:rFonts w:eastAsiaTheme="majorEastAsia" w:cs="Open Sans"/>
         </w:rPr>
-        <w:t xml:space="preserve">” significa una Cotización de Desembolso enviada por Finkargo al Cliente en los términos de este Contrato, debidamente suscrita aceptada por un </w:t>
-      </w:r>
-      <w:proofErr w:type="gramStart"/>
+        <w:t xml:space="preserve">” significa una Cotización de Desembolso enviada por </w:t>
+      </w:r>
+      <w:proofErr w:type="spellStart"/>
       <w:r>
         <w:rPr>
           <w:rFonts w:eastAsiaTheme="majorEastAsia" w:cs="Open Sans"/>
         </w:rPr>
-        <w:t>Funcionario</w:t>
-      </w:r>
-      <w:proofErr w:type="gramEnd"/>
+        <w:t>Finkargo</w:t>
+      </w:r>
+      <w:proofErr w:type="spellEnd"/>
       <w:r>
         <w:rPr>
           <w:rFonts w:eastAsiaTheme="majorEastAsia" w:cs="Open Sans"/>
         </w:rPr>
-        <w:t xml:space="preserve"> Autorizado del Cliente.</w:t>
+        <w:t xml:space="preserve"> al Cliente en los términos de este Contrato, debidamente suscrita aceptada por un Funcionario Autorizado del Cliente.</w:t>
       </w:r>
     </w:p>
     <w:p>
@@ -4004,10 +4094,34 @@
         <w:rPr>
           <w:u w:val="single"/>
         </w:rPr>
-        <w:t>Cuenta de Finkargo</w:t>
-      </w:r>
-      <w:r>
-        <w:t xml:space="preserve">” significa la cuenta bancaria de Finkargo que sea notificada por escrito por Finkargo al Cliente de tiempo en tiempo durante la </w:t>
+        <w:t xml:space="preserve">Cuenta de </w:t>
+      </w:r>
+      <w:proofErr w:type="spellStart"/>
+      <w:r>
+        <w:rPr>
+          <w:u w:val="single"/>
+        </w:rPr>
+        <w:t>Finkargo</w:t>
+      </w:r>
+      <w:proofErr w:type="spellEnd"/>
+      <w:r>
+        <w:t xml:space="preserve">” significa la cuenta bancaria de </w:t>
+      </w:r>
+      <w:proofErr w:type="spellStart"/>
+      <w:r>
+        <w:t>Finkargo</w:t>
+      </w:r>
+      <w:proofErr w:type="spellEnd"/>
+      <w:r>
+        <w:t xml:space="preserve"> que sea notificada por escrito por </w:t>
+      </w:r>
+      <w:proofErr w:type="spellStart"/>
+      <w:r>
+        <w:t>Finkargo</w:t>
+      </w:r>
+      <w:proofErr w:type="spellEnd"/>
+      <w:r>
+        <w:t xml:space="preserve"> al Cliente de tiempo en tiempo durante la </w:t>
       </w:r>
       <w:r>
         <w:t>Vigencia</w:t>
@@ -4049,18 +4163,21 @@
         <w:t xml:space="preserve">, </w:t>
       </w:r>
       <w:r>
-        <w:t xml:space="preserve">en </w:t>
-      </w:r>
-      <w:proofErr w:type="gramStart"/>
-      <w:r>
-        <w:t>Dólares</w:t>
-      </w:r>
-      <w:proofErr w:type="gramEnd"/>
+        <w:t>en Dólares</w:t>
+      </w:r>
       <w:r>
         <w:t>,</w:t>
       </w:r>
       <w:r>
-        <w:t xml:space="preserve"> que Finkargo determine y notifique de tiempo en tiempo al Cliente</w:t>
+        <w:t xml:space="preserve"> que </w:t>
+      </w:r>
+      <w:proofErr w:type="spellStart"/>
+      <w:r>
+        <w:t>Finkargo</w:t>
+      </w:r>
+      <w:proofErr w:type="spellEnd"/>
+      <w:r>
+        <w:t xml:space="preserve"> determine y notifique de tiempo en tiempo al Cliente</w:t>
       </w:r>
       <w:r>
         <w:t xml:space="preserve">, </w:t>
@@ -4091,7 +4208,15 @@
         <w:t>pueda</w:t>
       </w:r>
       <w:r>
-        <w:t xml:space="preserve"> presentar a Finkargo una o más Solicitudes de Desembolso</w:t>
+        <w:t xml:space="preserve"> presentar a </w:t>
+      </w:r>
+      <w:proofErr w:type="spellStart"/>
+      <w:r>
+        <w:t>Finkargo</w:t>
+      </w:r>
+      <w:proofErr w:type="spellEnd"/>
+      <w:r>
+        <w:t xml:space="preserve"> una o más Solicitudes de Desembolso</w:t>
       </w:r>
       <w:r>
         <w:t xml:space="preserve"> destinadas al pago de uno o varios Gastos Nacionales de Importación</w:t>
@@ -4118,261 +4243,282 @@
         <w:t xml:space="preserve">esté </w:t>
       </w:r>
       <w:r>
-        <w:t xml:space="preserve">denominado en </w:t>
+        <w:t xml:space="preserve">denominado en Dólares, </w:t>
+      </w:r>
+      <w:r>
+        <w:t xml:space="preserve">los Desembolsos que con cargo a </w:t>
+      </w:r>
+      <w:r>
+        <w:t>é</w:t>
+      </w:r>
+      <w:r>
+        <w:t xml:space="preserve">ste realice </w:t>
+      </w:r>
+      <w:proofErr w:type="spellStart"/>
+      <w:r>
+        <w:t>Finkargo</w:t>
+      </w:r>
+      <w:proofErr w:type="spellEnd"/>
+      <w:r>
+        <w:t xml:space="preserve"> en los </w:t>
       </w:r>
       <w:proofErr w:type="gramStart"/>
       <w:r>
-        <w:t>Dólares</w:t>
+        <w:t xml:space="preserve">términos </w:t>
+      </w:r>
+      <w:r>
+        <w:t xml:space="preserve"> de</w:t>
       </w:r>
       <w:proofErr w:type="gramEnd"/>
       <w:r>
+        <w:t xml:space="preserve"> este</w:t>
+      </w:r>
+      <w:r>
+        <w:t xml:space="preserve"> Contrato de Crédito serán </w:t>
+      </w:r>
+      <w:r>
+        <w:t xml:space="preserve">en Pesos, para </w:t>
+      </w:r>
+      <w:r>
+        <w:t xml:space="preserve">lo cual </w:t>
+      </w:r>
+      <w:proofErr w:type="spellStart"/>
+      <w:r>
+        <w:t>Finkargo</w:t>
+      </w:r>
+      <w:proofErr w:type="spellEnd"/>
+      <w:r>
+        <w:t xml:space="preserve"> empleará</w:t>
+      </w:r>
+      <w:r>
+        <w:t xml:space="preserve"> la </w:t>
+      </w:r>
+      <w:r>
+        <w:t xml:space="preserve">TRM </w:t>
+      </w:r>
+      <w:r>
+        <w:t>de la Fecha de Desembolso</w:t>
+      </w:r>
+      <w:r>
+        <w:t>.</w:t>
+      </w:r>
+    </w:p>
+    <w:p>
+      <w:pPr>
+        <w:ind w:firstLine="1418"/>
+      </w:pPr>
+      <w:r>
+        <w:t>“</w:t>
+      </w:r>
+      <w:r>
+        <w:rPr>
+          <w:u w:val="single"/>
+        </w:rPr>
+        <w:t>Datos Personales</w:t>
+      </w:r>
+      <w:r>
+        <w:t>” tiene el significado que se le asigna en la Ley 1581 de 2012.</w:t>
+      </w:r>
+    </w:p>
+    <w:p>
+      <w:pPr>
+        <w:ind w:firstLine="1418"/>
+        <w:rPr>
+          <w:rFonts w:cs="Open Sans"/>
+        </w:rPr>
+      </w:pPr>
+      <w:r>
+        <w:rPr>
+          <w:rFonts w:cs="Open Sans"/>
+        </w:rPr>
+        <w:t>“</w:t>
+      </w:r>
+      <w:r>
+        <w:rPr>
+          <w:rFonts w:cs="Open Sans"/>
+          <w:u w:val="single"/>
+        </w:rPr>
+        <w:t>Desembolso</w:t>
+      </w:r>
+      <w:r>
+        <w:rPr>
+          <w:rFonts w:cs="Open Sans"/>
+        </w:rPr>
+        <w:t>”</w:t>
+      </w:r>
+      <w:r>
+        <w:rPr>
+          <w:rFonts w:cs="Open Sans"/>
+        </w:rPr>
+        <w:t xml:space="preserve"> </w:t>
+      </w:r>
+      <w:r>
+        <w:t>significa cualesquier</w:t>
+      </w:r>
+      <w:r>
+        <w:t>a</w:t>
+      </w:r>
+      <w:r>
+        <w:t xml:space="preserve"> </w:t>
+      </w:r>
+      <w:r>
+        <w:t>desembolso</w:t>
+      </w:r>
+      <w:r>
+        <w:t>(s)</w:t>
+      </w:r>
+      <w:r>
+        <w:t>,</w:t>
+      </w:r>
+      <w:r>
+        <w:t xml:space="preserve"> </w:t>
+      </w:r>
+      <w:r>
+        <w:t xml:space="preserve">con cargo al </w:t>
+      </w:r>
+      <w:r>
+        <w:t xml:space="preserve">Cupo de Crédito, que </w:t>
+      </w:r>
+      <w:r>
+        <w:t xml:space="preserve">realice </w:t>
+      </w:r>
+      <w:proofErr w:type="spellStart"/>
+      <w:r>
+        <w:t>Finkargo</w:t>
+      </w:r>
+      <w:proofErr w:type="spellEnd"/>
+      <w:r>
+        <w:t xml:space="preserve"> conforme a lo dispuesto en </w:t>
+      </w:r>
+      <w:r>
+        <w:t>este</w:t>
+      </w:r>
+      <w:r>
+        <w:t xml:space="preserve"> Contrato de Crédito</w:t>
+      </w:r>
+      <w:r>
+        <w:t>,</w:t>
+      </w:r>
+      <w:r>
+        <w:t xml:space="preserve"> con ocasión de una Solicitud de Desembolso y </w:t>
+      </w:r>
+      <w:r>
+        <w:t xml:space="preserve">la correspondiente </w:t>
+      </w:r>
+      <w:r>
+        <w:t xml:space="preserve">Cotización de Desembolso </w:t>
+      </w:r>
+      <w:r>
+        <w:t>Aceptada</w:t>
+      </w:r>
+      <w:r>
+        <w:t xml:space="preserve">, mediante transferencia directa </w:t>
+      </w:r>
+      <w:r>
+        <w:t xml:space="preserve">por parte de </w:t>
+      </w:r>
+      <w:proofErr w:type="spellStart"/>
+      <w:r>
+        <w:t>Finkargo</w:t>
+      </w:r>
+      <w:proofErr w:type="spellEnd"/>
+      <w:r>
+        <w:t xml:space="preserve"> </w:t>
+      </w:r>
+      <w:r>
+        <w:t>a uno o varios</w:t>
+      </w:r>
+      <w:r>
+        <w:t xml:space="preserve"> Acreedor</w:t>
+      </w:r>
+      <w:r>
+        <w:t>es</w:t>
+      </w:r>
+      <w:r>
+        <w:t xml:space="preserve"> de Gastos Nacionales de Importación</w:t>
+      </w:r>
+      <w:r>
+        <w:t xml:space="preserve"> que corresponda</w:t>
+      </w:r>
+      <w:r>
+        <w:t>(n)</w:t>
+      </w:r>
+      <w:r>
+        <w:t xml:space="preserve">, en nombre y </w:t>
+      </w:r>
+      <w:r>
+        <w:t>por cuenta</w:t>
+      </w:r>
+      <w:r>
+        <w:t xml:space="preserve"> del Cliente, </w:t>
+      </w:r>
+      <w:r>
+        <w:t xml:space="preserve">con el fin de pagar </w:t>
+      </w:r>
+      <w:r>
+        <w:t>uno o varios</w:t>
+      </w:r>
+      <w:r>
+        <w:t xml:space="preserve"> Gasto</w:t>
+      </w:r>
+      <w:r>
+        <w:t>s</w:t>
+      </w:r>
+      <w:r>
+        <w:t xml:space="preserve"> Nacional</w:t>
+      </w:r>
+      <w:r>
+        <w:t>es</w:t>
+      </w:r>
+      <w:r>
+        <w:t xml:space="preserve"> de Importación a cargo del Cliente</w:t>
+      </w:r>
+      <w:r>
+        <w:t>.</w:t>
+      </w:r>
+      <w:r>
+        <w:rPr>
+          <w:rFonts w:cs="Open Sans"/>
+        </w:rPr>
+        <w:t xml:space="preserve"> </w:t>
+      </w:r>
+      <w:r>
+        <w:rPr>
+          <w:rFonts w:cs="Open Sans"/>
+        </w:rPr>
+        <w:t xml:space="preserve">Para evitar cualquier duda, se aclara que un </w:t>
+      </w:r>
+      <w:r>
+        <w:rPr>
+          <w:rFonts w:cs="Open Sans"/>
+        </w:rPr>
+        <w:t xml:space="preserve">mismo </w:t>
+      </w:r>
+      <w:r>
+        <w:rPr>
+          <w:rFonts w:cs="Open Sans"/>
+        </w:rPr>
+        <w:t>Desembolso podrá estar compuesto por múltiples desembolsos individuales</w:t>
+      </w:r>
+      <w:r>
+        <w:rPr>
+          <w:rFonts w:cs="Open Sans"/>
+        </w:rPr>
+        <w:t>;</w:t>
+      </w:r>
+      <w:r>
+        <w:rPr>
+          <w:rFonts w:cs="Open Sans"/>
+        </w:rPr>
+        <w:t xml:space="preserve"> por lo tanto</w:t>
+      </w:r>
+      <w:r>
+        <w:rPr>
+          <w:rFonts w:cs="Open Sans"/>
+        </w:rPr>
         <w:t xml:space="preserve">, </w:t>
       </w:r>
       <w:r>
-        <w:t xml:space="preserve">los Desembolsos que con cargo a </w:t>
-      </w:r>
-      <w:r>
-        <w:t>é</w:t>
-      </w:r>
-      <w:r>
-        <w:t xml:space="preserve">ste realice Finkargo en los </w:t>
-      </w:r>
-      <w:proofErr w:type="gramStart"/>
-      <w:r>
-        <w:t xml:space="preserve">términos </w:t>
-      </w:r>
-      <w:r>
-        <w:t xml:space="preserve"> de</w:t>
-      </w:r>
-      <w:proofErr w:type="gramEnd"/>
-      <w:r>
-        <w:t xml:space="preserve"> este</w:t>
-      </w:r>
-      <w:r>
-        <w:t xml:space="preserve"> Contrato de Crédito serán </w:t>
-      </w:r>
-      <w:r>
-        <w:t xml:space="preserve">en Pesos, para </w:t>
-      </w:r>
-      <w:r>
-        <w:t>lo cual Finkargo empleará</w:t>
-      </w:r>
-      <w:r>
-        <w:t xml:space="preserve"> la </w:t>
-      </w:r>
-      <w:r>
-        <w:t xml:space="preserve">TRM </w:t>
-      </w:r>
-      <w:r>
-        <w:t>de la Fecha de Desembolso</w:t>
-      </w:r>
-      <w:r>
-        <w:t>.</w:t>
-      </w:r>
-    </w:p>
-    <w:p>
-      <w:pPr>
-        <w:ind w:firstLine="1418"/>
-      </w:pPr>
-      <w:r>
-        <w:t>“</w:t>
-      </w:r>
-      <w:r>
-        <w:rPr>
-          <w:u w:val="single"/>
-        </w:rPr>
-        <w:t>Datos Personales</w:t>
-      </w:r>
-      <w:r>
-        <w:t>” tiene el significado que se le asigna en la Ley 1581 de 2012.</w:t>
-      </w:r>
-    </w:p>
-    <w:p>
-      <w:pPr>
-        <w:ind w:firstLine="1418"/>
-        <w:rPr>
-          <w:rFonts w:cs="Open Sans"/>
-        </w:rPr>
-      </w:pPr>
-      <w:r>
-        <w:rPr>
-          <w:rFonts w:cs="Open Sans"/>
-        </w:rPr>
-        <w:t>“</w:t>
-      </w:r>
-      <w:r>
-        <w:rPr>
-          <w:rFonts w:cs="Open Sans"/>
-          <w:u w:val="single"/>
-        </w:rPr>
-        <w:t>Desembolso</w:t>
-      </w:r>
-      <w:r>
-        <w:rPr>
-          <w:rFonts w:cs="Open Sans"/>
-        </w:rPr>
-        <w:t>”</w:t>
-      </w:r>
-      <w:r>
-        <w:rPr>
-          <w:rFonts w:cs="Open Sans"/>
-        </w:rPr>
-        <w:t xml:space="preserve"> </w:t>
-      </w:r>
-      <w:r>
-        <w:t>significa cualesquier</w:t>
-      </w:r>
-      <w:r>
-        <w:t>a</w:t>
-      </w:r>
-      <w:r>
-        <w:t xml:space="preserve"> </w:t>
-      </w:r>
-      <w:r>
-        <w:t>desembolso</w:t>
-      </w:r>
-      <w:r>
-        <w:t>(s)</w:t>
-      </w:r>
-      <w:r>
-        <w:t>,</w:t>
-      </w:r>
-      <w:r>
-        <w:t xml:space="preserve"> </w:t>
-      </w:r>
-      <w:r>
-        <w:t xml:space="preserve">con cargo al </w:t>
-      </w:r>
-      <w:r>
-        <w:t xml:space="preserve">Cupo de Crédito, que </w:t>
-      </w:r>
-      <w:r>
-        <w:t>realice Finkargo</w:t>
-      </w:r>
-      <w:r>
-        <w:t xml:space="preserve"> conforme a lo dispuesto en </w:t>
-      </w:r>
-      <w:r>
-        <w:t>este</w:t>
-      </w:r>
-      <w:r>
-        <w:t xml:space="preserve"> Contrato de Crédito</w:t>
-      </w:r>
-      <w:r>
-        <w:t>,</w:t>
-      </w:r>
-      <w:r>
-        <w:t xml:space="preserve"> con ocasión de una Solicitud de Desembolso y </w:t>
-      </w:r>
-      <w:r>
-        <w:t xml:space="preserve">la correspondiente </w:t>
-      </w:r>
-      <w:r>
-        <w:t xml:space="preserve">Cotización de Desembolso </w:t>
-      </w:r>
-      <w:r>
-        <w:t>Aceptada</w:t>
-      </w:r>
-      <w:r>
-        <w:t xml:space="preserve">, mediante transferencia directa </w:t>
-      </w:r>
-      <w:r>
-        <w:t xml:space="preserve">por parte de Finkargo </w:t>
-      </w:r>
-      <w:r>
-        <w:t>a uno o varios</w:t>
-      </w:r>
-      <w:r>
-        <w:t xml:space="preserve"> Acreedor</w:t>
-      </w:r>
-      <w:r>
-        <w:t>es</w:t>
-      </w:r>
-      <w:r>
-        <w:t xml:space="preserve"> de Gastos Nacionales de Importación</w:t>
-      </w:r>
-      <w:r>
-        <w:t xml:space="preserve"> que corresponda</w:t>
-      </w:r>
-      <w:r>
-        <w:t>(n)</w:t>
-      </w:r>
-      <w:r>
-        <w:t xml:space="preserve">, en nombre y </w:t>
-      </w:r>
-      <w:r>
-        <w:t>por cuenta</w:t>
-      </w:r>
-      <w:r>
-        <w:t xml:space="preserve"> del Cliente, </w:t>
-      </w:r>
-      <w:r>
-        <w:t xml:space="preserve">con el fin de pagar </w:t>
-      </w:r>
-      <w:r>
-        <w:t>uno o varios</w:t>
-      </w:r>
-      <w:r>
-        <w:t xml:space="preserve"> Gasto</w:t>
-      </w:r>
-      <w:r>
-        <w:t>s</w:t>
-      </w:r>
-      <w:r>
-        <w:t xml:space="preserve"> Nacional</w:t>
-      </w:r>
-      <w:r>
-        <w:t>es</w:t>
-      </w:r>
-      <w:r>
-        <w:t xml:space="preserve"> de Importación a cargo del Cliente</w:t>
-      </w:r>
-      <w:r>
-        <w:t>.</w:t>
-      </w:r>
-      <w:r>
-        <w:rPr>
-          <w:rFonts w:cs="Open Sans"/>
-        </w:rPr>
-        <w:t xml:space="preserve"> </w:t>
-      </w:r>
-      <w:r>
-        <w:rPr>
-          <w:rFonts w:cs="Open Sans"/>
-        </w:rPr>
-        <w:t xml:space="preserve">Para evitar cualquier duda, se aclara que un </w:t>
-      </w:r>
-      <w:r>
-        <w:rPr>
-          <w:rFonts w:cs="Open Sans"/>
-        </w:rPr>
-        <w:t xml:space="preserve">mismo </w:t>
-      </w:r>
-      <w:r>
-        <w:rPr>
-          <w:rFonts w:cs="Open Sans"/>
-        </w:rPr>
-        <w:t>Desembolso podrá estar compuesto por múltiples desembolsos individuales</w:t>
-      </w:r>
-      <w:r>
-        <w:rPr>
-          <w:rFonts w:cs="Open Sans"/>
-        </w:rPr>
-        <w:t>;</w:t>
-      </w:r>
-      <w:r>
-        <w:rPr>
-          <w:rFonts w:cs="Open Sans"/>
-        </w:rPr>
-        <w:t xml:space="preserve"> por lo tanto</w:t>
-      </w:r>
-      <w:r>
-        <w:rPr>
-          <w:rFonts w:cs="Open Sans"/>
-        </w:rPr>
-        <w:t xml:space="preserve">, </w:t>
-      </w:r>
-      <w:r>
         <w:rPr>
           <w:rFonts w:cs="Open Sans"/>
         </w:rPr>
@@ -4390,11 +4536,19 @@
         </w:rPr>
         <w:t xml:space="preserve">parte de </w:t>
       </w:r>
-      <w:r>
-        <w:rPr>
-          <w:rFonts w:cs="Open Sans"/>
-        </w:rPr>
-        <w:t xml:space="preserve">Finkargo a uno o varios </w:t>
+      <w:proofErr w:type="spellStart"/>
+      <w:r>
+        <w:rPr>
+          <w:rFonts w:cs="Open Sans"/>
+        </w:rPr>
+        <w:t>Finkargo</w:t>
+      </w:r>
+      <w:proofErr w:type="spellEnd"/>
+      <w:r>
+        <w:rPr>
+          <w:rFonts w:cs="Open Sans"/>
+        </w:rPr>
+        <w:t xml:space="preserve"> a uno o varios </w:t>
       </w:r>
       <w:r>
         <w:rPr>
@@ -5037,14 +5191,12 @@
       <w:r>
         <w:t>“</w:t>
       </w:r>
-      <w:proofErr w:type="gramStart"/>
       <w:r>
         <w:rPr>
           <w:u w:val="single"/>
         </w:rPr>
         <w:t>Dólares</w:t>
       </w:r>
-      <w:proofErr w:type="gramEnd"/>
       <w:r>
         <w:t>”</w:t>
       </w:r>
@@ -5150,7 +5302,15 @@
         <w:t>d</w:t>
       </w:r>
       <w:r>
-        <w:t xml:space="preserve">) los derechos y acciones de Finkargo bajo </w:t>
+        <w:t xml:space="preserve">) los derechos y acciones de </w:t>
+      </w:r>
+      <w:proofErr w:type="spellStart"/>
+      <w:r>
+        <w:t>Finkargo</w:t>
+      </w:r>
+      <w:proofErr w:type="spellEnd"/>
+      <w:r>
+        <w:t xml:space="preserve"> bajo </w:t>
       </w:r>
       <w:r>
         <w:t>este</w:t>
@@ -5360,18 +5520,27 @@
         </w:rPr>
         <w:t xml:space="preserve">la fecha en que </w:t>
       </w:r>
+      <w:proofErr w:type="spellStart"/>
       <w:r>
         <w:rPr>
           <w:rFonts w:cs="Open Sans"/>
           <w:szCs w:val="22"/>
         </w:rPr>
-        <w:t xml:space="preserve">Finkargo </w:t>
-      </w:r>
+        <w:t>Finkargo</w:t>
+      </w:r>
+      <w:proofErr w:type="spellEnd"/>
       <w:r>
         <w:rPr>
           <w:rFonts w:cs="Open Sans"/>
           <w:szCs w:val="22"/>
         </w:rPr>
+        <w:t xml:space="preserve"> </w:t>
+      </w:r>
+      <w:r>
+        <w:rPr>
+          <w:rFonts w:cs="Open Sans"/>
+          <w:szCs w:val="22"/>
+        </w:rPr>
         <w:t>efectivamente realice</w:t>
       </w:r>
       <w:r>
@@ -5471,13 +5640,29 @@
         <w:t xml:space="preserve"> Aceptada</w:t>
       </w:r>
       <w:r>
-        <w:t>, en la cual el Cliente deba pagar a Finkargo la totalidad</w:t>
+        <w:t xml:space="preserve">, en la cual el Cliente deba pagar a </w:t>
+      </w:r>
+      <w:proofErr w:type="spellStart"/>
+      <w:r>
+        <w:t>Finkargo</w:t>
+      </w:r>
+      <w:proofErr w:type="spellEnd"/>
+      <w:r>
+        <w:t xml:space="preserve"> la totalidad</w:t>
       </w:r>
       <w:r>
         <w:t xml:space="preserve"> </w:t>
       </w:r>
       <w:r>
-        <w:t xml:space="preserve">del Valor Adeudado, de conformidad con el plazo acordado entre Finkargo y el Cliente y reflejado en la </w:t>
+        <w:t xml:space="preserve">del Valor Adeudado, de conformidad con el plazo acordado entre </w:t>
+      </w:r>
+      <w:proofErr w:type="spellStart"/>
+      <w:r>
+        <w:t>Finkargo</w:t>
+      </w:r>
+      <w:proofErr w:type="spellEnd"/>
+      <w:r>
+        <w:t xml:space="preserve"> y el Cliente y reflejado en la </w:t>
       </w:r>
       <w:r>
         <w:t xml:space="preserve">referida </w:t>
@@ -5540,13 +5725,29 @@
         <w:t xml:space="preserve">” </w:t>
       </w:r>
       <w:r>
-        <w:t>significa, (a) en relación con Finkargo, cualquiera de sus representantes legales, según se establezca de tiempo en tiempo en el Registro Mercantil</w:t>
+        <w:t xml:space="preserve">significa, (a) en relación con </w:t>
+      </w:r>
+      <w:proofErr w:type="spellStart"/>
+      <w:r>
+        <w:t>Finkargo</w:t>
+      </w:r>
+      <w:proofErr w:type="spellEnd"/>
+      <w:r>
+        <w:t>, cualquiera de sus representantes legales, según se establezca de tiempo en tiempo en el Registro Mercantil</w:t>
       </w:r>
       <w:r>
         <w:t xml:space="preserve"> de la Cámara de Comercio de su domicilio</w:t>
       </w:r>
       <w:r>
-        <w:t xml:space="preserve">; (b) en relación con el Cliente, cada una de las Personas naturales que tienen su firma registrada ante Finkargo y que cuentan con las autorizaciones legales y estatutarias necesarias para actuar en nombre y por cuenta del Cliente bajo </w:t>
+        <w:t xml:space="preserve">; (b) en relación con el Cliente, cada una de las Personas naturales que tienen su firma registrada ante </w:t>
+      </w:r>
+      <w:proofErr w:type="spellStart"/>
+      <w:r>
+        <w:t>Finkargo</w:t>
+      </w:r>
+      <w:proofErr w:type="spellEnd"/>
+      <w:r>
+        <w:t xml:space="preserve"> y que cuentan con las autorizaciones legales y estatutarias necesarias para actuar en nombre y por cuenta del Cliente bajo </w:t>
       </w:r>
       <w:r>
         <w:t>este</w:t>
@@ -5578,7 +5779,15 @@
         <w:t xml:space="preserve"> los Contratos de Garantía</w:t>
       </w:r>
       <w:r>
-        <w:t>; y (b) cualesquiera otros Gravámenes constituidos por el Cliente en favor de Finkargo y/o cualquier Cesionario Permitido.</w:t>
+        <w:t xml:space="preserve">; y (b) cualesquiera otros Gravámenes constituidos por el Cliente en favor de </w:t>
+      </w:r>
+      <w:proofErr w:type="spellStart"/>
+      <w:r>
+        <w:t>Finkargo</w:t>
+      </w:r>
+      <w:proofErr w:type="spellEnd"/>
+      <w:r>
+        <w:t xml:space="preserve"> y/o cualquier Cesionario Permitido.</w:t>
       </w:r>
     </w:p>
     <w:p>
@@ -6320,19 +6529,59 @@
         <w:t>Impuestos Excluidos</w:t>
       </w:r>
       <w:r>
-        <w:t>” significa, respecto de Finkargo, los Impuestos que, (a) se retengan o deduzcan de los pagos que se realicen a Finkargo bajo este Contrato de Crédito o cualquier Cotización de Desembolso</w:t>
+        <w:t xml:space="preserve">” significa, respecto de </w:t>
+      </w:r>
+      <w:proofErr w:type="spellStart"/>
+      <w:r>
+        <w:t>Finkargo</w:t>
+      </w:r>
+      <w:proofErr w:type="spellEnd"/>
+      <w:r>
+        <w:t xml:space="preserve">, los Impuestos que, (a) se retengan o deduzcan de los pagos que se realicen a </w:t>
+      </w:r>
+      <w:proofErr w:type="spellStart"/>
+      <w:r>
+        <w:t>Finkargo</w:t>
+      </w:r>
+      <w:proofErr w:type="spellEnd"/>
+      <w:r>
+        <w:t xml:space="preserve"> bajo este Contrato de Crédito o cualquier Cotización de Desembolso</w:t>
       </w:r>
       <w:r>
         <w:t xml:space="preserve"> Aceptada</w:t>
       </w:r>
       <w:r>
-        <w:t xml:space="preserve">, pero únicamente hasta por el monto que Finkargo pueda deducir efectivamente de su renta líquida o acreditar al pago de sus Impuestos, siempre y cuando Finkargo haya recibido un certificado de retenciones en cumplimiento de las Leyes Aplicables por parte del </w:t>
+        <w:t xml:space="preserve">, pero únicamente hasta por el monto que </w:t>
+      </w:r>
+      <w:proofErr w:type="spellStart"/>
+      <w:r>
+        <w:t>Finkargo</w:t>
+      </w:r>
+      <w:proofErr w:type="spellEnd"/>
+      <w:r>
+        <w:t xml:space="preserve"> pueda deducir efectivamente de su renta líquida o acreditar al pago de sus Impuestos, siempre y cuando </w:t>
+      </w:r>
+      <w:proofErr w:type="spellStart"/>
+      <w:r>
+        <w:t>Finkargo</w:t>
+      </w:r>
+      <w:proofErr w:type="spellEnd"/>
+      <w:r>
+        <w:t xml:space="preserve"> haya recibido un certificado de retenciones en cumplimiento de las Leyes Aplicables por parte del </w:t>
       </w:r>
       <w:r>
         <w:t>Cliente</w:t>
       </w:r>
       <w:r>
-        <w:t>; y (b) se causen o resulten del incumplimiento o el cumplimiento tardío obligaciones tributarias formales a cargo de Finkargo.</w:t>
+        <w:t xml:space="preserve">; y (b) se causen o resulten del incumplimiento o el cumplimiento tardío obligaciones tributarias formales a cargo de </w:t>
+      </w:r>
+      <w:proofErr w:type="spellStart"/>
+      <w:r>
+        <w:t>Finkargo</w:t>
+      </w:r>
+      <w:proofErr w:type="spellEnd"/>
+      <w:r>
+        <w:t>.</w:t>
       </w:r>
     </w:p>
     <w:p>
@@ -6490,7 +6739,15 @@
         <w:t>, según se especifique en el Contrato de Mandato,</w:t>
       </w:r>
       <w:r>
-        <w:t xml:space="preserve"> las instrucciones entregadas por el Cliente, en calidad de mandante, a Finkargo, en calidad de mandatario, para que éste último realice determinado Desembolso por cuenta suya.</w:t>
+        <w:t xml:space="preserve"> las instrucciones entregadas por el Cliente, en calidad de mandante, a </w:t>
+      </w:r>
+      <w:proofErr w:type="spellStart"/>
+      <w:r>
+        <w:t>Finkargo</w:t>
+      </w:r>
+      <w:proofErr w:type="spellEnd"/>
+      <w:r>
+        <w:t>, en calidad de mandatario, para que éste último realice determinado Desembolso por cuenta suya.</w:t>
       </w:r>
     </w:p>
     <w:p>
@@ -7108,7 +7365,21 @@
         <w:rPr>
           <w:i/>
         </w:rPr>
-        <w:t xml:space="preserve"> Ban </w:t>
+        <w:t xml:space="preserve"> </w:t>
+      </w:r>
+      <w:proofErr w:type="spellStart"/>
+      <w:r>
+        <w:rPr>
+          <w:i/>
+        </w:rPr>
+        <w:t>Ban</w:t>
+      </w:r>
+      <w:proofErr w:type="spellEnd"/>
+      <w:r>
+        <w:rPr>
+          <w:i/>
+        </w:rPr>
+        <w:t xml:space="preserve"> </w:t>
       </w:r>
       <w:proofErr w:type="spellStart"/>
       <w:r>
@@ -7653,7 +7924,15 @@
         <w:t xml:space="preserve">” significa el monto máximo por el cual el Cliente puede realizar una Solicitud de Desembolso, el cual </w:t>
       </w:r>
       <w:r>
-        <w:t>será determinado y notificado por Finkargo al Cliente</w:t>
+        <w:t xml:space="preserve">será determinado y notificado por </w:t>
+      </w:r>
+      <w:proofErr w:type="spellStart"/>
+      <w:r>
+        <w:t>Finkargo</w:t>
+      </w:r>
+      <w:proofErr w:type="spellEnd"/>
+      <w:r>
+        <w:t xml:space="preserve"> al Cliente</w:t>
       </w:r>
       <w:r>
         <w:t xml:space="preserve"> de tiempo en tiempo</w:t>
@@ -7679,7 +7958,15 @@
         <w:t xml:space="preserve">” significa el monto mínimo por el cual el Cliente puede realizar una Solicitud de Desembolso, el cual </w:t>
       </w:r>
       <w:r>
-        <w:t>será determinado y notificado por Finkargo al Cliente</w:t>
+        <w:t xml:space="preserve">será determinado y notificado por </w:t>
+      </w:r>
+      <w:proofErr w:type="spellStart"/>
+      <w:r>
+        <w:t>Finkargo</w:t>
+      </w:r>
+      <w:proofErr w:type="spellEnd"/>
+      <w:r>
+        <w:t xml:space="preserve"> al Cliente</w:t>
       </w:r>
       <w:r>
         <w:t xml:space="preserve"> de tiempo en tiempo.</w:t>
@@ -7709,7 +7996,15 @@
         <w:t>” significa</w:t>
       </w:r>
       <w:r>
-        <w:t xml:space="preserve">, sin duplicación, todas las obligaciones de pago o dinerarias que contraiga o llegare a contraer el Cliente en favor de Finkargo en virtud </w:t>
+        <w:t xml:space="preserve">, sin duplicación, todas las obligaciones de pago o dinerarias que contraiga o llegare a contraer el Cliente en favor de </w:t>
+      </w:r>
+      <w:proofErr w:type="spellStart"/>
+      <w:r>
+        <w:t>Finkargo</w:t>
+      </w:r>
+      <w:proofErr w:type="spellEnd"/>
+      <w:r>
+        <w:t xml:space="preserve"> en virtud </w:t>
       </w:r>
       <w:r>
         <w:t>de este</w:t>
@@ -7870,7 +8165,15 @@
       </w:r>
       <w:proofErr w:type="spellEnd"/>
       <w:r>
-        <w:t>, autorizado por Finkargo en origen y destino</w:t>
+        <w:t xml:space="preserve">, autorizado por </w:t>
+      </w:r>
+      <w:proofErr w:type="spellStart"/>
+      <w:r>
+        <w:t>Finkargo</w:t>
+      </w:r>
+      <w:proofErr w:type="spellEnd"/>
+      <w:r>
+        <w:t xml:space="preserve"> en origen y destino</w:t>
       </w:r>
       <w:r>
         <w:t xml:space="preserve"> si aplica, que presta uno o más servicios de carga al Cliente</w:t>
@@ -7922,7 +8225,15 @@
       </w:r>
       <w:proofErr w:type="spellEnd"/>
       <w:r>
-        <w:t>, autorizado por Finkargo, que presta uno o más servicios de carga</w:t>
+        <w:t xml:space="preserve">, autorizado por </w:t>
+      </w:r>
+      <w:proofErr w:type="spellStart"/>
+      <w:r>
+        <w:t>Finkargo</w:t>
+      </w:r>
+      <w:proofErr w:type="spellEnd"/>
+      <w:r>
+        <w:t>, que presta uno o más servicios de carga</w:t>
       </w:r>
       <w:r>
         <w:t xml:space="preserve"> al Cliente</w:t>
@@ -8374,7 +8685,15 @@
         <w:t>Plataforma</w:t>
       </w:r>
       <w:r>
-        <w:t xml:space="preserve">” significa la infraestructura tecnológica desarrollada por Finkargo disponible a través del sitio web </w:t>
+        <w:t xml:space="preserve">” significa la infraestructura tecnológica desarrollada por </w:t>
+      </w:r>
+      <w:proofErr w:type="spellStart"/>
+      <w:r>
+        <w:t>Finkargo</w:t>
+      </w:r>
+      <w:proofErr w:type="spellEnd"/>
+      <w:r>
+        <w:t xml:space="preserve"> disponible a través del sitio web </w:t>
       </w:r>
       <w:hyperlink r:id="rId10">
         <w:r>
@@ -8392,7 +8711,23 @@
         <w:t xml:space="preserve"> </w:t>
       </w:r>
       <w:r>
-        <w:t>o a través de cualquier otro medio que Finkargo disponga, según Finkargo lo notifique de tiempo en tiempo al Cliente durante la Vigencia.</w:t>
+        <w:t xml:space="preserve">o a través de cualquier otro medio que </w:t>
+      </w:r>
+      <w:proofErr w:type="spellStart"/>
+      <w:r>
+        <w:t>Finkargo</w:t>
+      </w:r>
+      <w:proofErr w:type="spellEnd"/>
+      <w:r>
+        <w:t xml:space="preserve"> disponga, según </w:t>
+      </w:r>
+      <w:proofErr w:type="spellStart"/>
+      <w:r>
+        <w:t>Finkargo</w:t>
+      </w:r>
+      <w:proofErr w:type="spellEnd"/>
+      <w:r>
+        <w:t xml:space="preserve"> lo notifique de tiempo en tiempo al Cliente durante la Vigencia.</w:t>
       </w:r>
     </w:p>
     <w:p>
@@ -8819,7 +9154,15 @@
         <w:t xml:space="preserve">” </w:t>
       </w:r>
       <w:r>
-        <w:t xml:space="preserve">significa, con respecto a un Desembolso, la menor tasa entre, (a) la tasa máxima de intereses permitida por la Ley Aplicable; y (b) la tasa de interés que sea acordada entre Finkargo y el Cliente y que conste en la Cotización de Desembolso </w:t>
+        <w:t xml:space="preserve">significa, con respecto a un Desembolso, la menor tasa entre, (a) la tasa máxima de intereses permitida por la Ley Aplicable; y (b) la tasa de interés que sea acordada entre </w:t>
+      </w:r>
+      <w:proofErr w:type="spellStart"/>
+      <w:r>
+        <w:t>Finkargo</w:t>
+      </w:r>
+      <w:proofErr w:type="spellEnd"/>
+      <w:r>
+        <w:t xml:space="preserve"> y el Cliente y que conste en la Cotización de Desembolso </w:t>
       </w:r>
       <w:r>
         <w:t>Aceptada que corresponda</w:t>
@@ -9055,21 +9398,7 @@
         <w:rPr>
           <w:rFonts w:eastAsiaTheme="majorEastAsia" w:cs="Open Sans"/>
         </w:rPr>
-        <w:t xml:space="preserve">significa la tasa de cambio representativa del mercado para determinar la cantidad de Pesos equivalentes a un </w:t>
-      </w:r>
-      <w:proofErr w:type="gramStart"/>
-      <w:r>
-        <w:rPr>
-          <w:rFonts w:eastAsiaTheme="majorEastAsia" w:cs="Open Sans"/>
-        </w:rPr>
-        <w:t>Dólar</w:t>
-      </w:r>
-      <w:proofErr w:type="gramEnd"/>
-      <w:r>
-        <w:rPr>
-          <w:rFonts w:eastAsiaTheme="majorEastAsia" w:cs="Open Sans"/>
-        </w:rPr>
-        <w:t>, calculada y certificada diariamente por la Superintendencia Financiera de Colombia (o por quien haga sus veces) y publicada diariamente en su página web (</w:t>
+        <w:t>significa la tasa de cambio representativa del mercado para determinar la cantidad de Pesos equivalentes a un Dólar, calculada y certificada diariamente por la Superintendencia Financiera de Colombia (o por quien haga sus veces) y publicada diariamente en su página web (</w:t>
       </w:r>
       <w:hyperlink r:id="rId11" w:history="1">
         <w:r>
@@ -9114,7 +9443,15 @@
         <w:t>” significa</w:t>
       </w:r>
       <w:r>
-        <w:t>, respecto de cada Desembolso, la totalidad del valor adeudado por el Cliente a Finkargo, según se especifique en la Cotización</w:t>
+        <w:t xml:space="preserve">, respecto de cada Desembolso, la totalidad del valor adeudado por el Cliente a </w:t>
+      </w:r>
+      <w:proofErr w:type="spellStart"/>
+      <w:r>
+        <w:t>Finkargo</w:t>
+      </w:r>
+      <w:proofErr w:type="spellEnd"/>
+      <w:r>
+        <w:t>, según se especifique en la Cotización</w:t>
       </w:r>
       <w:r>
         <w:t xml:space="preserve"> de Desembolso</w:t>
@@ -9156,7 +9493,15 @@
         <w:t xml:space="preserve">” </w:t>
       </w:r>
       <w:r>
-        <w:t xml:space="preserve">significa, a una fecha determinada, la sumatoria de las Obligaciones pendientes de pago por el Cliente a Finkargo bajo </w:t>
+        <w:t xml:space="preserve">significa, a una fecha determinada, la sumatoria de las Obligaciones pendientes de pago por el Cliente a </w:t>
+      </w:r>
+      <w:proofErr w:type="spellStart"/>
+      <w:r>
+        <w:t>Finkargo</w:t>
+      </w:r>
+      <w:proofErr w:type="spellEnd"/>
+      <w:r>
+        <w:t xml:space="preserve"> bajo </w:t>
       </w:r>
       <w:r>
         <w:t>este</w:t>
@@ -9368,7 +9713,15 @@
         <w:t>de este</w:t>
       </w:r>
       <w:r>
-        <w:t xml:space="preserve"> Contrato de Crédito, Finkargo otorga</w:t>
+        <w:t xml:space="preserve"> Contrato de Crédito, </w:t>
+      </w:r>
+      <w:proofErr w:type="spellStart"/>
+      <w:r>
+        <w:t>Finkargo</w:t>
+      </w:r>
+      <w:proofErr w:type="spellEnd"/>
+      <w:r>
+        <w:t xml:space="preserve"> otorga</w:t>
       </w:r>
       <w:r>
         <w:t>rá</w:t>
@@ -9392,15 +9745,7 @@
         <w:t>el</w:t>
       </w:r>
       <w:r>
-        <w:t xml:space="preserve"> valor equivalente en Pesos, a doscientos noventa millones de </w:t>
-      </w:r>
-      <w:proofErr w:type="gramStart"/>
-      <w:r>
-        <w:t>Pesos</w:t>
-      </w:r>
-      <w:proofErr w:type="gramEnd"/>
-      <w:r>
-        <w:t xml:space="preserve"> (COP$290.000.000) o seis mil 6.000 (seis mil) </w:t>
+        <w:t xml:space="preserve"> valor equivalente en Pesos, a doscientos noventa millones de Pesos (COP$290.000.000) o seis mil 6.000 (seis mil) </w:t>
       </w:r>
       <w:proofErr w:type="spellStart"/>
       <w:r>
@@ -9426,7 +9771,15 @@
         <w:t xml:space="preserve"> </w:t>
       </w:r>
       <w:r>
-        <w:t>en caso de que, por cualquier motivo, Finkargo conceda al Cliente un Cupo de Crédito superior al Límite del Cupo de Crédito, el mismo se entenderá reducido y ajustado automáticamente al Límite del Cupo de Crédito correspondiente.</w:t>
+        <w:t xml:space="preserve">en caso de que, por cualquier motivo, </w:t>
+      </w:r>
+      <w:proofErr w:type="spellStart"/>
+      <w:r>
+        <w:t>Finkargo</w:t>
+      </w:r>
+      <w:proofErr w:type="spellEnd"/>
+      <w:r>
+        <w:t xml:space="preserve"> conceda al Cliente un Cupo de Crédito superior al Límite del Cupo de Crédito, el mismo se entenderá reducido y ajustado automáticamente al Límite del Cupo de Crédito correspondiente.</w:t>
       </w:r>
     </w:p>
     <w:p>
@@ -9479,7 +9832,15 @@
         <w:t xml:space="preserve">a través de la presentación de </w:t>
       </w:r>
       <w:r>
-        <w:t>una o más Solicitudes de Desembolso, las cuales Finkargo, a su entera discreción y sujeto al cumplimiento de las condiciones previstas en este Contrato de Crédito, podrá aceptar y, en consecuencia, realizar uno o más Desembolsos</w:t>
+        <w:t xml:space="preserve">una o más Solicitudes de Desembolso, las cuales </w:t>
+      </w:r>
+      <w:proofErr w:type="spellStart"/>
+      <w:r>
+        <w:t>Finkargo</w:t>
+      </w:r>
+      <w:proofErr w:type="spellEnd"/>
+      <w:r>
+        <w:t>, a su entera discreción y sujeto al cumplimiento de las condiciones previstas en este Contrato de Crédito, podrá aceptar y, en consecuencia, realizar uno o más Desembolsos</w:t>
       </w:r>
       <w:r>
         <w:t xml:space="preserve"> con cargo al Cupo de Crédito respectivo</w:t>
@@ -9516,8 +9877,13 @@
         </w:rPr>
         <w:t xml:space="preserve">Sujeto a los términos aquí establecidos, </w:t>
       </w:r>
-      <w:r>
-        <w:t>Finkargo definirá</w:t>
+      <w:proofErr w:type="spellStart"/>
+      <w:r>
+        <w:t>Finkargo</w:t>
+      </w:r>
+      <w:proofErr w:type="spellEnd"/>
+      <w:r>
+        <w:t xml:space="preserve"> definirá</w:t>
       </w:r>
       <w:r>
         <w:t xml:space="preserve"> el Cupo de Crédito</w:t>
@@ -9538,7 +9904,15 @@
         <w:t xml:space="preserve"> y</w:t>
       </w:r>
       <w:r>
-        <w:t xml:space="preserve"> con base en su propio análisis, y notificará el mismo al Cliente, pudiendo Finkargo aumentarlo, reducirlo o eliminarlo, a su entera discreción, mediante notificación enviada al Cliente, siempre y cuando</w:t>
+        <w:t xml:space="preserve"> con base en su propio análisis, y notificará el mismo al Cliente, pudiendo </w:t>
+      </w:r>
+      <w:proofErr w:type="spellStart"/>
+      <w:r>
+        <w:t>Finkargo</w:t>
+      </w:r>
+      <w:proofErr w:type="spellEnd"/>
+      <w:r>
+        <w:t xml:space="preserve"> aumentarlo, reducirlo o eliminarlo, a su entera discreción, mediante notificación enviada al Cliente, siempre y cuando</w:t>
       </w:r>
       <w:r>
         <w:t>, (a)</w:t>
@@ -9606,88 +9980,83 @@
         <w:t>, si bien</w:t>
       </w:r>
       <w:r>
-        <w:t xml:space="preserve"> el Cupo de Crédito se encuentra denominado en </w:t>
+        <w:t xml:space="preserve"> el Cupo de Crédito se encuentra denominado en Dólares</w:t>
+      </w:r>
+      <w:r>
+        <w:t xml:space="preserve"> </w:t>
       </w:r>
       <w:proofErr w:type="gramStart"/>
       <w:r>
-        <w:t>Dólares</w:t>
+        <w:t xml:space="preserve">pero </w:t>
+      </w:r>
+      <w:r>
+        <w:t xml:space="preserve"> </w:t>
+      </w:r>
+      <w:r>
+        <w:t>los</w:t>
       </w:r>
       <w:proofErr w:type="gramEnd"/>
       <w:r>
+        <w:t xml:space="preserve"> Desembolsos se realizan en Pesos</w:t>
+      </w:r>
+      <w:r>
+        <w:t>,</w:t>
+      </w:r>
+      <w:r>
+        <w:t xml:space="preserve"> el pago de las Obligaciones deberá realizarse también en Pesos</w:t>
+      </w:r>
+      <w:r>
+        <w:t>. En consecuencia,</w:t>
+      </w:r>
+      <w:r>
         <w:t xml:space="preserve"> </w:t>
       </w:r>
-      <w:proofErr w:type="gramStart"/>
-      <w:r>
-        <w:t xml:space="preserve">pero </w:t>
+      <w:r>
+        <w:t xml:space="preserve">el Cliente </w:t>
+      </w:r>
+      <w:r>
+        <w:t xml:space="preserve">declara, </w:t>
+      </w:r>
+      <w:r>
+        <w:t xml:space="preserve">reconoce y acepta </w:t>
+      </w:r>
+      <w:r>
+        <w:t>que</w:t>
+      </w:r>
+      <w:r>
+        <w:t>, (a)</w:t>
       </w:r>
       <w:r>
         <w:t xml:space="preserve"> </w:t>
       </w:r>
       <w:r>
-        <w:t>los</w:t>
-      </w:r>
-      <w:proofErr w:type="gramEnd"/>
-      <w:r>
-        <w:t xml:space="preserve"> Desembolsos se realizan en Pesos</w:t>
-      </w:r>
-      <w:r>
-        <w:t>,</w:t>
-      </w:r>
-      <w:r>
-        <w:t xml:space="preserve"> el pago de las Obligaciones deberá realizarse también en Pesos</w:t>
-      </w:r>
-      <w:r>
-        <w:t>. En consecuencia,</w:t>
+        <w:t xml:space="preserve">la </w:t>
+      </w:r>
+      <w:r>
+        <w:t>afectación al Cupo de Crédit</w:t>
+      </w:r>
+      <w:r>
+        <w:t>o</w:t>
       </w:r>
       <w:r>
         <w:t xml:space="preserve"> </w:t>
       </w:r>
       <w:r>
-        <w:t xml:space="preserve">el Cliente </w:t>
-      </w:r>
-      <w:r>
-        <w:t xml:space="preserve">declara, </w:t>
-      </w:r>
-      <w:r>
-        <w:t xml:space="preserve">reconoce y acepta </w:t>
-      </w:r>
-      <w:r>
-        <w:t>que</w:t>
-      </w:r>
-      <w:r>
-        <w:t>, (a)</w:t>
+        <w:t>producto de</w:t>
+      </w:r>
+      <w:r>
+        <w:t xml:space="preserve"> cada Desembolso,</w:t>
       </w:r>
       <w:r>
         <w:t xml:space="preserve"> </w:t>
       </w:r>
       <w:r>
-        <w:t xml:space="preserve">la </w:t>
-      </w:r>
-      <w:r>
-        <w:t>afectación al Cupo de Crédit</w:t>
-      </w:r>
-      <w:r>
-        <w:t>o</w:t>
+        <w:t>se realizará con base en</w:t>
       </w:r>
       <w:r>
         <w:t xml:space="preserve"> </w:t>
       </w:r>
       <w:r>
-        <w:t>producto de</w:t>
-      </w:r>
-      <w:r>
-        <w:t xml:space="preserve"> cada Desembolso,</w:t>
-      </w:r>
-      <w:r>
-        <w:t xml:space="preserve"> </w:t>
-      </w:r>
-      <w:r>
-        <w:t>se realizará con base en</w:t>
-      </w:r>
-      <w:r>
-        <w:t xml:space="preserve"> </w:t>
-      </w:r>
-      <w:r>
         <w:t>la TRM</w:t>
       </w:r>
       <w:r>
@@ -9712,15 +10081,7 @@
         <w:t>la Fecha de Desembolso</w:t>
       </w:r>
       <w:r>
-        <w:t xml:space="preserve">, convertido a </w:t>
-      </w:r>
-      <w:proofErr w:type="gramStart"/>
-      <w:r>
-        <w:t>Dólares</w:t>
-      </w:r>
-      <w:proofErr w:type="gramEnd"/>
-      <w:r>
-        <w:t xml:space="preserve"> con base en la </w:t>
+        <w:t xml:space="preserve">, convertido a Dólares con base en la </w:t>
       </w:r>
       <w:r>
         <w:t xml:space="preserve">TRM de </w:t>
@@ -9860,13 +10221,23 @@
         <w:t xml:space="preserve">En consecuencia, en el evento que en cualquier momento durante la Vigencia el valor de la Sumatoria de Desembolsos sea igual al Límite del Cupo de Crédito, </w:t>
       </w:r>
       <w:r>
-        <w:t>el Cliente no podrá enviar Solicitud de Desembolso alguna a Finkargo</w:t>
-      </w:r>
+        <w:t xml:space="preserve">el Cliente no podrá enviar Solicitud de Desembolso alguna a </w:t>
+      </w:r>
+      <w:proofErr w:type="spellStart"/>
+      <w:r>
+        <w:t>Finkargo</w:t>
+      </w:r>
+      <w:proofErr w:type="spellEnd"/>
       <w:r>
         <w:t xml:space="preserve"> y </w:t>
       </w:r>
-      <w:r>
-        <w:t>Finkargo podrá eliminar el acceso del Cliente a la Plataforma</w:t>
+      <w:proofErr w:type="spellStart"/>
+      <w:r>
+        <w:t>Finkargo</w:t>
+      </w:r>
+      <w:proofErr w:type="spellEnd"/>
+      <w:r>
+        <w:t xml:space="preserve"> podrá eliminar el acceso del Cliente a la Plataforma</w:t>
       </w:r>
       <w:r>
         <w:t>.</w:t>
@@ -10045,7 +10416,21 @@
         <w:rPr>
           <w:rFonts w:cs="Open Sans"/>
         </w:rPr>
-        <w:t xml:space="preserve">a Finkargo una solicitud de </w:t>
+        <w:t xml:space="preserve">a </w:t>
+      </w:r>
+      <w:proofErr w:type="spellStart"/>
+      <w:r>
+        <w:rPr>
+          <w:rFonts w:cs="Open Sans"/>
+        </w:rPr>
+        <w:t>Finkargo</w:t>
+      </w:r>
+      <w:proofErr w:type="spellEnd"/>
+      <w:r>
+        <w:rPr>
+          <w:rFonts w:cs="Open Sans"/>
+        </w:rPr>
+        <w:t xml:space="preserve"> una solicitud de </w:t>
       </w:r>
       <w:r>
         <w:rPr>
@@ -10063,7 +10448,15 @@
         <w:t xml:space="preserve">en términos </w:t>
       </w:r>
       <w:r>
-        <w:t>del formato que para tales efectos comparta Finkargo con el Cliente</w:t>
+        <w:t xml:space="preserve">del formato que para tales efectos comparta </w:t>
+      </w:r>
+      <w:proofErr w:type="spellStart"/>
+      <w:r>
+        <w:t>Finkargo</w:t>
+      </w:r>
+      <w:proofErr w:type="spellEnd"/>
+      <w:r>
+        <w:t xml:space="preserve"> con el Cliente</w:t>
       </w:r>
       <w:r>
         <w:t>, la cual, formará</w:t>
@@ -10224,7 +10617,15 @@
         <w:t>D</w:t>
       </w:r>
       <w:r>
-        <w:t xml:space="preserve">eclara y garantiza a Finkargo (en adición a las declaraciones y garantías particulares contenidas en una Solicitud </w:t>
+        <w:t xml:space="preserve">eclara y garantiza a </w:t>
+      </w:r>
+      <w:proofErr w:type="spellStart"/>
+      <w:r>
+        <w:t>Finkargo</w:t>
+      </w:r>
+      <w:proofErr w:type="spellEnd"/>
+      <w:r>
+        <w:t xml:space="preserve"> (en adición a las declaraciones y garantías particulares contenidas en una Solicitud </w:t>
       </w:r>
       <w:r>
         <w:t>de Desembolso</w:t>
@@ -10505,9 +10906,11 @@
       <w:r>
         <w:t xml:space="preserve">a </w:t>
       </w:r>
+      <w:proofErr w:type="spellStart"/>
       <w:r>
         <w:t>Finkargo</w:t>
       </w:r>
+      <w:proofErr w:type="spellEnd"/>
       <w:r>
         <w:t>.</w:t>
       </w:r>
@@ -10836,7 +11239,15 @@
       <w:bookmarkStart w:id="65" w:name="_Ref173089324"/>
       <w:r>
         <w:lastRenderedPageBreak/>
-        <w:t>Una vez Finkargo reciba una Solicitud de Desembolso, est</w:t>
+        <w:t xml:space="preserve">Una vez </w:t>
+      </w:r>
+      <w:proofErr w:type="spellStart"/>
+      <w:r>
+        <w:t>Finkargo</w:t>
+      </w:r>
+      <w:proofErr w:type="spellEnd"/>
+      <w:r>
+        <w:t xml:space="preserve"> reciba una Solicitud de Desembolso, est</w:t>
       </w:r>
       <w:r>
         <w:t>e</w:t>
@@ -10865,8 +11276,13 @@
       <w:r>
         <w:t xml:space="preserve">para </w:t>
       </w:r>
-      <w:r>
-        <w:t>Finkargo para realizar el Desembolso</w:t>
+      <w:proofErr w:type="spellStart"/>
+      <w:r>
+        <w:t>Finkargo</w:t>
+      </w:r>
+      <w:proofErr w:type="spellEnd"/>
+      <w:r>
+        <w:t xml:space="preserve"> para realizar el Desembolso</w:t>
       </w:r>
       <w:r>
         <w:t xml:space="preserve"> solicitado</w:t>
@@ -10902,7 +11318,23 @@
         <w:t xml:space="preserve">. Lo anterior, </w:t>
       </w:r>
       <w:r>
-        <w:t>bajo el entendido que, si Finkargo no envía Cotización de Desembolso alguna al Cliente en dicho término, se entenderá que Finkargo ha decidido no presentar</w:t>
+        <w:t xml:space="preserve">bajo el entendido que, si </w:t>
+      </w:r>
+      <w:proofErr w:type="spellStart"/>
+      <w:r>
+        <w:t>Finkargo</w:t>
+      </w:r>
+      <w:proofErr w:type="spellEnd"/>
+      <w:r>
+        <w:t xml:space="preserve"> no envía Cotización de Desembolso alguna al Cliente en dicho término, se entenderá que </w:t>
+      </w:r>
+      <w:proofErr w:type="spellStart"/>
+      <w:r>
+        <w:t>Finkargo</w:t>
+      </w:r>
+      <w:proofErr w:type="spellEnd"/>
+      <w:r>
+        <w:t xml:space="preserve"> ha decidido no presentar</w:t>
       </w:r>
       <w:r>
         <w:t>la</w:t>
@@ -11000,10 +11432,32 @@
         <w:rPr>
           <w:rFonts w:cs="Open Sans"/>
         </w:rPr>
-        <w:t xml:space="preserve">en su totalidad, a satisfacción de Finkargo, </w:t>
-      </w:r>
-      <w:r>
-        <w:t xml:space="preserve">so pena de que la Cotización de Desembolso se entienda rechazada y Finkargo no se encuentre obligado por los términos de </w:t>
+        <w:t xml:space="preserve">en su totalidad, a satisfacción de </w:t>
+      </w:r>
+      <w:proofErr w:type="spellStart"/>
+      <w:r>
+        <w:rPr>
+          <w:rFonts w:cs="Open Sans"/>
+        </w:rPr>
+        <w:t>Finkargo</w:t>
+      </w:r>
+      <w:proofErr w:type="spellEnd"/>
+      <w:r>
+        <w:rPr>
+          <w:rFonts w:cs="Open Sans"/>
+        </w:rPr>
+        <w:t xml:space="preserve">, </w:t>
+      </w:r>
+      <w:r>
+        <w:t xml:space="preserve">so pena de que la Cotización de Desembolso se entienda rechazada y </w:t>
+      </w:r>
+      <w:proofErr w:type="spellStart"/>
+      <w:r>
+        <w:t>Finkargo</w:t>
+      </w:r>
+      <w:proofErr w:type="spellEnd"/>
+      <w:r>
+        <w:t xml:space="preserve"> no se encuentre obligado por los términos de </w:t>
       </w:r>
       <w:proofErr w:type="gramStart"/>
       <w:r>
@@ -11046,7 +11500,15 @@
         <w:t>de este</w:t>
       </w:r>
       <w:r>
-        <w:t xml:space="preserve"> Contrato de Crédito y, a entera satisfacción de Finkargo,</w:t>
+        <w:t xml:space="preserve"> Contrato de Crédito y, a entera satisfacción de </w:t>
+      </w:r>
+      <w:proofErr w:type="spellStart"/>
+      <w:r>
+        <w:t>Finkargo</w:t>
+      </w:r>
+      <w:proofErr w:type="spellEnd"/>
+      <w:r>
+        <w:t>,</w:t>
       </w:r>
       <w:r>
         <w:t xml:space="preserve"> </w:t>
@@ -11103,6 +11565,7 @@
         </w:rPr>
         <w:t xml:space="preserve">las Garantías que </w:t>
       </w:r>
+      <w:proofErr w:type="spellStart"/>
       <w:r>
         <w:rPr>
           <w:rFonts w:cs="Open Sans"/>
@@ -11110,6 +11573,7 @@
         </w:rPr>
         <w:t>Finkargo</w:t>
       </w:r>
+      <w:proofErr w:type="spellEnd"/>
       <w:r>
         <w:rPr>
           <w:rFonts w:cs="Open Sans"/>
@@ -11216,15 +11680,7 @@
         <w:t xml:space="preserve">El Cliente deberá causar que </w:t>
       </w:r>
       <w:r>
-        <w:t xml:space="preserve">un </w:t>
-      </w:r>
-      <w:proofErr w:type="gramStart"/>
-      <w:r>
-        <w:t>Funcionario</w:t>
-      </w:r>
-      <w:proofErr w:type="gramEnd"/>
-      <w:r>
-        <w:t xml:space="preserve"> Autorizado suscriba el Contrato de Mandato y/o </w:t>
+        <w:t xml:space="preserve">un Funcionario Autorizado suscriba el Contrato de Mandato y/o </w:t>
       </w:r>
       <w:r>
         <w:t xml:space="preserve">la </w:t>
@@ -11251,7 +11707,15 @@
         <w:t xml:space="preserve">instruya </w:t>
       </w:r>
       <w:r>
-        <w:t>a Finkargo a realizar el Desembolso por cuenta del Cliente</w:t>
+        <w:t xml:space="preserve">a </w:t>
+      </w:r>
+      <w:proofErr w:type="spellStart"/>
+      <w:r>
+        <w:t>Finkargo</w:t>
+      </w:r>
+      <w:proofErr w:type="spellEnd"/>
+      <w:r>
+        <w:t xml:space="preserve"> a realizar el Desembolso por cuenta del Cliente</w:t>
       </w:r>
       <w:r>
         <w:t>.</w:t>
@@ -11265,15 +11729,7 @@
         <w:t xml:space="preserve">El Cliente deberá causar que </w:t>
       </w:r>
       <w:r>
-        <w:t xml:space="preserve">un </w:t>
-      </w:r>
-      <w:proofErr w:type="gramStart"/>
-      <w:r>
-        <w:t>Funcionario</w:t>
-      </w:r>
-      <w:proofErr w:type="gramEnd"/>
-      <w:r>
-        <w:t xml:space="preserve"> Autorizado </w:t>
+        <w:t xml:space="preserve">un Funcionario Autorizado </w:t>
       </w:r>
       <w:r>
         <w:t>suscriba</w:t>
@@ -11364,11 +11820,19 @@
         </w:rPr>
         <w:t xml:space="preserve"> </w:t>
       </w:r>
-      <w:r>
-        <w:rPr>
-          <w:rFonts w:cs="Open Sans"/>
-        </w:rPr>
-        <w:t xml:space="preserve">Finkargo </w:t>
+      <w:proofErr w:type="spellStart"/>
+      <w:r>
+        <w:rPr>
+          <w:rFonts w:cs="Open Sans"/>
+        </w:rPr>
+        <w:t>Finkargo</w:t>
+      </w:r>
+      <w:proofErr w:type="spellEnd"/>
+      <w:r>
+        <w:rPr>
+          <w:rFonts w:cs="Open Sans"/>
+        </w:rPr>
+        <w:t xml:space="preserve"> </w:t>
       </w:r>
       <w:r>
         <w:rPr>
@@ -11641,7 +12105,14 @@
         <w:rPr>
           <w:rFonts w:cs="Open Sans"/>
         </w:rPr>
-        <w:t>reconoce y acepta que Fi</w:t>
+        <w:t xml:space="preserve">reconoce y acepta que </w:t>
+      </w:r>
+      <w:proofErr w:type="spellStart"/>
+      <w:r>
+        <w:rPr>
+          <w:rFonts w:cs="Open Sans"/>
+        </w:rPr>
+        <w:t>Fi</w:t>
       </w:r>
       <w:r>
         <w:rPr>
@@ -11653,7 +12124,14 @@
         <w:rPr>
           <w:rFonts w:cs="Open Sans"/>
         </w:rPr>
-        <w:t>kargo goza de plena potestad para</w:t>
+        <w:t>kargo</w:t>
+      </w:r>
+      <w:proofErr w:type="spellEnd"/>
+      <w:r>
+        <w:rPr>
+          <w:rFonts w:cs="Open Sans"/>
+        </w:rPr>
+        <w:t xml:space="preserve"> goza de plena potestad para</w:t>
       </w:r>
       <w:r>
         <w:rPr>
@@ -11709,7 +12187,21 @@
         <w:rPr>
           <w:rFonts w:cs="Open Sans"/>
         </w:rPr>
-        <w:t xml:space="preserve"> ya sea por causas atribuibles a Finkargo, al Cliente</w:t>
+        <w:t xml:space="preserve"> ya sea por causas atribuibles a </w:t>
+      </w:r>
+      <w:proofErr w:type="spellStart"/>
+      <w:r>
+        <w:rPr>
+          <w:rFonts w:cs="Open Sans"/>
+        </w:rPr>
+        <w:t>Finkargo</w:t>
+      </w:r>
+      <w:proofErr w:type="spellEnd"/>
+      <w:r>
+        <w:rPr>
+          <w:rFonts w:cs="Open Sans"/>
+        </w:rPr>
+        <w:t>, al Cliente</w:t>
       </w:r>
       <w:r>
         <w:rPr>
@@ -11784,7 +12276,21 @@
         <w:rPr>
           <w:rFonts w:cs="Open Sans"/>
         </w:rPr>
-        <w:t xml:space="preserve"> por Finkargo al Cliente</w:t>
+        <w:t xml:space="preserve"> por </w:t>
+      </w:r>
+      <w:proofErr w:type="spellStart"/>
+      <w:r>
+        <w:rPr>
+          <w:rFonts w:cs="Open Sans"/>
+        </w:rPr>
+        <w:t>Finkargo</w:t>
+      </w:r>
+      <w:proofErr w:type="spellEnd"/>
+      <w:r>
+        <w:rPr>
+          <w:rFonts w:cs="Open Sans"/>
+        </w:rPr>
+        <w:t xml:space="preserve"> al Cliente</w:t>
       </w:r>
       <w:r>
         <w:rPr>
@@ -11796,7 +12302,21 @@
         <w:rPr>
           <w:rFonts w:cs="Open Sans"/>
         </w:rPr>
-        <w:t>dentro de un término razonable, a través de la Plataforma o de cualquier otra medio que Finkargo determine conveniente para ello</w:t>
+        <w:t xml:space="preserve">dentro de un término razonable, a través de la Plataforma o de cualquier otra medio que </w:t>
+      </w:r>
+      <w:proofErr w:type="spellStart"/>
+      <w:r>
+        <w:rPr>
+          <w:rFonts w:cs="Open Sans"/>
+        </w:rPr>
+        <w:t>Finkargo</w:t>
+      </w:r>
+      <w:proofErr w:type="spellEnd"/>
+      <w:r>
+        <w:rPr>
+          <w:rFonts w:cs="Open Sans"/>
+        </w:rPr>
+        <w:t xml:space="preserve"> determine conveniente para ello</w:t>
       </w:r>
       <w:r>
         <w:rPr>
@@ -11838,33 +12358,42 @@
         </w:rPr>
         <w:t xml:space="preserve">Una vez </w:t>
       </w:r>
+      <w:proofErr w:type="spellStart"/>
       <w:r>
         <w:rPr>
           <w:rFonts w:eastAsia="Calibri" w:cs="Open Sans"/>
           <w:lang w:eastAsia="en-US"/>
         </w:rPr>
-        <w:t xml:space="preserve">Finkargo </w:t>
-      </w:r>
+        <w:t>Finkargo</w:t>
+      </w:r>
+      <w:proofErr w:type="spellEnd"/>
       <w:r>
         <w:rPr>
           <w:rFonts w:eastAsia="Calibri" w:cs="Open Sans"/>
           <w:lang w:eastAsia="en-US"/>
         </w:rPr>
-        <w:t xml:space="preserve">realice </w:t>
+        <w:t xml:space="preserve"> </w:t>
       </w:r>
       <w:r>
         <w:rPr>
           <w:rFonts w:eastAsia="Calibri" w:cs="Open Sans"/>
           <w:lang w:eastAsia="en-US"/>
         </w:rPr>
-        <w:t xml:space="preserve">el </w:t>
-      </w:r>
-      <w:bookmarkEnd w:id="158"/>
+        <w:t xml:space="preserve">realice </w:t>
+      </w:r>
       <w:r>
         <w:rPr>
           <w:rFonts w:eastAsia="Calibri" w:cs="Open Sans"/>
           <w:lang w:eastAsia="en-US"/>
         </w:rPr>
+        <w:t xml:space="preserve">el </w:t>
+      </w:r>
+      <w:bookmarkEnd w:id="158"/>
+      <w:r>
+        <w:rPr>
+          <w:rFonts w:eastAsia="Calibri" w:cs="Open Sans"/>
+          <w:lang w:eastAsia="en-US"/>
+        </w:rPr>
         <w:t xml:space="preserve">Desembolso, </w:t>
       </w:r>
       <w:r>
@@ -11937,8 +12466,16 @@
         <w:rPr>
           <w:rFonts w:cs="Open Sans"/>
         </w:rPr>
-        <w:t xml:space="preserve"> a Finkargo</w:t>
-      </w:r>
+        <w:t xml:space="preserve"> a </w:t>
+      </w:r>
+      <w:proofErr w:type="spellStart"/>
+      <w:r>
+        <w:rPr>
+          <w:rFonts w:cs="Open Sans"/>
+        </w:rPr>
+        <w:t>Finkargo</w:t>
+      </w:r>
+      <w:proofErr w:type="spellEnd"/>
       <w:r>
         <w:rPr>
           <w:rFonts w:cs="Open Sans"/>
@@ -12060,7 +12597,21 @@
           <w:rFonts w:cs="Open Sans"/>
         </w:rPr>
         <w:lastRenderedPageBreak/>
-        <w:t>Desembolso Aceptada, los cuales, en la fecha emisión de la misma por parte de Finkargo, declara, reconoce y acepta son los términos definitivos para el pago de las Obligaciones asociadas al Desembolso correspondiente</w:t>
+        <w:t xml:space="preserve">Desembolso Aceptada, los cuales, en la fecha emisión de la misma por parte de </w:t>
+      </w:r>
+      <w:proofErr w:type="spellStart"/>
+      <w:r>
+        <w:rPr>
+          <w:rFonts w:cs="Open Sans"/>
+        </w:rPr>
+        <w:t>Finkargo</w:t>
+      </w:r>
+      <w:proofErr w:type="spellEnd"/>
+      <w:r>
+        <w:rPr>
+          <w:rFonts w:cs="Open Sans"/>
+        </w:rPr>
+        <w:t>, declara, reconoce y acepta son los términos definitivos para el pago de las Obligaciones asociadas al Desembolso correspondiente</w:t>
       </w:r>
       <w:r>
         <w:rPr>
@@ -12128,7 +12679,21 @@
         <w:rPr>
           <w:rFonts w:cs="Open Sans"/>
         </w:rPr>
-        <w:t xml:space="preserve"> sobre su intención de que Finkargo realice el Desembolso; y (</w:t>
+        <w:t xml:space="preserve"> sobre su intención de que </w:t>
+      </w:r>
+      <w:proofErr w:type="spellStart"/>
+      <w:r>
+        <w:rPr>
+          <w:rFonts w:cs="Open Sans"/>
+        </w:rPr>
+        <w:t>Finkargo</w:t>
+      </w:r>
+      <w:proofErr w:type="spellEnd"/>
+      <w:r>
+        <w:rPr>
+          <w:rFonts w:cs="Open Sans"/>
+        </w:rPr>
+        <w:t xml:space="preserve"> realice el Desembolso; y (</w:t>
       </w:r>
       <w:proofErr w:type="spellStart"/>
       <w:r>
@@ -12226,7 +12791,21 @@
         <w:rPr>
           <w:rFonts w:cs="Open Sans"/>
         </w:rPr>
-        <w:t xml:space="preserve"> el Desembolso, sin perjuicio de que Finkargo pueda contactar </w:t>
+        <w:t xml:space="preserve"> el Desembolso, sin perjuicio de que </w:t>
+      </w:r>
+      <w:proofErr w:type="spellStart"/>
+      <w:r>
+        <w:rPr>
+          <w:rFonts w:cs="Open Sans"/>
+        </w:rPr>
+        <w:t>Finkargo</w:t>
+      </w:r>
+      <w:proofErr w:type="spellEnd"/>
+      <w:r>
+        <w:rPr>
+          <w:rFonts w:cs="Open Sans"/>
+        </w:rPr>
+        <w:t xml:space="preserve"> pueda contactar </w:t>
       </w:r>
       <w:r>
         <w:rPr>
@@ -12262,7 +12841,21 @@
         <w:rPr>
           <w:rFonts w:cs="Open Sans"/>
         </w:rPr>
-        <w:t>en cualquier momento, de manera directa o indirecta, para confirmar cualquier información que el Cliente haya otorgado a Finkargo, incluyendo sin limitarse, la e</w:t>
+        <w:t xml:space="preserve">en cualquier momento, de manera directa o indirecta, para confirmar cualquier información que el Cliente haya otorgado a </w:t>
+      </w:r>
+      <w:proofErr w:type="spellStart"/>
+      <w:r>
+        <w:rPr>
+          <w:rFonts w:cs="Open Sans"/>
+        </w:rPr>
+        <w:t>Finkargo</w:t>
+      </w:r>
+      <w:proofErr w:type="spellEnd"/>
+      <w:r>
+        <w:rPr>
+          <w:rFonts w:cs="Open Sans"/>
+        </w:rPr>
+        <w:t>, incluyendo sin limitarse, la e</w:t>
       </w:r>
       <w:r>
         <w:rPr>
@@ -12364,7 +12957,15 @@
         <w:pStyle w:val="Heading4"/>
       </w:pPr>
       <w:r>
-        <w:t xml:space="preserve">Cada vez que Finkargo realice un </w:t>
+        <w:t xml:space="preserve">Cada vez que </w:t>
+      </w:r>
+      <w:proofErr w:type="spellStart"/>
+      <w:r>
+        <w:t>Finkargo</w:t>
+      </w:r>
+      <w:proofErr w:type="spellEnd"/>
+      <w:r>
+        <w:t xml:space="preserve"> realice un </w:t>
       </w:r>
       <w:r>
         <w:t>Desembolso</w:t>
@@ -12398,8 +12999,13 @@
         <w:t>dera</w:t>
       </w:r>
       <w:r>
-        <w:t xml:space="preserve"> por el Cliente a Finkargo</w:t>
-      </w:r>
+        <w:t xml:space="preserve"> por el Cliente a </w:t>
+      </w:r>
+      <w:proofErr w:type="spellStart"/>
+      <w:r>
+        <w:t>Finkargo</w:t>
+      </w:r>
+      <w:proofErr w:type="spellEnd"/>
       <w:r>
         <w:t>.</w:t>
       </w:r>
@@ -12427,7 +13033,21 @@
         <w:rPr>
           <w:lang w:val="es-CO"/>
         </w:rPr>
-        <w:t xml:space="preserve">será informado por Finkargo al </w:t>
+        <w:t xml:space="preserve">será informado por </w:t>
+      </w:r>
+      <w:proofErr w:type="spellStart"/>
+      <w:r>
+        <w:rPr>
+          <w:lang w:val="es-CO"/>
+        </w:rPr>
+        <w:t>Finkargo</w:t>
+      </w:r>
+      <w:proofErr w:type="spellEnd"/>
+      <w:r>
+        <w:rPr>
+          <w:lang w:val="es-CO"/>
+        </w:rPr>
+        <w:t xml:space="preserve"> al </w:t>
       </w:r>
       <w:r>
         <w:rPr>
@@ -12582,7 +13202,15 @@
         <w:t xml:space="preserve">declara, </w:t>
       </w:r>
       <w:r>
-        <w:t>reconoce y acepta que, a su entera discreción, Finkargo podrá, cada vez que</w:t>
+        <w:t xml:space="preserve">reconoce y acepta que, a su entera discreción, </w:t>
+      </w:r>
+      <w:proofErr w:type="spellStart"/>
+      <w:r>
+        <w:t>Finkargo</w:t>
+      </w:r>
+      <w:proofErr w:type="spellEnd"/>
+      <w:r>
+        <w:t xml:space="preserve"> podrá, cada vez que</w:t>
       </w:r>
       <w:r>
         <w:t xml:space="preserve"> lo considere pertinente con ocasión </w:t>
@@ -12628,8 +13256,13 @@
         <w:t>Cliente</w:t>
       </w:r>
       <w:r>
-        <w:t xml:space="preserve"> a la Afianzadora, a través de Finkargo</w:t>
-      </w:r>
+        <w:t xml:space="preserve"> a la Afianzadora, a través de </w:t>
+      </w:r>
+      <w:proofErr w:type="spellStart"/>
+      <w:r>
+        <w:t>Finkargo</w:t>
+      </w:r>
+      <w:proofErr w:type="spellEnd"/>
       <w:r>
         <w:t xml:space="preserve">; y/o (2) solicitar al Cliente el pago de la Comisión de Estructuración </w:t>
       </w:r>
@@ -12661,7 +13294,15 @@
         <w:t xml:space="preserve"> y cada Comisión de Estructuración</w:t>
       </w:r>
       <w:r>
-        <w:t xml:space="preserve"> será informado por Finkargo al </w:t>
+        <w:t xml:space="preserve"> será informado por </w:t>
+      </w:r>
+      <w:proofErr w:type="spellStart"/>
+      <w:r>
+        <w:t>Finkargo</w:t>
+      </w:r>
+      <w:proofErr w:type="spellEnd"/>
+      <w:r>
+        <w:t xml:space="preserve"> al </w:t>
       </w:r>
       <w:r>
         <w:t>Cliente</w:t>
@@ -12702,7 +13343,15 @@
         <w:t xml:space="preserve"> se obliga a pagar </w:t>
       </w:r>
       <w:r>
-        <w:t xml:space="preserve">a Finkargo </w:t>
+        <w:t xml:space="preserve">a </w:t>
+      </w:r>
+      <w:proofErr w:type="spellStart"/>
+      <w:r>
+        <w:t>Finkargo</w:t>
+      </w:r>
+      <w:proofErr w:type="spellEnd"/>
+      <w:r>
+        <w:t xml:space="preserve"> </w:t>
       </w:r>
       <w:r>
         <w:t xml:space="preserve">la </w:t>
@@ -12756,7 +13405,21 @@
         <w:rPr>
           <w:rFonts w:cs="Open Sans"/>
         </w:rPr>
-        <w:t xml:space="preserve"> Sin perjuicio de lo anterior, Finkargo se reserva el derecho de, a su entera discreción, solicitar al Cliente el pago de cualquier otra comisión</w:t>
+        <w:t xml:space="preserve"> Sin perjuicio de lo anterior, </w:t>
+      </w:r>
+      <w:proofErr w:type="spellStart"/>
+      <w:r>
+        <w:rPr>
+          <w:rFonts w:cs="Open Sans"/>
+        </w:rPr>
+        <w:t>Finkargo</w:t>
+      </w:r>
+      <w:proofErr w:type="spellEnd"/>
+      <w:r>
+        <w:rPr>
+          <w:rFonts w:cs="Open Sans"/>
+        </w:rPr>
+        <w:t xml:space="preserve"> se reserva el derecho de, a su entera discreción, solicitar al Cliente el pago de cualquier otra comisión</w:t>
       </w:r>
       <w:r>
         <w:rPr>
@@ -12875,7 +13538,15 @@
         <w:pStyle w:val="Heading3"/>
       </w:pPr>
       <w:r>
-        <w:t xml:space="preserve">Todos los pagos que deban hacerse por parte del Cliente a Finkargo </w:t>
+        <w:t xml:space="preserve">Todos los pagos que deban hacerse por parte del Cliente a </w:t>
+      </w:r>
+      <w:proofErr w:type="spellStart"/>
+      <w:r>
+        <w:t>Finkargo</w:t>
+      </w:r>
+      <w:proofErr w:type="spellEnd"/>
+      <w:r>
+        <w:t xml:space="preserve"> </w:t>
       </w:r>
       <w:r>
         <w:t>deberá</w:t>
@@ -12911,8 +13582,13 @@
         <w:t xml:space="preserve"> y</w:t>
       </w:r>
       <w:r>
-        <w:t xml:space="preserve"> en la Cuenta de Finkargo</w:t>
-      </w:r>
+        <w:t xml:space="preserve"> en la Cuenta de </w:t>
+      </w:r>
+      <w:proofErr w:type="spellStart"/>
+      <w:r>
+        <w:t>Finkargo</w:t>
+      </w:r>
+      <w:proofErr w:type="spellEnd"/>
       <w:r>
         <w:t xml:space="preserve">, (i) </w:t>
       </w:r>
@@ -12937,8 +13613,13 @@
         <w:t>o instruya</w:t>
       </w:r>
       <w:r>
-        <w:t xml:space="preserve"> Finkargo</w:t>
-      </w:r>
+        <w:t xml:space="preserve"> </w:t>
+      </w:r>
+      <w:proofErr w:type="spellStart"/>
+      <w:r>
+        <w:t>Finkargo</w:t>
+      </w:r>
+      <w:proofErr w:type="spellEnd"/>
       <w:r>
         <w:t>. El Cliente estará obligado a comprobar</w:t>
       </w:r>
@@ -12946,8 +13627,13 @@
         <w:t xml:space="preserve"> </w:t>
       </w:r>
       <w:r>
-        <w:t>a Finkargo</w:t>
-      </w:r>
+        <w:t xml:space="preserve">a </w:t>
+      </w:r>
+      <w:proofErr w:type="spellStart"/>
+      <w:r>
+        <w:t>Finkargo</w:t>
+      </w:r>
+      <w:proofErr w:type="spellEnd"/>
       <w:r>
         <w:t>, en cualquier momento, los pagos realizados</w:t>
       </w:r>
@@ -12961,8 +13647,13 @@
         <w:t>mediante los cuales</w:t>
       </w:r>
       <w:r>
-        <w:t xml:space="preserve"> se acrediten los pagos que realice a Finkargo</w:t>
-      </w:r>
+        <w:t xml:space="preserve"> se acrediten los pagos que realice a </w:t>
+      </w:r>
+      <w:proofErr w:type="spellStart"/>
+      <w:r>
+        <w:t>Finkargo</w:t>
+      </w:r>
+      <w:proofErr w:type="spellEnd"/>
       <w:r>
         <w:t>.</w:t>
       </w:r>
@@ -12979,7 +13670,15 @@
         <w:t xml:space="preserve">declara, </w:t>
       </w:r>
       <w:r>
-        <w:t xml:space="preserve">reconoce y acepta que, independientemente del plazo de pago solicitado en la Solicitud de Desembolso, Finkargo se reserva el derecho de extender </w:t>
+        <w:t xml:space="preserve">reconoce y acepta que, independientemente del plazo de pago solicitado en la Solicitud de Desembolso, </w:t>
+      </w:r>
+      <w:proofErr w:type="spellStart"/>
+      <w:r>
+        <w:t>Finkargo</w:t>
+      </w:r>
+      <w:proofErr w:type="spellEnd"/>
+      <w:r>
+        <w:t xml:space="preserve"> se reserva el derecho de extender </w:t>
       </w:r>
       <w:r>
         <w:t xml:space="preserve">o reducir </w:t>
@@ -13003,7 +13702,15 @@
         <w:t>En este sentido, el Cliente reconoce y acepta que,</w:t>
       </w:r>
       <w:r>
-        <w:t xml:space="preserve"> a entera discreción de Finkargo,</w:t>
+        <w:t xml:space="preserve"> a entera discreción de </w:t>
+      </w:r>
+      <w:proofErr w:type="spellStart"/>
+      <w:r>
+        <w:t>Finkargo</w:t>
+      </w:r>
+      <w:proofErr w:type="spellEnd"/>
+      <w:r>
+        <w:t>,</w:t>
       </w:r>
       <w:r>
         <w:t xml:space="preserve"> </w:t>
@@ -13265,7 +13972,15 @@
         <w:t>éste</w:t>
       </w:r>
       <w:r>
-        <w:t xml:space="preserve"> notifique de manera previa, expresa e irrevocable a Finkargo su intención de realizar dicho prepago voluntario, especificando, como mínimo, (i) la fecha en la que se realizará el prepago voluntario; (</w:t>
+        <w:t xml:space="preserve"> notifique de manera previa, expresa e irrevocable a </w:t>
+      </w:r>
+      <w:proofErr w:type="spellStart"/>
+      <w:r>
+        <w:t>Finkargo</w:t>
+      </w:r>
+      <w:proofErr w:type="spellEnd"/>
+      <w:r>
+        <w:t xml:space="preserve"> su intención de realizar dicho prepago voluntario, especificando, como mínimo, (i) la fecha en la que se realizará el prepago voluntario; (</w:t>
       </w:r>
       <w:proofErr w:type="spellStart"/>
       <w:r>
@@ -13358,13 +14073,29 @@
         <w:t>éste se realice</w:t>
       </w:r>
       <w:r>
-        <w:t xml:space="preserve">, el Cliente deberá enviar a Finkargo constancia del prepago realizado en el cual deberá evidenciarse la fecha, el valor y la transferencia de recursos a la </w:t>
+        <w:t xml:space="preserve">, el Cliente deberá enviar a </w:t>
+      </w:r>
+      <w:proofErr w:type="spellStart"/>
+      <w:r>
+        <w:t>Finkargo</w:t>
+      </w:r>
+      <w:proofErr w:type="spellEnd"/>
+      <w:r>
+        <w:t xml:space="preserve"> constancia del prepago realizado en el cual deberá evidenciarse la fecha, el valor y la transferencia de recursos a la </w:t>
       </w:r>
       <w:r>
         <w:t>Cuenta de</w:t>
       </w:r>
       <w:r>
-        <w:t xml:space="preserve"> Finkargo.</w:t>
+        <w:t xml:space="preserve"> </w:t>
+      </w:r>
+      <w:proofErr w:type="spellStart"/>
+      <w:r>
+        <w:t>Finkargo</w:t>
+      </w:r>
+      <w:proofErr w:type="spellEnd"/>
+      <w:r>
+        <w:t>.</w:t>
       </w:r>
     </w:p>
     <w:p>
@@ -13528,8 +14259,13 @@
         <w:t>Cliente</w:t>
       </w:r>
       <w:r>
-        <w:t xml:space="preserve"> tenga conocimiento de la ocurrencia de dicho evento, o de la notificación que Finkargo</w:t>
-      </w:r>
+        <w:t xml:space="preserve"> tenga conocimiento de la ocurrencia de dicho evento, o de la notificación que </w:t>
+      </w:r>
+      <w:proofErr w:type="spellStart"/>
+      <w:r>
+        <w:t>Finkargo</w:t>
+      </w:r>
+      <w:proofErr w:type="spellEnd"/>
       <w:r>
         <w:t xml:space="preserve"> </w:t>
       </w:r>
@@ -13549,7 +14285,15 @@
         <w:pStyle w:val="Heading3"/>
       </w:pPr>
       <w:r>
-        <w:t xml:space="preserve">Cuando, con ocasión de un Evento de Incumplimiento, Finkargo declare el vencimiento anticipado de las Obligaciones con base en lo previsto en la </w:t>
+        <w:t xml:space="preserve">Cuando, con ocasión de un Evento de Incumplimiento, </w:t>
+      </w:r>
+      <w:proofErr w:type="spellStart"/>
+      <w:r>
+        <w:t>Finkargo</w:t>
+      </w:r>
+      <w:proofErr w:type="spellEnd"/>
+      <w:r>
+        <w:t xml:space="preserve"> declare el vencimiento anticipado de las Obligaciones con base en lo previsto en la </w:t>
       </w:r>
       <w:r>
         <w:rPr>
@@ -13618,7 +14362,15 @@
       <w:bookmarkStart w:id="226" w:name="_Ref141770899"/>
       <w:bookmarkEnd w:id="225"/>
       <w:r>
-        <w:t xml:space="preserve">Cuando, con posterioridad a la Fecha de Firma, tenga lugar cualquier Cambio en las Leyes Aplicables, o en la interpretación o aplicación de las mismas, por parte una Autoridad Gubernamental, que haga ilegal que Finkargo o </w:t>
+        <w:t xml:space="preserve">Cuando, con posterioridad a la Fecha de Firma, tenga lugar cualquier Cambio en las Leyes Aplicables, o en la interpretación o aplicación de las mismas, por parte una Autoridad Gubernamental, que haga ilegal que </w:t>
+      </w:r>
+      <w:proofErr w:type="spellStart"/>
+      <w:r>
+        <w:t>Finkargo</w:t>
+      </w:r>
+      <w:proofErr w:type="spellEnd"/>
+      <w:r>
+        <w:t xml:space="preserve"> o </w:t>
       </w:r>
       <w:r>
         <w:t>un</w:t>
@@ -13639,7 +14391,15 @@
         <w:t>Cliente</w:t>
       </w:r>
       <w:r>
-        <w:t xml:space="preserve"> a Finkargo dejen de ser legalmente posibles, o que ocurra la nulidad o ineficacia de alguna Sección de este Contrato </w:t>
+        <w:t xml:space="preserve"> a </w:t>
+      </w:r>
+      <w:proofErr w:type="spellStart"/>
+      <w:r>
+        <w:t>Finkargo</w:t>
+      </w:r>
+      <w:proofErr w:type="spellEnd"/>
+      <w:r>
+        <w:t xml:space="preserve"> dejen de ser legalmente posibles, o que ocurra la nulidad o ineficacia de alguna Sección de este Contrato </w:t>
       </w:r>
       <w:r>
         <w:t>de Crédito</w:t>
@@ -13762,7 +14522,15 @@
         <w:t>Cliente</w:t>
       </w:r>
       <w:r>
-        <w:t xml:space="preserve"> y respecto del cual no se entenderá que Finkargo ha renunciado.</w:t>
+        <w:t xml:space="preserve"> y respecto del cual no se entenderá que </w:t>
+      </w:r>
+      <w:proofErr w:type="spellStart"/>
+      <w:r>
+        <w:t>Finkargo</w:t>
+      </w:r>
+      <w:proofErr w:type="spellEnd"/>
+      <w:r>
+        <w:t xml:space="preserve"> ha renunciado.</w:t>
       </w:r>
       <w:bookmarkEnd w:id="226"/>
     </w:p>
@@ -13806,7 +14574,23 @@
         <w:t>asociada a determinado Desembolso, la cual se encuentre</w:t>
       </w:r>
       <w:r>
-        <w:t xml:space="preserve"> pendiente de pago a favor de Finkargo, causará intereses remuneratorios a favor de Finkargo a una tasa de interés igual a la Tasa de Interés aplicable a dicho Desembolso.</w:t>
+        <w:t xml:space="preserve"> pendiente de pago a favor de </w:t>
+      </w:r>
+      <w:proofErr w:type="spellStart"/>
+      <w:r>
+        <w:t>Finkargo</w:t>
+      </w:r>
+      <w:proofErr w:type="spellEnd"/>
+      <w:r>
+        <w:t xml:space="preserve">, causará intereses remuneratorios a favor de </w:t>
+      </w:r>
+      <w:proofErr w:type="spellStart"/>
+      <w:r>
+        <w:t>Finkargo</w:t>
+      </w:r>
+      <w:proofErr w:type="spellEnd"/>
+      <w:r>
+        <w:t xml:space="preserve"> a una tasa de interés igual a la Tasa de Interés aplicable a dicho Desembolso.</w:t>
       </w:r>
       <w:bookmarkEnd w:id="228"/>
     </w:p>
@@ -13817,7 +14601,15 @@
       <w:bookmarkStart w:id="229" w:name="_heading=h.2pcmsun" w:colFirst="0" w:colLast="0"/>
       <w:bookmarkEnd w:id="229"/>
       <w:r>
-        <w:t xml:space="preserve">El Cliente deberá pagar los intereses remuneratorios a Finkargo que se causen de conformidad con la </w:t>
+        <w:t xml:space="preserve">El Cliente deberá pagar los intereses remuneratorios a </w:t>
+      </w:r>
+      <w:proofErr w:type="spellStart"/>
+      <w:r>
+        <w:t>Finkargo</w:t>
+      </w:r>
+      <w:proofErr w:type="spellEnd"/>
+      <w:r>
+        <w:t xml:space="preserve"> que se causen de conformidad con la </w:t>
       </w:r>
       <w:r>
         <w:rPr>
@@ -13885,6 +14677,7 @@
           <w:tag w:val="goog_rdk_191"/>
           <w:id w:val="1031230458"/>
         </w:sdtPr>
+        <w:sdtEndPr/>
         <w:sdtContent>
           <w:r>
             <w:t>s</w:t>
@@ -14241,7 +15034,15 @@
         <w:t>Cliente</w:t>
       </w:r>
       <w:r>
-        <w:t xml:space="preserve"> a Finkargo será aplicado a los siguientes conceptos de cada Obligación, y en el orden que a continuación se establece:</w:t>
+        <w:t xml:space="preserve"> a </w:t>
+      </w:r>
+      <w:proofErr w:type="spellStart"/>
+      <w:r>
+        <w:t>Finkargo</w:t>
+      </w:r>
+      <w:proofErr w:type="spellEnd"/>
+      <w:r>
+        <w:t xml:space="preserve"> será aplicado a los siguientes conceptos de cada Obligación, y en el orden que a continuación se establece:</w:t>
       </w:r>
       <w:bookmarkStart w:id="244" w:name="_Ref175061100"/>
       <w:bookmarkStart w:id="245" w:name="_Ref141759268"/>
@@ -14310,7 +15111,15 @@
         <w:t>Cliente</w:t>
       </w:r>
       <w:r>
-        <w:t xml:space="preserve"> adeude a Finkargo por cualquier concepto contemplado en </w:t>
+        <w:t xml:space="preserve"> adeude a </w:t>
+      </w:r>
+      <w:proofErr w:type="spellStart"/>
+      <w:r>
+        <w:t>Finkargo</w:t>
+      </w:r>
+      <w:proofErr w:type="spellEnd"/>
+      <w:r>
+        <w:t xml:space="preserve"> por cualquier concepto contemplado en </w:t>
       </w:r>
       <w:r>
         <w:t>este</w:t>
@@ -14341,7 +15150,15 @@
         <w:t>Quinto</w:t>
       </w:r>
       <w:r>
-        <w:t xml:space="preserve">, al pago de todos y cada uno de los costos y gastos en que hubiere incurrido Finkargo con motivo de la ejecución judicial o extrajudicial de las Obligaciones previstas en el </w:t>
+        <w:t xml:space="preserve">, al pago de todos y cada uno de los costos y gastos en que hubiere incurrido </w:t>
+      </w:r>
+      <w:proofErr w:type="spellStart"/>
+      <w:r>
+        <w:t>Finkargo</w:t>
+      </w:r>
+      <w:proofErr w:type="spellEnd"/>
+      <w:r>
+        <w:t xml:space="preserve"> con motivo de la ejecución judicial o extrajudicial de las Obligaciones previstas en el </w:t>
       </w:r>
       <w:r>
         <w:t>Contrato de Crédito y/o sus Anexos</w:t>
@@ -14572,18 +15389,18 @@
         <w:t>Cliente</w:t>
       </w:r>
       <w:r>
-        <w:t xml:space="preserve"> se obliga a que un </w:t>
-      </w:r>
-      <w:proofErr w:type="gramStart"/>
-      <w:r>
-        <w:t>Funcionario</w:t>
-      </w:r>
-      <w:proofErr w:type="gramEnd"/>
-      <w:r>
-        <w:t xml:space="preserve"> Autorizado suscriba el pagaré en blanco con su correspondiente carta de instrucciones, en los términos del formato que </w:t>
-      </w:r>
-      <w:r>
-        <w:t>para tales efectos comparta Finkargo con el Cliente</w:t>
+        <w:t xml:space="preserve"> se obliga a que un Funcionario Autorizado suscriba el pagaré en blanco con su correspondiente carta de instrucciones, en los términos del formato que </w:t>
+      </w:r>
+      <w:r>
+        <w:t xml:space="preserve">para tales efectos comparta </w:t>
+      </w:r>
+      <w:proofErr w:type="spellStart"/>
+      <w:r>
+        <w:t>Finkargo</w:t>
+      </w:r>
+      <w:proofErr w:type="spellEnd"/>
+      <w:r>
+        <w:t xml:space="preserve"> con el Cliente</w:t>
       </w:r>
       <w:r>
         <w:t xml:space="preserve"> </w:t>
@@ -14610,7 +15427,15 @@
         <w:t xml:space="preserve">declara, </w:t>
       </w:r>
       <w:r>
-        <w:t>reconoce y acepta que, a entera discreción de Finkargo, el Pagaré deberá ser suscrito por un Avalista que otorgue el Aval, el cual deberá constar en el mismo Pagaré.</w:t>
+        <w:t xml:space="preserve">reconoce y acepta que, a entera discreción de </w:t>
+      </w:r>
+      <w:proofErr w:type="spellStart"/>
+      <w:r>
+        <w:t>Finkargo</w:t>
+      </w:r>
+      <w:proofErr w:type="spellEnd"/>
+      <w:r>
+        <w:t>, el Pagaré deberá ser suscrito por un Avalista que otorgue el Aval, el cual deberá constar en el mismo Pagaré.</w:t>
       </w:r>
       <w:bookmarkEnd w:id="253"/>
     </w:p>
@@ -14627,7 +15452,15 @@
         <w:t>Cliente</w:t>
       </w:r>
       <w:r>
-        <w:t xml:space="preserve"> a Finkargo.</w:t>
+        <w:t xml:space="preserve"> a </w:t>
+      </w:r>
+      <w:proofErr w:type="spellStart"/>
+      <w:r>
+        <w:t>Finkargo</w:t>
+      </w:r>
+      <w:proofErr w:type="spellEnd"/>
+      <w:r>
+        <w:t>.</w:t>
       </w:r>
     </w:p>
     <w:p>
@@ -14675,8 +15508,13 @@
         <w:t>Desembolso</w:t>
       </w:r>
       <w:r>
-        <w:t xml:space="preserve"> pendiente de pago a Finkargo</w:t>
-      </w:r>
+        <w:t xml:space="preserve"> pendiente de pago a </w:t>
+      </w:r>
+      <w:proofErr w:type="spellStart"/>
+      <w:r>
+        <w:t>Finkargo</w:t>
+      </w:r>
+      <w:proofErr w:type="spellEnd"/>
       <w:r>
         <w:t>, y se imputarán a las Obligaciones propias de dich</w:t>
       </w:r>
@@ -14739,8 +15577,13 @@
         <w:pStyle w:val="Heading3"/>
       </w:pPr>
       <w:bookmarkStart w:id="256" w:name="_Hlk144736321"/>
-      <w:r>
-        <w:t>Finkargo está irrevocable e incondicionalmente autorizado para endosar el Pagaré junto con el Aval a cualquier Cesionario Permitido</w:t>
+      <w:proofErr w:type="spellStart"/>
+      <w:r>
+        <w:t>Finkargo</w:t>
+      </w:r>
+      <w:proofErr w:type="spellEnd"/>
+      <w:r>
+        <w:t xml:space="preserve"> está irrevocable e incondicionalmente autorizado para endosar el Pagaré junto con el Aval a cualquier Cesionario Permitido</w:t>
       </w:r>
       <w:bookmarkEnd w:id="256"/>
       <w:r>
@@ -14764,7 +15607,15 @@
         <w:pStyle w:val="Heading3"/>
       </w:pPr>
       <w:r>
-        <w:t xml:space="preserve">La mutilación, pérdida, robo o destrucción del Pagaré y/o su Aval por parte de Finkargo o del Cesionario Permitido no será considerada como una cancelación de ninguna Obligación bajo o con respecto a este Contrato </w:t>
+        <w:t xml:space="preserve">La mutilación, pérdida, robo o destrucción del Pagaré y/o su Aval por parte de </w:t>
+      </w:r>
+      <w:proofErr w:type="spellStart"/>
+      <w:r>
+        <w:t>Finkargo</w:t>
+      </w:r>
+      <w:proofErr w:type="spellEnd"/>
+      <w:r>
+        <w:t xml:space="preserve"> o del Cesionario Permitido no será considerada como una cancelación de ninguna Obligación bajo o con respecto a este Contrato </w:t>
       </w:r>
       <w:r>
         <w:t>de Crédito</w:t>
@@ -14920,7 +15771,21 @@
         <w:rPr>
           <w:rFonts w:cs="Open Sans"/>
         </w:rPr>
-        <w:t xml:space="preserve">condición para que Finkargo realice un Desembolso, el Cliente se obliga </w:t>
+        <w:t xml:space="preserve">condición para que </w:t>
+      </w:r>
+      <w:proofErr w:type="spellStart"/>
+      <w:r>
+        <w:rPr>
+          <w:rFonts w:cs="Open Sans"/>
+        </w:rPr>
+        <w:t>Finkargo</w:t>
+      </w:r>
+      <w:proofErr w:type="spellEnd"/>
+      <w:r>
+        <w:rPr>
+          <w:rFonts w:cs="Open Sans"/>
+        </w:rPr>
+        <w:t xml:space="preserve"> realice un Desembolso, el Cliente se obliga </w:t>
       </w:r>
       <w:r>
         <w:rPr>
@@ -14938,7 +15803,21 @@
         <w:rPr>
           <w:rFonts w:cs="Open Sans"/>
         </w:rPr>
-        <w:t>que para tales efectos haya solicitado Finkargo en los términos de este Contrato de Crédito</w:t>
+        <w:t xml:space="preserve">que para tales efectos haya solicitado </w:t>
+      </w:r>
+      <w:proofErr w:type="spellStart"/>
+      <w:r>
+        <w:rPr>
+          <w:rFonts w:cs="Open Sans"/>
+        </w:rPr>
+        <w:t>Finkargo</w:t>
+      </w:r>
+      <w:proofErr w:type="spellEnd"/>
+      <w:r>
+        <w:rPr>
+          <w:rFonts w:cs="Open Sans"/>
+        </w:rPr>
+        <w:t xml:space="preserve"> en los términos de este Contrato de Crédito</w:t>
       </w:r>
       <w:r>
         <w:rPr>
@@ -15014,15 +15893,7 @@
         <w:t>RGM</w:t>
       </w:r>
       <w:r>
-        <w:t xml:space="preserve"> la Garantía que se crea en virtud </w:t>
-      </w:r>
-      <w:proofErr w:type="gramStart"/>
-      <w:r>
-        <w:t>del mismo</w:t>
-      </w:r>
-      <w:proofErr w:type="gramEnd"/>
-      <w:r>
-        <w:t>.</w:t>
+        <w:t xml:space="preserve"> la Garantía que se crea en virtud del mismo.</w:t>
       </w:r>
     </w:p>
     <w:p>
@@ -15135,7 +16006,15 @@
         <w:t>Cliente</w:t>
       </w:r>
       <w:r>
-        <w:t xml:space="preserve"> con Finkargo bajo </w:t>
+        <w:t xml:space="preserve"> con </w:t>
+      </w:r>
+      <w:proofErr w:type="spellStart"/>
+      <w:r>
+        <w:t>Finkargo</w:t>
+      </w:r>
+      <w:proofErr w:type="spellEnd"/>
+      <w:r>
+        <w:t xml:space="preserve"> bajo </w:t>
       </w:r>
       <w:r>
         <w:t>este</w:t>
@@ -15303,6 +16182,7 @@
         </w:rPr>
         <w:t xml:space="preserve"> declara y garantiza a </w:t>
       </w:r>
+      <w:proofErr w:type="spellStart"/>
       <w:r>
         <w:rPr>
           <w:rFonts w:eastAsia="Calibri" w:cs="Open Sans"/>
@@ -15318,6 +16198,7 @@
       <w:bookmarkEnd w:id="278"/>
       <w:bookmarkEnd w:id="279"/>
       <w:bookmarkEnd w:id="280"/>
+      <w:proofErr w:type="spellEnd"/>
       <w:r>
         <w:t>, en la Fecha de Firma</w:t>
       </w:r>
@@ -15405,13 +16286,29 @@
         <w:fldChar w:fldCharType="end"/>
       </w:r>
       <w:r>
-        <w:t xml:space="preserve"> están siendo otorgadas por el Cliente con el propósito de que Finkargo suscriba </w:t>
+        <w:t xml:space="preserve"> están siendo otorgadas por el Cliente con el propósito de que </w:t>
+      </w:r>
+      <w:proofErr w:type="spellStart"/>
+      <w:r>
+        <w:t>Finkargo</w:t>
+      </w:r>
+      <w:proofErr w:type="spellEnd"/>
+      <w:r>
+        <w:t xml:space="preserve"> suscriba </w:t>
       </w:r>
       <w:r>
         <w:t>este</w:t>
       </w:r>
       <w:r>
-        <w:t xml:space="preserve"> Contrato de Crédito, reconociéndose adicionalmente que Finkargo ha accedido a suscribirlo en función de </w:t>
+        <w:t xml:space="preserve"> Contrato de Crédito, reconociéndose adicionalmente que </w:t>
+      </w:r>
+      <w:proofErr w:type="spellStart"/>
+      <w:r>
+        <w:t>Finkargo</w:t>
+      </w:r>
+      <w:proofErr w:type="spellEnd"/>
+      <w:r>
+        <w:t xml:space="preserve"> ha accedido a suscribirlo en función de </w:t>
       </w:r>
       <w:r>
         <w:t xml:space="preserve">la veracidad y exactitud de </w:t>
@@ -15591,23 +16488,7 @@
         <w:t xml:space="preserve">y demás documentos bajo el mismo </w:t>
       </w:r>
       <w:r>
-        <w:t xml:space="preserve">que así lo requieran, han sido debidamente suscritos y entregados por un </w:t>
-      </w:r>
-      <w:proofErr w:type="gramStart"/>
-      <w:r>
-        <w:t>Funcionario</w:t>
-      </w:r>
-      <w:proofErr w:type="gramEnd"/>
-      <w:r>
-        <w:t xml:space="preserve"> Autorizado del Cliente y, únicamente en relación con el Aval, por un </w:t>
-      </w:r>
-      <w:proofErr w:type="gramStart"/>
-      <w:r>
-        <w:t>Funcionario</w:t>
-      </w:r>
-      <w:proofErr w:type="gramEnd"/>
-      <w:r>
-        <w:t xml:space="preserve"> Autorizado del Avalista.</w:t>
+        <w:t>que así lo requieran, han sido debidamente suscritos y entregados por un Funcionario Autorizado del Cliente y, únicamente en relación con el Aval, por un Funcionario Autorizado del Avalista.</w:t>
       </w:r>
     </w:p>
     <w:p>
@@ -15777,7 +16658,15 @@
         <w:t>Cliente</w:t>
       </w:r>
       <w:r>
-        <w:t xml:space="preserve"> declara y garantiza a Finkargo que sus ingresos y </w:t>
+        <w:t xml:space="preserve"> declara y garantiza a </w:t>
+      </w:r>
+      <w:proofErr w:type="spellStart"/>
+      <w:r>
+        <w:t>Finkargo</w:t>
+      </w:r>
+      <w:proofErr w:type="spellEnd"/>
+      <w:r>
+        <w:t xml:space="preserve"> que sus ingresos y </w:t>
       </w:r>
       <w:r>
         <w:t xml:space="preserve">recursos usados para la ejecución </w:t>
@@ -15825,7 +16714,15 @@
         <w:t>Cliente</w:t>
       </w:r>
       <w:r>
-        <w:t xml:space="preserve"> a Finkargo en relación consigo mismo, sus administradores, y/o Afiliadas (conjuntamente, los “</w:t>
+        <w:t xml:space="preserve"> a </w:t>
+      </w:r>
+      <w:proofErr w:type="spellStart"/>
+      <w:r>
+        <w:t>Finkargo</w:t>
+      </w:r>
+      <w:proofErr w:type="spellEnd"/>
+      <w:r>
+        <w:t xml:space="preserve"> en relación consigo mismo, sus administradores, y/o Afiliadas (conjuntamente, los “</w:t>
       </w:r>
       <w:r>
         <w:rPr>
@@ -15898,13 +16795,29 @@
         <w:t>Cliente</w:t>
       </w:r>
       <w:r>
-        <w:t xml:space="preserve"> ha revelado a Finkargo toda aquella información y documentación en relación con los Sujetos Necesarios y los </w:t>
+        <w:t xml:space="preserve"> ha revelado a </w:t>
+      </w:r>
+      <w:proofErr w:type="spellStart"/>
+      <w:r>
+        <w:t>Finkargo</w:t>
+      </w:r>
+      <w:proofErr w:type="spellEnd"/>
+      <w:r>
+        <w:t xml:space="preserve"> toda aquella información y documentación en relación con los Sujetos Necesarios y los </w:t>
       </w:r>
       <w:r>
         <w:t>Acreedores de Gastos Nacionales de Importación</w:t>
       </w:r>
       <w:r>
-        <w:t>, todos y cada uno de los acuerdos y contratos vigentes con Personas (diferentes a Finkargo), así como cualquier documento, asunto, evento, hecho o circunstancia que, de manera individual o conjunta, pudiera generar un Efecto Material Adverso.</w:t>
+        <w:t xml:space="preserve">, todos y cada uno de los acuerdos y contratos vigentes con Personas (diferentes a </w:t>
+      </w:r>
+      <w:proofErr w:type="spellStart"/>
+      <w:r>
+        <w:t>Finkargo</w:t>
+      </w:r>
+      <w:proofErr w:type="spellEnd"/>
+      <w:r>
+        <w:t>), así como cualquier documento, asunto, evento, hecho o circunstancia que, de manera individual o conjunta, pudiera generar un Efecto Material Adverso.</w:t>
       </w:r>
     </w:p>
     <w:p>
@@ -16073,7 +16986,15 @@
         <w:t>Aceptada que corresponda</w:t>
       </w:r>
       <w:r>
-        <w:t xml:space="preserve">. Sin perjuicio de lo anterior, Finkargo podrá aceptar, a su entera y única discreción, </w:t>
+        <w:t xml:space="preserve">. Sin perjuicio de lo anterior, </w:t>
+      </w:r>
+      <w:proofErr w:type="spellStart"/>
+      <w:r>
+        <w:t>Finkargo</w:t>
+      </w:r>
+      <w:proofErr w:type="spellEnd"/>
+      <w:r>
+        <w:t xml:space="preserve"> podrá aceptar, a su entera y única discreción, </w:t>
       </w:r>
       <w:r>
         <w:t xml:space="preserve">Acreedores de Gastos Nacionales </w:t>
@@ -16096,8 +17017,13 @@
       <w:bookmarkStart w:id="291" w:name="_heading=h.2rb4i01" w:colFirst="0" w:colLast="0"/>
       <w:bookmarkEnd w:id="291"/>
       <w:r>
-        <w:t>Ausencia de responsabilidad de Finkargo</w:t>
-      </w:r>
+        <w:t xml:space="preserve">Ausencia de responsabilidad de </w:t>
+      </w:r>
+      <w:proofErr w:type="spellStart"/>
+      <w:r>
+        <w:t>Finkargo</w:t>
+      </w:r>
+      <w:proofErr w:type="spellEnd"/>
     </w:p>
     <w:p>
       <w:r>
@@ -16106,8 +17032,13 @@
       <w:r>
         <w:t xml:space="preserve"> </w:t>
       </w:r>
-      <w:r>
-        <w:t xml:space="preserve">Finkargo no ha asumido una responsabilidad de asesoría alguna con el </w:t>
+      <w:proofErr w:type="spellStart"/>
+      <w:r>
+        <w:t>Finkargo</w:t>
+      </w:r>
+      <w:proofErr w:type="spellEnd"/>
+      <w:r>
+        <w:t xml:space="preserve"> no ha asumido una responsabilidad de asesoría alguna con el </w:t>
       </w:r>
       <w:r>
         <w:t>Cliente</w:t>
@@ -16213,7 +17144,15 @@
         <w:t>Contrato</w:t>
       </w:r>
       <w:r>
-        <w:t xml:space="preserve"> de Garantía, los cuales crean a favor de Finkargo un Gravamen válido, legal y exigible de acuerdo con las Leyes Aplicables en todos o sobre todos los activos descritos en los respectivos </w:t>
+        <w:t xml:space="preserve"> de Garantía, los cuales crean a favor de </w:t>
+      </w:r>
+      <w:proofErr w:type="spellStart"/>
+      <w:r>
+        <w:t>Finkargo</w:t>
+      </w:r>
+      <w:proofErr w:type="spellEnd"/>
+      <w:r>
+        <w:t xml:space="preserve"> un Gravamen válido, legal y exigible de acuerdo con las Leyes Aplicables en todos o sobre todos los activos descritos en los respectivos </w:t>
       </w:r>
       <w:r>
         <w:t xml:space="preserve">Contratos </w:t>
@@ -16227,7 +17166,15 @@
         <w:pStyle w:val="Heading3"/>
       </w:pPr>
       <w:r>
-        <w:t xml:space="preserve">Todas las Garantías han sido debidamente registradas ante las entidades correspondientes según la naturaleza de cada una de ellas y en lo aplicable, constituidas en primer grado a favor de Finkargo (salvo por la inscripción en el </w:t>
+        <w:t xml:space="preserve">Todas las Garantías han sido debidamente registradas ante las entidades correspondientes según la naturaleza de cada una de ellas y en lo aplicable, constituidas en primer grado a favor de </w:t>
+      </w:r>
+      <w:proofErr w:type="spellStart"/>
+      <w:r>
+        <w:t>Finkargo</w:t>
+      </w:r>
+      <w:proofErr w:type="spellEnd"/>
+      <w:r>
+        <w:t xml:space="preserve"> (salvo por la inscripción en el </w:t>
       </w:r>
       <w:r>
         <w:t>RGM</w:t>
@@ -16728,9 +17675,11 @@
       <w:r>
         <w:t xml:space="preserve">Entregar a </w:t>
       </w:r>
+      <w:proofErr w:type="spellStart"/>
       <w:r>
         <w:t>Finkargo</w:t>
       </w:r>
+      <w:proofErr w:type="spellEnd"/>
       <w:r>
         <w:t xml:space="preserve">, al momento de realizar una Solicitud de </w:t>
       </w:r>
@@ -16785,7 +17734,23 @@
         <w:pStyle w:val="Heading3"/>
       </w:pPr>
       <w:r>
-        <w:t>Entregar a Finkargo toda la Información Necesaria de manera correcta, veraz y precisa y tan pronto como sea posible a partir de la solicitud que haga Finkargo de dicha Información Necesaria, pero en todo caso dentro de los cinco (5) Días Hábiles siguientes a la solicitud realizada.</w:t>
+        <w:t xml:space="preserve">Entregar a </w:t>
+      </w:r>
+      <w:proofErr w:type="spellStart"/>
+      <w:r>
+        <w:t>Finkargo</w:t>
+      </w:r>
+      <w:proofErr w:type="spellEnd"/>
+      <w:r>
+        <w:t xml:space="preserve"> toda la Información Necesaria de manera correcta, veraz y precisa y tan pronto como sea posible a partir de la solicitud que haga </w:t>
+      </w:r>
+      <w:proofErr w:type="spellStart"/>
+      <w:r>
+        <w:t>Finkargo</w:t>
+      </w:r>
+      <w:proofErr w:type="spellEnd"/>
+      <w:r>
+        <w:t xml:space="preserve"> de dicha Información Necesaria, pero en todo caso dentro de los cinco (5) Días Hábiles siguientes a la solicitud realizada.</w:t>
       </w:r>
     </w:p>
     <w:p>
@@ -16793,7 +17758,15 @@
         <w:pStyle w:val="Heading3"/>
       </w:pPr>
       <w:r>
-        <w:t>Entregar a Finkargo toda la información relacionada con cualquier acto o evento que produzca o pueda razonablemente producir un Efecto Material Adverso.</w:t>
+        <w:t xml:space="preserve">Entregar a </w:t>
+      </w:r>
+      <w:proofErr w:type="spellStart"/>
+      <w:r>
+        <w:t>Finkargo</w:t>
+      </w:r>
+      <w:proofErr w:type="spellEnd"/>
+      <w:r>
+        <w:t xml:space="preserve"> toda la información relacionada con cualquier acto o evento que produzca o pueda razonablemente producir un Efecto Material Adverso.</w:t>
       </w:r>
     </w:p>
     <w:p>
@@ -16801,7 +17774,15 @@
         <w:pStyle w:val="Heading3"/>
       </w:pPr>
       <w:r>
-        <w:t xml:space="preserve">Dentro de los ciento veinte (120) días siguientes al último día de cada año calendario, entregar a Finkargo una copia de </w:t>
+        <w:t xml:space="preserve">Dentro de los ciento veinte (120) días siguientes al último día de cada año calendario, entregar a </w:t>
+      </w:r>
+      <w:proofErr w:type="spellStart"/>
+      <w:r>
+        <w:t>Finkargo</w:t>
+      </w:r>
+      <w:proofErr w:type="spellEnd"/>
+      <w:r>
+        <w:t xml:space="preserve"> una copia de </w:t>
       </w:r>
       <w:r>
         <w:t>sus</w:t>
@@ -16815,7 +17796,23 @@
         <w:pStyle w:val="Heading3"/>
       </w:pPr>
       <w:r>
-        <w:t>Contra solicitud enviada por Finkargo, dentro de los treinta (30) días siguientes al último día de marzo, junio y septiembre, entregar a Finkargo una copia de los estados financieros trimestrales no auditados, respecto del trimestre calendario inmediatamente anterior, emitidos de conformidad con los Principios de Contabilidad.</w:t>
+        <w:t xml:space="preserve">Contra solicitud enviada por </w:t>
+      </w:r>
+      <w:proofErr w:type="spellStart"/>
+      <w:r>
+        <w:t>Finkargo</w:t>
+      </w:r>
+      <w:proofErr w:type="spellEnd"/>
+      <w:r>
+        <w:t xml:space="preserve">, dentro de los treinta (30) días siguientes al último día de marzo, junio y septiembre, entregar a </w:t>
+      </w:r>
+      <w:proofErr w:type="spellStart"/>
+      <w:r>
+        <w:t>Finkargo</w:t>
+      </w:r>
+      <w:proofErr w:type="spellEnd"/>
+      <w:r>
+        <w:t xml:space="preserve"> una copia de los estados financieros trimestrales no auditados, respecto del trimestre calendario inmediatamente anterior, emitidos de conformidad con los Principios de Contabilidad.</w:t>
       </w:r>
     </w:p>
     <w:p>
@@ -16843,7 +17840,15 @@
     </w:p>
     <w:p>
       <w:r>
-        <w:t>. Notificar a Finkargo, dentro de los tres (3) Días Hábiles siguientes a la fecha en que tenga conocimiento de la ocurrencia de los eventos que se detallan a continuación:</w:t>
+        <w:t xml:space="preserve">. Notificar a </w:t>
+      </w:r>
+      <w:proofErr w:type="spellStart"/>
+      <w:r>
+        <w:t>Finkargo</w:t>
+      </w:r>
+      <w:proofErr w:type="spellEnd"/>
+      <w:r>
+        <w:t>, dentro de los tres (3) Días Hábiles siguientes a la fecha en que tenga conocimiento de la ocurrencia de los eventos que se detallan a continuación:</w:t>
       </w:r>
     </w:p>
     <w:p>
@@ -16956,8 +17961,13 @@
         <w:t xml:space="preserve"> de Garantía</w:t>
       </w:r>
       <w:r>
-        <w:t xml:space="preserve"> que sean requeridos, a solicitud de Finkargo</w:t>
-      </w:r>
+        <w:t xml:space="preserve"> que sean requeridos, a solicitud de </w:t>
+      </w:r>
+      <w:proofErr w:type="spellStart"/>
+      <w:r>
+        <w:t>Finkargo</w:t>
+      </w:r>
+      <w:proofErr w:type="spellEnd"/>
       <w:r>
         <w:t>.</w:t>
       </w:r>
@@ -16981,7 +17991,23 @@
         <w:pStyle w:val="Heading3"/>
       </w:pPr>
       <w:r>
-        <w:t xml:space="preserve">Llevar a cabo todas las acciones necesarias y apropiadas con el fin de proteger el título e interés de Finkargo sobre cualquiera de las Garantías, de tal manera que, durante todo momento durante la Vigencia, o mientras Finkargo requiera cualquiera de las Garantías al </w:t>
+        <w:t xml:space="preserve">Llevar a cabo todas las acciones necesarias y apropiadas con el fin de proteger el título e interés de </w:t>
+      </w:r>
+      <w:proofErr w:type="spellStart"/>
+      <w:r>
+        <w:t>Finkargo</w:t>
+      </w:r>
+      <w:proofErr w:type="spellEnd"/>
+      <w:r>
+        <w:t xml:space="preserve"> sobre cualquiera de las Garantías, de tal manera que, durante todo momento durante la Vigencia, o mientras </w:t>
+      </w:r>
+      <w:proofErr w:type="spellStart"/>
+      <w:r>
+        <w:t>Finkargo</w:t>
+      </w:r>
+      <w:proofErr w:type="spellEnd"/>
+      <w:r>
+        <w:t xml:space="preserve"> requiera cualquiera de las Garantías al </w:t>
       </w:r>
       <w:r>
         <w:t>Cliente</w:t>
@@ -17028,7 +18054,15 @@
         <w:t xml:space="preserve"> </w:t>
       </w:r>
       <w:r>
-        <w:t xml:space="preserve">y mantener a Finkargo indemne de cualquier situación que implique o pueda implicar una sanción cambiaria o aduanera para el </w:t>
+        <w:t xml:space="preserve">y mantener a </w:t>
+      </w:r>
+      <w:proofErr w:type="spellStart"/>
+      <w:r>
+        <w:t>Finkargo</w:t>
+      </w:r>
+      <w:proofErr w:type="spellEnd"/>
+      <w:r>
+        <w:t xml:space="preserve"> indemne de cualquier situación que implique o pueda implicar una sanción cambiaria o aduanera para el </w:t>
       </w:r>
       <w:r>
         <w:t>Cliente</w:t>
@@ -17042,7 +18076,15 @@
         <w:pStyle w:val="Heading3"/>
       </w:pPr>
       <w:r>
-        <w:t>Dar estricto cumplimiento a las Disposiciones Anti-Corrupción, Lavado de Activos y Financiación del Terrorismo e informar a Finkargo de manera inmediata, pero en todo caso dentro de los tres (3) Días Hábiles siguientes cualquier evento, circunstancia o situación que dé lugar o pueda dar lugar a una violación o presunta violación de las Disposiciones Anti-Corrupción, Lavado de Activos y Financiación del Terrorismo.</w:t>
+        <w:t xml:space="preserve">Dar estricto cumplimiento a las Disposiciones Anti-Corrupción, Lavado de Activos y Financiación del Terrorismo e informar a </w:t>
+      </w:r>
+      <w:proofErr w:type="spellStart"/>
+      <w:r>
+        <w:t>Finkargo</w:t>
+      </w:r>
+      <w:proofErr w:type="spellEnd"/>
+      <w:r>
+        <w:t xml:space="preserve"> de manera inmediata, pero en todo caso dentro de los tres (3) Días Hábiles siguientes cualquier evento, circunstancia o situación que dé lugar o pueda dar lugar a una violación o presunta violación de las Disposiciones Anti-Corrupción, Lavado de Activos y Financiación del Terrorismo.</w:t>
       </w:r>
     </w:p>
     <w:p>
@@ -17162,7 +18204,23 @@
         <w:pStyle w:val="Heading3"/>
       </w:pPr>
       <w:r>
-        <w:t xml:space="preserve">Permitir que los representantes y asesores de Finkargo o cualquier Persona autorizada por Finkargo visiten e inspeccionen cualquiera de las oficinas del </w:t>
+        <w:t xml:space="preserve">Permitir que los representantes y asesores de </w:t>
+      </w:r>
+      <w:proofErr w:type="spellStart"/>
+      <w:r>
+        <w:t>Finkargo</w:t>
+      </w:r>
+      <w:proofErr w:type="spellEnd"/>
+      <w:r>
+        <w:t xml:space="preserve"> o cualquier Persona autorizada por </w:t>
+      </w:r>
+      <w:proofErr w:type="spellStart"/>
+      <w:r>
+        <w:t>Finkargo</w:t>
+      </w:r>
+      <w:proofErr w:type="spellEnd"/>
+      <w:r>
+        <w:t xml:space="preserve"> visiten e inspeccionen cualquiera de las oficinas del </w:t>
       </w:r>
       <w:r>
         <w:t>Cliente</w:t>
@@ -17174,7 +18232,15 @@
         <w:t>Cliente</w:t>
       </w:r>
       <w:r>
-        <w:t xml:space="preserve"> haya entregado a Finkargo por concepto de este Contrato</w:t>
+        <w:t xml:space="preserve"> haya entregado a </w:t>
+      </w:r>
+      <w:proofErr w:type="spellStart"/>
+      <w:r>
+        <w:t>Finkargo</w:t>
+      </w:r>
+      <w:proofErr w:type="spellEnd"/>
+      <w:r>
+        <w:t xml:space="preserve"> por concepto de este Contrato</w:t>
       </w:r>
       <w:r>
         <w:t xml:space="preserve"> de Crédito</w:t>
@@ -17212,7 +18278,15 @@
         <w:t xml:space="preserve">Cliente </w:t>
       </w:r>
       <w:r>
-        <w:t xml:space="preserve">con sus respectivos funcionarios y contadores. Para tales efectos, Finkargo deberá notificar de manera previa al </w:t>
+        <w:t xml:space="preserve">con sus respectivos funcionarios y contadores. Para tales efectos, </w:t>
+      </w:r>
+      <w:proofErr w:type="spellStart"/>
+      <w:r>
+        <w:t>Finkargo</w:t>
+      </w:r>
+      <w:proofErr w:type="spellEnd"/>
+      <w:r>
+        <w:t xml:space="preserve"> deberá notificar de manera previa al </w:t>
       </w:r>
       <w:r>
         <w:t xml:space="preserve">Cliente </w:t>
@@ -17232,7 +18306,15 @@
         <w:pStyle w:val="Heading3"/>
       </w:pPr>
       <w:r>
-        <w:t xml:space="preserve">Sin perjuicio de lo anterior, en caso de que ocurra un Incumplimiento o Evento de Incumplimiento, Finkargo podrá realizar todo lo anterior en cualquier momento durante Días Hábiles y en horas de atención del </w:t>
+        <w:t xml:space="preserve">Sin perjuicio de lo anterior, en caso de que ocurra un Incumplimiento o Evento de Incumplimiento, </w:t>
+      </w:r>
+      <w:proofErr w:type="spellStart"/>
+      <w:r>
+        <w:t>Finkargo</w:t>
+      </w:r>
+      <w:proofErr w:type="spellEnd"/>
+      <w:r>
+        <w:t xml:space="preserve"> podrá realizar todo lo anterior en cualquier momento durante Días Hábiles y en horas de atención del </w:t>
       </w:r>
       <w:r>
         <w:t>Cliente</w:t>
@@ -17250,7 +18332,15 @@
         <w:t xml:space="preserve">Cliente </w:t>
       </w:r>
       <w:r>
-        <w:t>los costos y gastos en que incurra Finkargo y sus asesores en dichas visitas e inspecciones</w:t>
+        <w:t xml:space="preserve">los costos y gastos en que incurra </w:t>
+      </w:r>
+      <w:proofErr w:type="spellStart"/>
+      <w:r>
+        <w:t>Finkargo</w:t>
+      </w:r>
+      <w:proofErr w:type="spellEnd"/>
+      <w:r>
+        <w:t xml:space="preserve"> y sus asesores en dichas visitas e inspecciones</w:t>
       </w:r>
     </w:p>
     <w:p>
@@ -17322,7 +18412,15 @@
         <w:pStyle w:val="Heading3"/>
       </w:pPr>
       <w:r>
-        <w:t xml:space="preserve">Preservar su patrimonio y no realizar ninguna acción que pueda llevar a su detrimento, toda vez que es la garantía general para Finkargo como acreedor </w:t>
+        <w:t xml:space="preserve">Preservar su patrimonio y no realizar ninguna acción que pueda llevar a su detrimento, toda vez que es la garantía general para </w:t>
+      </w:r>
+      <w:proofErr w:type="spellStart"/>
+      <w:r>
+        <w:t>Finkargo</w:t>
+      </w:r>
+      <w:proofErr w:type="spellEnd"/>
+      <w:r>
+        <w:t xml:space="preserve"> como acreedor </w:t>
       </w:r>
       <w:r>
         <w:t>de las Obligaciones</w:t>
@@ -17353,7 +18451,15 @@
       </w:r>
       <w:proofErr w:type="spellEnd"/>
       <w:r>
-        <w:t xml:space="preserve">) realizar y ejecutar todas las actuaciones y suscribir todos los documentos que puedan ser necesarios o que razonablemente sean requeridos por Finkargo para perfeccionar y mantener la validez y legalidad de </w:t>
+        <w:t xml:space="preserve">) realizar y ejecutar todas las actuaciones y suscribir todos los documentos que puedan ser necesarios o que razonablemente sean requeridos por </w:t>
+      </w:r>
+      <w:proofErr w:type="spellStart"/>
+      <w:r>
+        <w:t>Finkargo</w:t>
+      </w:r>
+      <w:proofErr w:type="spellEnd"/>
+      <w:r>
+        <w:t xml:space="preserve"> para perfeccionar y mantener la validez y legalidad de </w:t>
       </w:r>
       <w:r>
         <w:t xml:space="preserve">las Cotizaciones </w:t>
@@ -17366,7 +18472,15 @@
         <w:t xml:space="preserve"> Aceptadas</w:t>
       </w:r>
       <w:r>
-        <w:t xml:space="preserve"> y proteger los derechos del Finkargo bajo </w:t>
+        <w:t xml:space="preserve"> y proteger los derechos del </w:t>
+      </w:r>
+      <w:proofErr w:type="spellStart"/>
+      <w:r>
+        <w:t>Finkargo</w:t>
+      </w:r>
+      <w:proofErr w:type="spellEnd"/>
+      <w:r>
+        <w:t xml:space="preserve"> bajo </w:t>
       </w:r>
       <w:r>
         <w:t>l</w:t>
@@ -17455,7 +18569,15 @@
       </w:pPr>
       <w:bookmarkStart w:id="340" w:name="_Ref141783946"/>
       <w:r>
-        <w:t>Abstenerse de realizar directa o indirectamente, en una transacción o grupo de transacciones, sin el consentimiento previo y por escrito de Finkargo, consistente en, (i) cualquier fusión, escisión, o transformación societaria y/o cualquier transacción u operación que pueda tener efectos similares a cualquiera de las anteriores operaciones; y (</w:t>
+        <w:t xml:space="preserve">Abstenerse de realizar directa o indirectamente, en una transacción o grupo de transacciones, sin el consentimiento previo y por escrito de </w:t>
+      </w:r>
+      <w:proofErr w:type="spellStart"/>
+      <w:r>
+        <w:t>Finkargo</w:t>
+      </w:r>
+      <w:proofErr w:type="spellEnd"/>
+      <w:r>
+        <w:t>, consistente en, (i) cualquier fusión, escisión, o transformación societaria y/o cualquier transacción u operación que pueda tener efectos similares a cualquiera de las anteriores operaciones; y (</w:t>
       </w:r>
       <w:proofErr w:type="spellStart"/>
       <w:r>
@@ -17475,7 +18597,15 @@
         </w:rPr>
       </w:pPr>
       <w:r>
-        <w:t xml:space="preserve">Sin perjuicio de lo anterior, Finkargo </w:t>
+        <w:t xml:space="preserve">Sin perjuicio de lo anterior, </w:t>
+      </w:r>
+      <w:proofErr w:type="spellStart"/>
+      <w:r>
+        <w:t>Finkargo</w:t>
+      </w:r>
+      <w:proofErr w:type="spellEnd"/>
+      <w:r>
+        <w:t xml:space="preserve"> </w:t>
       </w:r>
       <w:r>
         <w:t xml:space="preserve">declara, </w:t>
@@ -17613,7 +18743,15 @@
       <w:bookmarkStart w:id="347" w:name="_heading=h.hkkpf6" w:colFirst="0" w:colLast="0"/>
       <w:bookmarkEnd w:id="347"/>
       <w:r>
-        <w:t>Realizar acciones tendientes al ocultamiento de recursos de origen ilícito, de lavado de activos o a financiar el terrorismo, o utilizar a Finkargo para canalizar operaciones tendientes al ocultamiento de recursos de origen ilícito, de lavado de activos o para la financiación del terrorismo, la financiación de la proliferación de armas de destrucción masiva y mantener relaciones contractuales o comerciales con Personas Sancionadas.</w:t>
+        <w:t xml:space="preserve">Realizar acciones tendientes al ocultamiento de recursos de origen ilícito, de lavado de activos o a financiar el terrorismo, o utilizar a </w:t>
+      </w:r>
+      <w:proofErr w:type="spellStart"/>
+      <w:r>
+        <w:t>Finkargo</w:t>
+      </w:r>
+      <w:proofErr w:type="spellEnd"/>
+      <w:r>
+        <w:t xml:space="preserve"> para canalizar operaciones tendientes al ocultamiento de recursos de origen ilícito, de lavado de activos o para la financiación del terrorismo, la financiación de la proliferación de armas de destrucción masiva y mantener relaciones contractuales o comerciales con Personas Sancionadas.</w:t>
       </w:r>
     </w:p>
     <w:p>
@@ -17659,7 +18797,23 @@
         <w:fldChar w:fldCharType="end"/>
       </w:r>
       <w:r>
-        <w:t>, deberá notificar a Finkargo dentro de los cinco (5) días siguientes a que tenga conocimiento y cooperar de buena fe, presentar apoyo documental y responder con prontitud a Finkargo ante cualquier requerimiento en relación con los hechos.</w:t>
+        <w:t xml:space="preserve">, deberá notificar a </w:t>
+      </w:r>
+      <w:proofErr w:type="spellStart"/>
+      <w:r>
+        <w:t>Finkargo</w:t>
+      </w:r>
+      <w:proofErr w:type="spellEnd"/>
+      <w:r>
+        <w:t xml:space="preserve"> dentro de los cinco (5) días siguientes a que tenga conocimiento y cooperar de buena fe, presentar apoyo documental y responder con prontitud a </w:t>
+      </w:r>
+      <w:proofErr w:type="spellStart"/>
+      <w:r>
+        <w:t>Finkargo</w:t>
+      </w:r>
+      <w:proofErr w:type="spellEnd"/>
+      <w:r>
+        <w:t xml:space="preserve"> ante cualquier requerimiento en relación con los hechos.</w:t>
       </w:r>
     </w:p>
     <w:p>
@@ -17983,7 +19137,15 @@
       </w:r>
       <w:proofErr w:type="spellEnd"/>
       <w:r>
-        <w:t xml:space="preserve"> Inc. y/o Finkargo México S.A.P.I. de C.V., SOFOM, E.N.R</w:t>
+        <w:t xml:space="preserve"> Inc. y/o </w:t>
+      </w:r>
+      <w:proofErr w:type="spellStart"/>
+      <w:r>
+        <w:t>Finkargo</w:t>
+      </w:r>
+      <w:proofErr w:type="spellEnd"/>
+      <w:r>
+        <w:t xml:space="preserve"> México S.A.P.I. de C.V., SOFOM, E.N.R</w:t>
       </w:r>
       <w:r>
         <w:t xml:space="preserve"> y</w:t>
@@ -18013,14 +19175,27 @@
         <w:t xml:space="preserve"> a los cuales el Cliente se haya adherido bajo el mismo</w:t>
       </w:r>
       <w:r>
-        <w:t>; así como (2) cualquier contrato o documento suscrito entre Finkargo y el Cliente</w:t>
+        <w:t xml:space="preserve">; así como (2) cualquier contrato o documento suscrito entre </w:t>
+      </w:r>
+      <w:proofErr w:type="spellStart"/>
+      <w:r>
+        <w:t>Finkargo</w:t>
+      </w:r>
+      <w:proofErr w:type="spellEnd"/>
+      <w:r>
+        <w:t xml:space="preserve"> y el Cliente</w:t>
       </w:r>
       <w:r>
         <w:t xml:space="preserve"> o el cual este haya aceptado o se haya adherido</w:t>
       </w:r>
       <w:r>
-        <w:t>, con anterioridad o durante la Vigencia, constitutivo de obligaciones a cargo del Cliente y a favor de Finkargo</w:t>
-      </w:r>
+        <w:t xml:space="preserve">, con anterioridad o durante la Vigencia, constitutivo de obligaciones a cargo del Cliente y a favor de </w:t>
+      </w:r>
+      <w:proofErr w:type="spellStart"/>
+      <w:r>
+        <w:t>Finkargo</w:t>
+      </w:r>
+      <w:proofErr w:type="spellEnd"/>
       <w:r>
         <w:t>.</w:t>
       </w:r>
@@ -18043,15 +19218,28 @@
         <w:t xml:space="preserve">Cliente </w:t>
       </w:r>
       <w:r>
-        <w:t>tenga Obligaciones pendientes de pago con Finkargo, ocurre alguna de los siguientes eventos:</w:t>
+        <w:t xml:space="preserve">tenga Obligaciones pendientes de pago con </w:t>
+      </w:r>
+      <w:proofErr w:type="spellStart"/>
+      <w:r>
+        <w:t>Finkargo</w:t>
+      </w:r>
+      <w:proofErr w:type="spellEnd"/>
+      <w:r>
+        <w:t>, ocurre alguna de los siguientes eventos:</w:t>
       </w:r>
     </w:p>
     <w:p>
       <w:pPr>
         <w:pStyle w:val="Heading4"/>
       </w:pPr>
-      <w:r>
-        <w:t>Finkargo deja de ser beneficiario de cualquiera de las Garantías</w:t>
+      <w:proofErr w:type="spellStart"/>
+      <w:r>
+        <w:t>Finkargo</w:t>
+      </w:r>
+      <w:proofErr w:type="spellEnd"/>
+      <w:r>
+        <w:t xml:space="preserve"> deja de ser beneficiario de cualquiera de las Garantías</w:t>
       </w:r>
       <w:r>
         <w:t>.</w:t>
@@ -18061,8 +19249,13 @@
       <w:pPr>
         <w:pStyle w:val="Heading4"/>
       </w:pPr>
-      <w:r>
-        <w:t>Finkargo deja de estar garantizado en primer grado de prelación bajo cualquiera de las Garantías</w:t>
+      <w:proofErr w:type="spellStart"/>
+      <w:r>
+        <w:t>Finkargo</w:t>
+      </w:r>
+      <w:proofErr w:type="spellEnd"/>
+      <w:r>
+        <w:t xml:space="preserve"> deja de estar garantizado en primer grado de prelación bajo cualquiera de las Garantías</w:t>
       </w:r>
       <w:r>
         <w:t>.</w:t>
@@ -18079,7 +19272,15 @@
         <w:t>es</w:t>
       </w:r>
       <w:r>
-        <w:t>quiera de las Garantías, o los derechos que tenga Finkargo respecto de una Garantía, dejen de ser válidos o ejecutables de acuerdo con sus términos</w:t>
+        <w:t xml:space="preserve">quiera de las Garantías, o los derechos que tenga </w:t>
+      </w:r>
+      <w:proofErr w:type="spellStart"/>
+      <w:r>
+        <w:t>Finkargo</w:t>
+      </w:r>
+      <w:proofErr w:type="spellEnd"/>
+      <w:r>
+        <w:t xml:space="preserve"> respecto de una Garantía, dejen de ser válidos o ejecutables de acuerdo con sus términos</w:t>
       </w:r>
       <w:r>
         <w:t>.</w:t>
@@ -18145,8 +19346,13 @@
         <w:t xml:space="preserve">Cliente </w:t>
       </w:r>
       <w:r>
-        <w:t>a Finkargo</w:t>
-      </w:r>
+        <w:t xml:space="preserve">a </w:t>
+      </w:r>
+      <w:proofErr w:type="spellStart"/>
+      <w:r>
+        <w:t>Finkargo</w:t>
+      </w:r>
+      <w:proofErr w:type="spellEnd"/>
       <w:r>
         <w:t xml:space="preserve"> o en cualquier Cotización de Desembolso</w:t>
       </w:r>
@@ -18326,7 +19532,23 @@
         <w:pStyle w:val="Heading5"/>
       </w:pPr>
       <w:r>
-        <w:t>Da inicio o sea admitido a un proceso privado o bajo cualquier Ley Aplicable, que tenga como efecto o propósito llegar a un acuerdo general con sus acreedores sin que Finkargo sea admitido o aceptado como parte acreedora de dicho proceso, en la medida en que existan Obligaciones pendientes de pago a Finkargo, incluyendo, pero sin limitarse, un proceso de reorganización bajo la Ley 1116 de 2006.</w:t>
+        <w:t xml:space="preserve">Da inicio o sea admitido a un proceso privado o bajo cualquier Ley Aplicable, que tenga como efecto o propósito llegar a un acuerdo general con sus acreedores sin que </w:t>
+      </w:r>
+      <w:proofErr w:type="spellStart"/>
+      <w:r>
+        <w:t>Finkargo</w:t>
+      </w:r>
+      <w:proofErr w:type="spellEnd"/>
+      <w:r>
+        <w:t xml:space="preserve"> sea admitido o aceptado como parte acreedora de dicho proceso, en la medida en que existan Obligaciones pendientes de pago a </w:t>
+      </w:r>
+      <w:proofErr w:type="spellStart"/>
+      <w:r>
+        <w:t>Finkargo</w:t>
+      </w:r>
+      <w:proofErr w:type="spellEnd"/>
+      <w:r>
+        <w:t>, incluyendo, pero sin limitarse, un proceso de reorganización bajo la Ley 1116 de 2006.</w:t>
       </w:r>
     </w:p>
     <w:p>
@@ -18572,15 +19794,7 @@
         <w:t xml:space="preserve">Cliente </w:t>
       </w:r>
       <w:r>
-        <w:t xml:space="preserve">con cualquier Persona que sea una entidad financiera, que tenga un valor igual o superior a cien mil </w:t>
-      </w:r>
-      <w:proofErr w:type="gramStart"/>
-      <w:r>
-        <w:t>Dólares</w:t>
-      </w:r>
-      <w:proofErr w:type="gramEnd"/>
-      <w:r>
-        <w:t xml:space="preserve"> (USD</w:t>
+        <w:t>con cualquier Persona que sea una entidad financiera, que tenga un valor igual o superior a cien mil Dólares (USD</w:t>
       </w:r>
       <w:r>
         <w:t>$</w:t>
@@ -18610,15 +19824,7 @@
         <w:t xml:space="preserve">a </w:t>
       </w:r>
       <w:r>
-        <w:t xml:space="preserve">cien mil </w:t>
-      </w:r>
-      <w:proofErr w:type="gramStart"/>
-      <w:r>
-        <w:t>Dólares</w:t>
-      </w:r>
-      <w:proofErr w:type="gramEnd"/>
-      <w:r>
-        <w:t xml:space="preserve"> (USD</w:t>
+        <w:t>cien mil Dólares (USD</w:t>
       </w:r>
       <w:r>
         <w:t>$</w:t>
@@ -18651,15 +19857,7 @@
         <w:t xml:space="preserve">Cliente </w:t>
       </w:r>
       <w:r>
-        <w:t xml:space="preserve">el pago a cualquier Persona, ya sea mediante sentencia, laudo o cualquier acto procesal, judicial o administrativo, de una suma igual o superior cincuenta mil </w:t>
-      </w:r>
-      <w:proofErr w:type="gramStart"/>
-      <w:r>
-        <w:t>Dólares</w:t>
-      </w:r>
-      <w:proofErr w:type="gramEnd"/>
-      <w:r>
-        <w:t xml:space="preserve"> (USD</w:t>
+        <w:t>el pago a cualquier Persona, ya sea mediante sentencia, laudo o cualquier acto procesal, judicial o administrativo, de una suma igual o superior cincuenta mil Dólares (USD</w:t>
       </w:r>
       <w:r>
         <w:t>$</w:t>
@@ -18814,7 +20012,15 @@
         <w:t xml:space="preserve">Cliente </w:t>
       </w:r>
       <w:r>
-        <w:t>dentro del periodo de cura aplicable, en caso de existir, Finkargo podrá tomar una o varias de las siguientes medidas y/o acciones.</w:t>
+        <w:t xml:space="preserve">dentro del periodo de cura aplicable, en caso de existir, </w:t>
+      </w:r>
+      <w:proofErr w:type="spellStart"/>
+      <w:r>
+        <w:t>Finkargo</w:t>
+      </w:r>
+      <w:proofErr w:type="spellEnd"/>
+      <w:r>
+        <w:t xml:space="preserve"> podrá tomar una o varias de las siguientes medidas y/o acciones.</w:t>
       </w:r>
     </w:p>
     <w:p>
@@ -18922,7 +20128,15 @@
         <w:pStyle w:val="Heading4"/>
       </w:pPr>
       <w:r>
-        <w:t xml:space="preserve">En general, cualquier otra acción, derecho o remedio a disposición de Finkargo bajo las Leyes Aplicables y </w:t>
+        <w:t xml:space="preserve">En general, cualquier otra acción, derecho o remedio a disposición de </w:t>
+      </w:r>
+      <w:proofErr w:type="spellStart"/>
+      <w:r>
+        <w:t>Finkargo</w:t>
+      </w:r>
+      <w:proofErr w:type="spellEnd"/>
+      <w:r>
+        <w:t xml:space="preserve"> bajo las Leyes Aplicables y </w:t>
       </w:r>
       <w:r>
         <w:t>las Cotizaciones de Desembolso</w:t>
@@ -18939,7 +20153,15 @@
         <w:pStyle w:val="Heading3"/>
       </w:pPr>
       <w:r>
-        <w:t xml:space="preserve">El ejercicio de cualquiera de los derechos, acciones o remedios de Finkargo previstos en </w:t>
+        <w:t xml:space="preserve">El ejercicio de cualquiera de los derechos, acciones o remedios de </w:t>
+      </w:r>
+      <w:proofErr w:type="spellStart"/>
+      <w:r>
+        <w:t>Finkargo</w:t>
+      </w:r>
+      <w:proofErr w:type="spellEnd"/>
+      <w:r>
+        <w:t xml:space="preserve"> previstos en </w:t>
       </w:r>
       <w:r>
         <w:t>este</w:t>
@@ -18957,7 +20179,15 @@
         <w:t xml:space="preserve">las Cotizaciones de Desembolso </w:t>
       </w:r>
       <w:r>
-        <w:t>y en las Leyes Aplicables no son excluyentes, de tal manera que Finkargo podrá ejercer conjunta o separadamente cualquiera de dichos derechos, acciones o remedios, a su entera discreción.</w:t>
+        <w:t xml:space="preserve">y en las Leyes Aplicables no son excluyentes, de tal manera que </w:t>
+      </w:r>
+      <w:proofErr w:type="spellStart"/>
+      <w:r>
+        <w:t>Finkargo</w:t>
+      </w:r>
+      <w:proofErr w:type="spellEnd"/>
+      <w:r>
+        <w:t xml:space="preserve"> podrá ejercer conjunta o separadamente cualquiera de dichos derechos, acciones o remedios, a su entera discreción.</w:t>
       </w:r>
     </w:p>
     <w:p>
@@ -18990,7 +20220,15 @@
         <w:t xml:space="preserve"> de Crédito</w:t>
       </w:r>
       <w:r>
-        <w:t xml:space="preserve">, Finkargo podrá cobrar al </w:t>
+        <w:t xml:space="preserve">, </w:t>
+      </w:r>
+      <w:proofErr w:type="spellStart"/>
+      <w:r>
+        <w:t>Finkargo</w:t>
+      </w:r>
+      <w:proofErr w:type="spellEnd"/>
+      <w:r>
+        <w:t xml:space="preserve"> podrá cobrar al </w:t>
       </w:r>
       <w:r>
         <w:t>Cliente</w:t>
@@ -19102,7 +20340,15 @@
         <w:t>Cliente</w:t>
       </w:r>
       <w:r>
-        <w:t xml:space="preserve"> acuerda defender, indemnizar, pagar y eximir de responsabilidad, a Finkargo, a cualquier Cesionario Permitido y cada uno de sus respectivos funcionarios, accionistas, miembros, directores, fideicomisarios, asesores, empleados, abogados, agentes, subagentes y Afiliadas (cada uno, un “</w:t>
+        <w:t xml:space="preserve"> acuerda defender, indemnizar, pagar y eximir de responsabilidad, a </w:t>
+      </w:r>
+      <w:proofErr w:type="spellStart"/>
+      <w:r>
+        <w:t>Finkargo</w:t>
+      </w:r>
+      <w:proofErr w:type="spellEnd"/>
+      <w:r>
+        <w:t>, a cualquier Cesionario Permitido y cada uno de sus respectivos funcionarios, accionistas, miembros, directores, fideicomisarios, asesores, empleados, abogados, agentes, subagentes y Afiliadas (cada uno, un “</w:t>
       </w:r>
       <w:r>
         <w:rPr>
@@ -19333,7 +20579,23 @@
         <w:t xml:space="preserve">Cliente </w:t>
       </w:r>
       <w:r>
-        <w:t xml:space="preserve">se obliga a informar inmediatamente a Finkargo, pero en todo caso dentro de los cinco (5) Días Hábiles siguientes a su conocimiento, cualquier evento o situación que genere o pueda eventualmente generar una Responsabilidad Indemnizable, o en virtud del cual un Indemnizado pueda resultar vinculado directa o indirectamente a un proceso, procedimiento, investigación, cargo, demanda o acción que tenga relación con o se pueda derivar de una Responsabilidad Indemnizable. Salvo que en dicho evento surja un conflicto de interés entre Finkargo y el </w:t>
+        <w:t xml:space="preserve">se obliga a informar inmediatamente a </w:t>
+      </w:r>
+      <w:proofErr w:type="spellStart"/>
+      <w:r>
+        <w:t>Finkargo</w:t>
+      </w:r>
+      <w:proofErr w:type="spellEnd"/>
+      <w:r>
+        <w:t xml:space="preserve">, pero en todo caso dentro de los cinco (5) Días Hábiles siguientes a su conocimiento, cualquier evento o situación que genere o pueda eventualmente generar una Responsabilidad Indemnizable, o en virtud del cual un Indemnizado pueda resultar vinculado directa o indirectamente a un proceso, procedimiento, investigación, cargo, demanda o acción que tenga relación con o se pueda derivar de una Responsabilidad Indemnizable. Salvo que en dicho evento surja un conflicto de interés entre </w:t>
+      </w:r>
+      <w:proofErr w:type="spellStart"/>
+      <w:r>
+        <w:t>Finkargo</w:t>
+      </w:r>
+      <w:proofErr w:type="spellEnd"/>
+      <w:r>
+        <w:t xml:space="preserve"> y el </w:t>
       </w:r>
       <w:r>
         <w:t>Cliente</w:t>
@@ -19345,7 +20607,23 @@
         <w:t>Cliente</w:t>
       </w:r>
       <w:r>
-        <w:t xml:space="preserve"> se obliga a acordar con Finkargo la mejor estrategia de defensa posible para permitirle a Finkargo y los Indemnizados que correspondan ejercer su derecho de defensa y la oportunidad de la misma dentro de un debido proceso y, por tales razones, el </w:t>
+        <w:t xml:space="preserve"> se obliga a acordar con </w:t>
+      </w:r>
+      <w:proofErr w:type="spellStart"/>
+      <w:r>
+        <w:t>Finkargo</w:t>
+      </w:r>
+      <w:proofErr w:type="spellEnd"/>
+      <w:r>
+        <w:t xml:space="preserve"> la mejor estrategia de defensa posible para permitirle a </w:t>
+      </w:r>
+      <w:proofErr w:type="spellStart"/>
+      <w:r>
+        <w:t>Finkargo</w:t>
+      </w:r>
+      <w:proofErr w:type="spellEnd"/>
+      <w:r>
+        <w:t xml:space="preserve"> y los Indemnizados que correspondan ejercer su derecho de defensa y la oportunidad de la misma dentro de un debido proceso y, por tales razones, el </w:t>
       </w:r>
       <w:r>
         <w:t xml:space="preserve">Cliente </w:t>
@@ -19359,7 +20637,15 @@
         <w:pStyle w:val="Heading3"/>
       </w:pPr>
       <w:r>
-        <w:t xml:space="preserve">En ningún evento Finkargo será responsable ante el </w:t>
+        <w:t xml:space="preserve">En ningún evento </w:t>
+      </w:r>
+      <w:proofErr w:type="spellStart"/>
+      <w:r>
+        <w:t>Finkargo</w:t>
+      </w:r>
+      <w:proofErr w:type="spellEnd"/>
+      <w:r>
+        <w:t xml:space="preserve"> será responsable ante el </w:t>
       </w:r>
       <w:r>
         <w:t xml:space="preserve">Cliente </w:t>
@@ -19772,7 +21058,15 @@
       </w:r>
       <w:r>
         <w:lastRenderedPageBreak/>
-        <w:t xml:space="preserve">podrá enviar Solicitud de Desembolso alguna a Finkargo. Como consecuencia, en cualquier momento desde la fecha de terminación en los términos establecidos en esta </w:t>
+        <w:t xml:space="preserve">podrá enviar Solicitud de Desembolso alguna a </w:t>
+      </w:r>
+      <w:proofErr w:type="spellStart"/>
+      <w:r>
+        <w:t>Finkargo</w:t>
+      </w:r>
+      <w:proofErr w:type="spellEnd"/>
+      <w:r>
+        <w:t xml:space="preserve">. Como consecuencia, en cualquier momento desde la fecha de terminación en los términos establecidos en esta </w:t>
       </w:r>
       <w:r>
         <w:rPr>
@@ -20074,8 +21368,16 @@
         <w:rPr>
           <w:i/>
         </w:rPr>
-        <w:t xml:space="preserve"> venture</w:t>
-      </w:r>
+        <w:t xml:space="preserve"> </w:t>
+      </w:r>
+      <w:proofErr w:type="spellStart"/>
+      <w:r>
+        <w:rPr>
+          <w:i/>
+        </w:rPr>
+        <w:t>venture</w:t>
+      </w:r>
+      <w:proofErr w:type="spellEnd"/>
       <w:proofErr w:type="gramEnd"/>
       <w:r>
         <w:rPr>
@@ -20084,15 +21386,7 @@
         <w:t>)</w:t>
       </w:r>
       <w:r>
-        <w:t xml:space="preserve">, acuerdo de colaboración, agencia comercial o mandato alguno entre las Partes y ninguna de las disposiciones </w:t>
-      </w:r>
-      <w:proofErr w:type="gramStart"/>
-      <w:r>
-        <w:t>del mismo</w:t>
-      </w:r>
-      <w:proofErr w:type="gramEnd"/>
-      <w:r>
-        <w:t xml:space="preserve"> autoriza a las Partes para que actúe, represente o comprometa a la otra, salvo que se estipule específicamente en este documento.</w:t>
+        <w:t>, acuerdo de colaboración, agencia comercial o mandato alguno entre las Partes y ninguna de las disposiciones del mismo autoriza a las Partes para que actúe, represente o comprometa a la otra, salvo que se estipule específicamente en este documento.</w:t>
       </w:r>
     </w:p>
     <w:p>
@@ -20175,7 +21469,15 @@
         <w:t xml:space="preserve"> será la Plataforma, salvo que</w:t>
       </w:r>
       <w:r>
-        <w:t xml:space="preserve"> Finkargo notifique lo contrario al Cliente de manera previa estableciendo un medio de comunicación distinto para el envío de cualquiera de dichos documentos, bien sea por haber </w:t>
+        <w:t xml:space="preserve"> </w:t>
+      </w:r>
+      <w:proofErr w:type="spellStart"/>
+      <w:r>
+        <w:t>Finkargo</w:t>
+      </w:r>
+      <w:proofErr w:type="spellEnd"/>
+      <w:r>
+        <w:t xml:space="preserve"> notifique lo contrario al Cliente de manera previa estableciendo un medio de comunicación distinto para el envío de cualquiera de dichos documentos, bien sea por haber </w:t>
       </w:r>
       <w:r>
         <w:t>ocurr</w:t>
@@ -20187,7 +21489,15 @@
         <w:t xml:space="preserve"> un daño, suspensión o inhabilitación de la </w:t>
       </w:r>
       <w:r>
-        <w:t>Plataforma, o por cualquier otro motivo, a discreción de Finkargo.</w:t>
+        <w:t xml:space="preserve">Plataforma, o por cualquier otro motivo, a discreción de </w:t>
+      </w:r>
+      <w:proofErr w:type="spellStart"/>
+      <w:r>
+        <w:t>Finkargo</w:t>
+      </w:r>
+      <w:proofErr w:type="spellEnd"/>
+      <w:r>
+        <w:t>.</w:t>
       </w:r>
     </w:p>
     <w:p>
@@ -20270,7 +21580,15 @@
         </w:rPr>
       </w:pPr>
       <w:r>
-        <w:t xml:space="preserve">. El Cliente se obliga a usar la Plataforma de conformidad con los términos y condiciones previstos en la Plataforma. Finkargo o cualquier Afiliada a este podrá realizar cambios o modificaciones a los términos y condiciones de la Plataforma en cualquier momento sin necesidad del consentimiento previo del Cliente. En caso en que el Cliente no acepte los términos y </w:t>
+        <w:t xml:space="preserve">. El Cliente se obliga a usar la Plataforma de conformidad con los términos y condiciones previstos en la Plataforma. </w:t>
+      </w:r>
+      <w:proofErr w:type="spellStart"/>
+      <w:r>
+        <w:t>Finkargo</w:t>
+      </w:r>
+      <w:proofErr w:type="spellEnd"/>
+      <w:r>
+        <w:t xml:space="preserve"> o cualquier Afiliada a este podrá realizar cambios o modificaciones a los términos y condiciones de la Plataforma en cualquier momento sin necesidad del consentimiento previo del Cliente. En caso en que el Cliente no acepte los términos y </w:t>
       </w:r>
       <w:r>
         <w:lastRenderedPageBreak/>
@@ -20624,8 +21942,13 @@
       <w:pPr>
         <w:pStyle w:val="Heading3"/>
       </w:pPr>
-      <w:r>
-        <w:t xml:space="preserve">Finkargo es responsable de los Datos Personales del </w:t>
+      <w:proofErr w:type="spellStart"/>
+      <w:r>
+        <w:t>Finkargo</w:t>
+      </w:r>
+      <w:proofErr w:type="spellEnd"/>
+      <w:r>
+        <w:t xml:space="preserve"> es responsable de los Datos Personales del </w:t>
       </w:r>
       <w:r>
         <w:t>Cliente</w:t>
@@ -20665,7 +21988,15 @@
         <w:t>Cliente</w:t>
       </w:r>
       <w:r>
-        <w:t xml:space="preserve"> y el Avalista autorizan de manera libre, voluntaria, previa, expresa, a Finkargo y sus Afiliadas, así como </w:t>
+        <w:t xml:space="preserve"> y el Avalista autorizan de manera libre, voluntaria, previa, expresa, a </w:t>
+      </w:r>
+      <w:proofErr w:type="spellStart"/>
+      <w:r>
+        <w:t>Finkargo</w:t>
+      </w:r>
+      <w:proofErr w:type="spellEnd"/>
+      <w:r>
+        <w:t xml:space="preserve"> y sus Afiliadas, así como </w:t>
       </w:r>
       <w:r>
         <w:t>al Banco de Comercio Exterior de Colombia S.A. – Bancóldex</w:t>
@@ -20683,7 +22014,15 @@
         <w:t xml:space="preserve">éste </w:t>
       </w:r>
       <w:r>
-        <w:t>para con Finkargo a la Fecha de Firma</w:t>
+        <w:t xml:space="preserve">para con </w:t>
+      </w:r>
+      <w:proofErr w:type="spellStart"/>
+      <w:r>
+        <w:t>Finkargo</w:t>
+      </w:r>
+      <w:proofErr w:type="spellEnd"/>
+      <w:r>
+        <w:t xml:space="preserve"> a la Fecha de Firma</w:t>
       </w:r>
       <w:r>
         <w:t xml:space="preserve"> y o con posterioridad a ella</w:t>
@@ -20709,7 +22048,15 @@
         <w:t>Cliente</w:t>
       </w:r>
       <w:r>
-        <w:t xml:space="preserve"> autoriza a Finkargo para que trate, transfiera o transmita los Datos Personales a terceros, como patrimonios autónomos, y/o beneficiarios de </w:t>
+        <w:t xml:space="preserve"> autoriza a </w:t>
+      </w:r>
+      <w:proofErr w:type="spellStart"/>
+      <w:r>
+        <w:t>Finkargo</w:t>
+      </w:r>
+      <w:proofErr w:type="spellEnd"/>
+      <w:r>
+        <w:t xml:space="preserve"> para que trate, transfiera o transmita los Datos Personales a terceros, como patrimonios autónomos, y/o beneficiarios de </w:t>
       </w:r>
       <w:proofErr w:type="gramStart"/>
       <w:r>
@@ -20744,7 +22091,15 @@
         <w:t>i</w:t>
       </w:r>
       <w:r>
-        <w:t>mismo, en virtud de dicha autorización, Finkargo y sus Afiliadas podrán realizar las consultas, reportes y actualizaciones necesarias en diferentes listas restrictivas y bancos de datos, del comportamiento y crédito comercial, hábitos de pago, manejo de cuenta(s) bancaria(s) y en general el cumplimiento de las obligaciones pecuniarias.</w:t>
+        <w:t xml:space="preserve">mismo, en virtud de dicha autorización, </w:t>
+      </w:r>
+      <w:proofErr w:type="spellStart"/>
+      <w:r>
+        <w:t>Finkargo</w:t>
+      </w:r>
+      <w:proofErr w:type="spellEnd"/>
+      <w:r>
+        <w:t xml:space="preserve"> y sus Afiliadas podrán realizar las consultas, reportes y actualizaciones necesarias en diferentes listas restrictivas y bancos de datos, del comportamiento y crédito comercial, hábitos de pago, manejo de cuenta(s) bancaria(s) y en general el cumplimiento de las obligaciones pecuniarias.</w:t>
       </w:r>
     </w:p>
     <w:p>
@@ -20758,11 +22113,27 @@
         <w:t>Cliente</w:t>
       </w:r>
       <w:r>
-        <w:t xml:space="preserve"> autoriza a Finkargo, o a quien represente sus derechos, a reportar, procesar, solicitar y divulgar a la Central de Información DATACREDITO, o a cualquier otra entidad </w:t>
+        <w:t xml:space="preserve"> autoriza a </w:t>
+      </w:r>
+      <w:proofErr w:type="spellStart"/>
+      <w:r>
+        <w:t>Finkargo</w:t>
+      </w:r>
+      <w:proofErr w:type="spellEnd"/>
+      <w:r>
+        <w:t xml:space="preserve">, o a quien represente sus derechos, a reportar, procesar, solicitar y divulgar a la Central de Información DATACREDITO, o a cualquier otra entidad </w:t>
       </w:r>
       <w:r>
         <w:lastRenderedPageBreak/>
-        <w:t>que maneje o administre bases de datos con los mismos fines, toda la información referente a su comportamiento como clientes de Finkargo. Lo anterior implica que el cumplimiento o incumplimiento de sus obligaciones se reflejará en las mencionadas bases de datos, en donde se consignan de manera completa, todos los datos referentes a su actual y pasado comportamiento frente al sector financiero y, en general, al cumplimiento de sus obligaciones.</w:t>
+        <w:t xml:space="preserve">que maneje o administre bases de datos con los mismos fines, toda la información referente a su comportamiento como clientes de </w:t>
+      </w:r>
+      <w:proofErr w:type="spellStart"/>
+      <w:r>
+        <w:t>Finkargo</w:t>
+      </w:r>
+      <w:proofErr w:type="spellEnd"/>
+      <w:r>
+        <w:t>. Lo anterior implica que el cumplimiento o incumplimiento de sus obligaciones se reflejará en las mencionadas bases de datos, en donde se consignan de manera completa, todos los datos referentes a su actual y pasado comportamiento frente al sector financiero y, en general, al cumplimiento de sus obligaciones.</w:t>
       </w:r>
     </w:p>
     <w:p>
@@ -20796,7 +22167,15 @@
       </w:r>
       <w:proofErr w:type="spellEnd"/>
       <w:r>
-        <w:t xml:space="preserve">) a través de los mecanismos dispuestos para tal fin por Finkargo o sus Afiliadas, conforme a la Política de Privacidad disponible en </w:t>
+        <w:t xml:space="preserve">) a través de los mecanismos dispuestos para tal fin por </w:t>
+      </w:r>
+      <w:proofErr w:type="spellStart"/>
+      <w:r>
+        <w:t>Finkargo</w:t>
+      </w:r>
+      <w:proofErr w:type="spellEnd"/>
+      <w:r>
+        <w:t xml:space="preserve"> o sus Afiliadas, conforme a la Política de Privacidad disponible en </w:t>
       </w:r>
       <w:hyperlink r:id="rId14">
         <w:r>
@@ -20846,7 +22225,15 @@
         <w:t>Cliente</w:t>
       </w:r>
       <w:r>
-        <w:t xml:space="preserve"> autoriza de manera expresa y voluntaria a Finkargo y a cualquier Cesionario Permitido a, durante la totalidad de la Vigencia, recopilar, custodiar, archivar, usar, validar, circular, registrar, suprimir, solicitar, suministrar, procesar, confirmar, tratar, analizar, divulgar o realizar consulta y reporte en los operadores de información legalmente constituidos (centrales de riesgo) del comportamiento crediticio, financiero y comercial del </w:t>
+        <w:t xml:space="preserve"> autoriza de manera expresa y voluntaria a </w:t>
+      </w:r>
+      <w:proofErr w:type="spellStart"/>
+      <w:r>
+        <w:t>Finkargo</w:t>
+      </w:r>
+      <w:proofErr w:type="spellEnd"/>
+      <w:r>
+        <w:t xml:space="preserve"> y a cualquier Cesionario Permitido a, durante la totalidad de la Vigencia, recopilar, custodiar, archivar, usar, validar, circular, registrar, suprimir, solicitar, suministrar, procesar, confirmar, tratar, analizar, divulgar o realizar consulta y reporte en los operadores de información legalmente constituidos (centrales de riesgo) del comportamiento crediticio, financiero y comercial del </w:t>
       </w:r>
       <w:r>
         <w:t>Cliente</w:t>
@@ -21006,7 +22393,15 @@
         <w:t>Cliente</w:t>
       </w:r>
       <w:r>
-        <w:t xml:space="preserve"> autoriza a Finkargo y a cualquier Cesionario Permitido a notificar el comportamiento del </w:t>
+        <w:t xml:space="preserve"> autoriza a </w:t>
+      </w:r>
+      <w:proofErr w:type="spellStart"/>
+      <w:r>
+        <w:t>Finkargo</w:t>
+      </w:r>
+      <w:proofErr w:type="spellEnd"/>
+      <w:r>
+        <w:t xml:space="preserve"> y a cualquier Cesionario Permitido a notificar el comportamiento del </w:t>
       </w:r>
       <w:r>
         <w:t>Cliente</w:t>
@@ -21108,7 +22503,15 @@
         <w:t>de Crédito</w:t>
       </w:r>
       <w:r>
-        <w:t>, cualquier notificación o comunicación exigida o permitida bajo el mismo, que esté dirigida a Finkargo, deberá ser efectuada por cualquiera de los siguientes medios: (</w:t>
+        <w:t xml:space="preserve">, cualquier notificación o comunicación exigida o permitida bajo el mismo, que esté dirigida a </w:t>
+      </w:r>
+      <w:proofErr w:type="spellStart"/>
+      <w:r>
+        <w:t>Finkargo</w:t>
+      </w:r>
+      <w:proofErr w:type="spellEnd"/>
+      <w:r>
+        <w:t>, deberá ser efectuada por cualquiera de los siguientes medios: (</w:t>
       </w:r>
       <w:r>
         <w:t>a</w:t>
@@ -21222,7 +22625,21 @@
               <w:rPr>
                 <w:rFonts w:cs="Open Sans"/>
               </w:rPr>
-              <w:t>A Finkargo:</w:t>
+              <w:t xml:space="preserve">A </w:t>
+            </w:r>
+            <w:proofErr w:type="spellStart"/>
+            <w:r>
+              <w:rPr>
+                <w:rFonts w:cs="Open Sans"/>
+              </w:rPr>
+              <w:t>Finkargo</w:t>
+            </w:r>
+            <w:proofErr w:type="spellEnd"/>
+            <w:r>
+              <w:rPr>
+                <w:rFonts w:cs="Open Sans"/>
+              </w:rPr>
+              <w:t>:</w:t>
             </w:r>
           </w:p>
         </w:tc>
@@ -21359,15 +22776,7 @@
         <w:t>de Crédito</w:t>
       </w:r>
       <w:r>
-        <w:t xml:space="preserve">, serán válidas cuando consten por escrito y estén debidamente firmadas por los </w:t>
-      </w:r>
-      <w:proofErr w:type="gramStart"/>
-      <w:r>
-        <w:t>Funcionarios</w:t>
-      </w:r>
-      <w:proofErr w:type="gramEnd"/>
-      <w:r>
-        <w:t xml:space="preserve"> Autorizados de cada una de las Partes. Las Partes convienen en que, el dejar de ejercer, o la demora en el ejercicio de un derecho, facultad o privilegio de una de las Partes, no se interpretará como un desistimiento o renuncia; ni el ejercicio individual o parcial de los mismos impide el ejercicio posterior del mismo o de cualquier otro derecho, facultad o privilegio establecido en </w:t>
+        <w:t xml:space="preserve">, serán válidas cuando consten por escrito y estén debidamente firmadas por los Funcionarios Autorizados de cada una de las Partes. Las Partes convienen en que, el dejar de ejercer, o la demora en el ejercicio de un derecho, facultad o privilegio de una de las Partes, no se interpretará como un desistimiento o renuncia; ni el ejercicio individual o parcial de los mismos impide el ejercicio posterior del mismo o de cualquier otro derecho, facultad o privilegio establecido en </w:t>
       </w:r>
       <w:r>
         <w:t>este</w:t>
@@ -21405,8 +22814,13 @@
       <w:pPr>
         <w:pStyle w:val="Heading3"/>
       </w:pPr>
-      <w:r>
-        <w:t>Finkargo podrá, de tiempo en tiempo, transferir, ceder, enajenar, aportar o crear un Gravamen sobre este Contrato de Crédito y/o las Cotizaciones de Desembolso</w:t>
+      <w:proofErr w:type="spellStart"/>
+      <w:r>
+        <w:t>Finkargo</w:t>
+      </w:r>
+      <w:proofErr w:type="spellEnd"/>
+      <w:r>
+        <w:t xml:space="preserve"> podrá, de tiempo en tiempo, transferir, ceder, enajenar, aportar o crear un Gravamen sobre este Contrato de Crédito y/o las Cotizaciones de Desembolso</w:t>
       </w:r>
       <w:r>
         <w:t xml:space="preserve"> Aceptadas</w:t>
@@ -21444,7 +22858,15 @@
         <w:t>ni cualquier Anexo</w:t>
       </w:r>
       <w:r>
-        <w:t>, ni crear un Gravamen sobre los mismos o sus derechos, sin el consentimiento previo, escrito y expreso de Finkargo.</w:t>
+        <w:t xml:space="preserve">, ni crear un Gravamen sobre los mismos o sus derechos, sin el consentimiento previo, escrito y expreso de </w:t>
+      </w:r>
+      <w:proofErr w:type="spellStart"/>
+      <w:r>
+        <w:t>Finkargo</w:t>
+      </w:r>
+      <w:proofErr w:type="spellEnd"/>
+      <w:r>
+        <w:t>.</w:t>
       </w:r>
     </w:p>
     <w:p>
@@ -21790,7 +23212,23 @@
         <w:pStyle w:val="Heading3"/>
       </w:pPr>
       <w:r>
-        <w:t>Entregar a Finkargo, dentro de los treinta (30) días siguientes al pago de cualquier Impuesto, el documento que evidencie el pago del Impuesto respectivo y una copia de la declaración de dicho pago, o cualquier otra evidencia satisfactoria para Finkargo, con una certificación por la deducción o retención realizada en cumplimiento de las Leyes Aplicables.</w:t>
+        <w:t xml:space="preserve">Entregar a </w:t>
+      </w:r>
+      <w:proofErr w:type="spellStart"/>
+      <w:r>
+        <w:t>Finkargo</w:t>
+      </w:r>
+      <w:proofErr w:type="spellEnd"/>
+      <w:r>
+        <w:t xml:space="preserve">, dentro de los treinta (30) días siguientes al pago de cualquier Impuesto, el documento que evidencie el pago del Impuesto respectivo y una copia de la declaración de dicho pago, o cualquier otra evidencia satisfactoria para </w:t>
+      </w:r>
+      <w:proofErr w:type="spellStart"/>
+      <w:r>
+        <w:t>Finkargo</w:t>
+      </w:r>
+      <w:proofErr w:type="spellEnd"/>
+      <w:r>
+        <w:t>, con una certificación por la deducción o retención realizada en cumplimiento de las Leyes Aplicables.</w:t>
       </w:r>
     </w:p>
     <w:p>
@@ -21993,7 +23431,15 @@
         <w:t xml:space="preserve">Cliente </w:t>
       </w:r>
       <w:r>
-        <w:t xml:space="preserve">renuncia y libera, en la medida que la Ley Aplicable lo permita, a cualquier reclamo que pueda tener contra Finkargo que surja de una supuesta violación del deber fiduciario o de asesoría en relación con las transacciones, servicios o productos previstos en </w:t>
+        <w:t xml:space="preserve">renuncia y libera, en la medida que la Ley Aplicable lo permita, a cualquier reclamo que pueda tener contra </w:t>
+      </w:r>
+      <w:proofErr w:type="spellStart"/>
+      <w:r>
+        <w:t>Finkargo</w:t>
+      </w:r>
+      <w:proofErr w:type="spellEnd"/>
+      <w:r>
+        <w:t xml:space="preserve"> que surja de una supuesta violación del deber fiduciario o de asesoría en relación con las transacciones, servicios o productos previstos en </w:t>
       </w:r>
       <w:r>
         <w:t>este</w:t>
@@ -22826,7 +24272,7 @@
 </file>
 
 <file path=word/endnotes.xml><?xml version="1.0" encoding="utf-8"?>
-<w:endnotes xmlns:wpc="http://schemas.microsoft.com/office/word/2010/wordprocessingCanvas" xmlns:cx="http://schemas.microsoft.com/office/drawing/2014/chartex" xmlns:cx1="http://schemas.microsoft.com/office/drawing/2015/9/8/chartex" xmlns:cx2="http://schemas.microsoft.com/office/drawing/2015/10/21/chartex" xmlns:cx3="http://schemas.microsoft.com/office/drawing/2016/5/9/chartex" xmlns:cx4="http://schemas.microsoft.com/office/drawing/2016/5/10/chartex" xmlns:cx5="http://schemas.microsoft.com/office/drawing/2016/5/11/chartex" xmlns:cx6="http://schemas.microsoft.com/office/drawing/2016/5/12/chartex" xmlns:cx7="http://schemas.microsoft.com/office/drawing/2016/5/13/chartex" xmlns:cx8="http://schemas.microsoft.com/office/drawing/2016/5/14/chartex" xmlns:mc="http://schemas.openxmlformats.org/markup-compatibility/2006" xmlns:aink="http://schemas.microsoft.com/office/drawing/2016/ink" xmlns:am3d="http://schemas.microsoft.com/office/drawing/2017/model3d" xmlns:o="urn:schemas-microsoft-com:office:office" xmlns:oel="http://schemas.microsoft.com/office/2019/extlst" xmlns:r="http://schemas.openxmlformats.org/officeDocument/2006/relationships" xmlns:m="http://schemas.openxmlformats.org/officeDocument/2006/math" xmlns:v="urn:schemas-microsoft-com:vml" xmlns:wp14="http://schemas.microsoft.com/office/word/2010/wordprocessingDrawing" xmlns:wp="http://schemas.openxmlformats.org/drawingml/2006/wordprocessingDrawing" xmlns:w10="urn:schemas-microsoft-com:office:word" xmlns:w="http://schemas.openxmlformats.org/wordprocessingml/2006/main" xmlns:w14="http://schemas.microsoft.com/office/word/2010/wordml" xmlns:w15="http://schemas.microsoft.com/office/word/2012/wordml" xmlns:w16cex="http://schemas.microsoft.com/office/word/2018/wordml/cex" xmlns:w16cid="http://schemas.microsoft.com/office/word/2016/wordml/cid" xmlns:w16="http://schemas.microsoft.com/office/word/2018/wordml" xmlns:w16du="http://schemas.microsoft.com/office/word/2023/wordml/word16du" xmlns:w16sdtdh="http://schemas.microsoft.com/office/word/2020/wordml/sdtdatahash" xmlns:w16sdtfl="http://schemas.microsoft.com/office/word/2024/wordml/sdtformatlock" xmlns:w16se="http://schemas.microsoft.com/office/word/2015/wordml/symex" xmlns:wpg="http://schemas.microsoft.com/office/word/2010/wordprocessingGroup" xmlns:wpi="http://schemas.microsoft.com/office/word/2010/wordprocessingInk" xmlns:wne="http://schemas.microsoft.com/office/word/2006/wordml" xmlns:wps="http://schemas.microsoft.com/office/word/2010/wordprocessingShape" mc:Ignorable="w14 w15 w16se w16cid w16 w16cex w16sdtdh w16sdtfl w16du wp14">
+<w:endnotes xmlns:wpc="http://schemas.microsoft.com/office/word/2010/wordprocessingCanvas" xmlns:cx="http://schemas.microsoft.com/office/drawing/2014/chartex" xmlns:cx1="http://schemas.microsoft.com/office/drawing/2015/9/8/chartex" xmlns:cx2="http://schemas.microsoft.com/office/drawing/2015/10/21/chartex" xmlns:cx3="http://schemas.microsoft.com/office/drawing/2016/5/9/chartex" xmlns:cx4="http://schemas.microsoft.com/office/drawing/2016/5/10/chartex" xmlns:cx5="http://schemas.microsoft.com/office/drawing/2016/5/11/chartex" xmlns:cx6="http://schemas.microsoft.com/office/drawing/2016/5/12/chartex" xmlns:cx7="http://schemas.microsoft.com/office/drawing/2016/5/13/chartex" xmlns:cx8="http://schemas.microsoft.com/office/drawing/2016/5/14/chartex" xmlns:mc="http://schemas.openxmlformats.org/markup-compatibility/2006" xmlns:aink="http://schemas.microsoft.com/office/drawing/2016/ink" xmlns:am3d="http://schemas.microsoft.com/office/drawing/2017/model3d" xmlns:o="urn:schemas-microsoft-com:office:office" xmlns:r="http://schemas.openxmlformats.org/officeDocument/2006/relationships" xmlns:m="http://schemas.openxmlformats.org/officeDocument/2006/math" xmlns:v="urn:schemas-microsoft-com:vml" xmlns:wp14="http://schemas.microsoft.com/office/word/2010/wordprocessingDrawing" xmlns:wp="http://schemas.openxmlformats.org/drawingml/2006/wordprocessingDrawing" xmlns:w10="urn:schemas-microsoft-com:office:word" xmlns:w="http://schemas.openxmlformats.org/wordprocessingml/2006/main" xmlns:w14="http://schemas.microsoft.com/office/word/2010/wordml" xmlns:w15="http://schemas.microsoft.com/office/word/2012/wordml" xmlns:w16cex="http://schemas.microsoft.com/office/word/2018/wordml/cex" xmlns:w16cid="http://schemas.microsoft.com/office/word/2016/wordml/cid" xmlns:w16="http://schemas.microsoft.com/office/word/2018/wordml" xmlns:w16se="http://schemas.microsoft.com/office/word/2015/wordml/symex" xmlns:wpg="http://schemas.microsoft.com/office/word/2010/wordprocessingGroup" xmlns:wpi="http://schemas.microsoft.com/office/word/2010/wordprocessingInk" xmlns:wne="http://schemas.microsoft.com/office/word/2006/wordml" xmlns:wps="http://schemas.microsoft.com/office/word/2010/wordprocessingShape" mc:Ignorable="w14 w15 w16se w16cid w16 w16cex wp14">
   <w:endnote w:type="separator" w:id="-1">
     <w:p>
       <w:r>
@@ -22852,7 +24298,7 @@
 </file>
 
 <file path=word/footer1.xml><?xml version="1.0" encoding="utf-8"?>
-<w:ftr xmlns:wpc="http://schemas.microsoft.com/office/word/2010/wordprocessingCanvas" xmlns:cx="http://schemas.microsoft.com/office/drawing/2014/chartex" xmlns:cx1="http://schemas.microsoft.com/office/drawing/2015/9/8/chartex" xmlns:cx2="http://schemas.microsoft.com/office/drawing/2015/10/21/chartex" xmlns:cx3="http://schemas.microsoft.com/office/drawing/2016/5/9/chartex" xmlns:cx4="http://schemas.microsoft.com/office/drawing/2016/5/10/chartex" xmlns:cx5="http://schemas.microsoft.com/office/drawing/2016/5/11/chartex" xmlns:cx6="http://schemas.microsoft.com/office/drawing/2016/5/12/chartex" xmlns:cx7="http://schemas.microsoft.com/office/drawing/2016/5/13/chartex" xmlns:cx8="http://schemas.microsoft.com/office/drawing/2016/5/14/chartex" xmlns:mc="http://schemas.openxmlformats.org/markup-compatibility/2006" xmlns:aink="http://schemas.microsoft.com/office/drawing/2016/ink" xmlns:am3d="http://schemas.microsoft.com/office/drawing/2017/model3d" xmlns:o="urn:schemas-microsoft-com:office:office" xmlns:oel="http://schemas.microsoft.com/office/2019/extlst" xmlns:r="http://schemas.openxmlformats.org/officeDocument/2006/relationships" xmlns:m="http://schemas.openxmlformats.org/officeDocument/2006/math" xmlns:v="urn:schemas-microsoft-com:vml" xmlns:wp14="http://schemas.microsoft.com/office/word/2010/wordprocessingDrawing" xmlns:wp="http://schemas.openxmlformats.org/drawingml/2006/wordprocessingDrawing" xmlns:w10="urn:schemas-microsoft-com:office:word" xmlns:w="http://schemas.openxmlformats.org/wordprocessingml/2006/main" xmlns:w14="http://schemas.microsoft.com/office/word/2010/wordml" xmlns:w15="http://schemas.microsoft.com/office/word/2012/wordml" xmlns:w16cex="http://schemas.microsoft.com/office/word/2018/wordml/cex" xmlns:w16cid="http://schemas.microsoft.com/office/word/2016/wordml/cid" xmlns:w16="http://schemas.microsoft.com/office/word/2018/wordml" xmlns:w16du="http://schemas.microsoft.com/office/word/2023/wordml/word16du" xmlns:w16sdtdh="http://schemas.microsoft.com/office/word/2020/wordml/sdtdatahash" xmlns:w16sdtfl="http://schemas.microsoft.com/office/word/2024/wordml/sdtformatlock" xmlns:w16se="http://schemas.microsoft.com/office/word/2015/wordml/symex" xmlns:wpg="http://schemas.microsoft.com/office/word/2010/wordprocessingGroup" xmlns:wpi="http://schemas.microsoft.com/office/word/2010/wordprocessingInk" xmlns:wne="http://schemas.microsoft.com/office/word/2006/wordml" xmlns:wps="http://schemas.microsoft.com/office/word/2010/wordprocessingShape" mc:Ignorable="w14 w15 w16se w16cid w16 w16cex w16sdtdh w16sdtfl w16du wp14">
+<w:ftr xmlns:wpc="http://schemas.microsoft.com/office/word/2010/wordprocessingCanvas" xmlns:cx="http://schemas.microsoft.com/office/drawing/2014/chartex" xmlns:cx1="http://schemas.microsoft.com/office/drawing/2015/9/8/chartex" xmlns:cx2="http://schemas.microsoft.com/office/drawing/2015/10/21/chartex" xmlns:cx3="http://schemas.microsoft.com/office/drawing/2016/5/9/chartex" xmlns:cx4="http://schemas.microsoft.com/office/drawing/2016/5/10/chartex" xmlns:cx5="http://schemas.microsoft.com/office/drawing/2016/5/11/chartex" xmlns:cx6="http://schemas.microsoft.com/office/drawing/2016/5/12/chartex" xmlns:cx7="http://schemas.microsoft.com/office/drawing/2016/5/13/chartex" xmlns:cx8="http://schemas.microsoft.com/office/drawing/2016/5/14/chartex" xmlns:mc="http://schemas.openxmlformats.org/markup-compatibility/2006" xmlns:aink="http://schemas.microsoft.com/office/drawing/2016/ink" xmlns:am3d="http://schemas.microsoft.com/office/drawing/2017/model3d" xmlns:o="urn:schemas-microsoft-com:office:office" xmlns:r="http://schemas.openxmlformats.org/officeDocument/2006/relationships" xmlns:m="http://schemas.openxmlformats.org/officeDocument/2006/math" xmlns:v="urn:schemas-microsoft-com:vml" xmlns:wp14="http://schemas.microsoft.com/office/word/2010/wordprocessingDrawing" xmlns:wp="http://schemas.openxmlformats.org/drawingml/2006/wordprocessingDrawing" xmlns:w10="urn:schemas-microsoft-com:office:word" xmlns:w="http://schemas.openxmlformats.org/wordprocessingml/2006/main" xmlns:w14="http://schemas.microsoft.com/office/word/2010/wordml" xmlns:w15="http://schemas.microsoft.com/office/word/2012/wordml" xmlns:w16cex="http://schemas.microsoft.com/office/word/2018/wordml/cex" xmlns:w16cid="http://schemas.microsoft.com/office/word/2016/wordml/cid" xmlns:w16="http://schemas.microsoft.com/office/word/2018/wordml" xmlns:w16se="http://schemas.microsoft.com/office/word/2015/wordml/symex" xmlns:wpg="http://schemas.microsoft.com/office/word/2010/wordprocessingGroup" xmlns:wpi="http://schemas.microsoft.com/office/word/2010/wordprocessingInk" xmlns:wne="http://schemas.microsoft.com/office/word/2006/wordml" xmlns:wps="http://schemas.microsoft.com/office/word/2010/wordprocessingShape" mc:Ignorable="w14 w15 w16se w16cid w16 w16cex wp14">
   <w:p>
     <w:pPr>
       <w:spacing w:before="240" w:after="0"/>
@@ -22923,7 +24369,7 @@
 </file>
 
 <file path=word/footer2.xml><?xml version="1.0" encoding="utf-8"?>
-<w:ftr xmlns:wpc="http://schemas.microsoft.com/office/word/2010/wordprocessingCanvas" xmlns:cx="http://schemas.microsoft.com/office/drawing/2014/chartex" xmlns:cx1="http://schemas.microsoft.com/office/drawing/2015/9/8/chartex" xmlns:cx2="http://schemas.microsoft.com/office/drawing/2015/10/21/chartex" xmlns:cx3="http://schemas.microsoft.com/office/drawing/2016/5/9/chartex" xmlns:cx4="http://schemas.microsoft.com/office/drawing/2016/5/10/chartex" xmlns:cx5="http://schemas.microsoft.com/office/drawing/2016/5/11/chartex" xmlns:cx6="http://schemas.microsoft.com/office/drawing/2016/5/12/chartex" xmlns:cx7="http://schemas.microsoft.com/office/drawing/2016/5/13/chartex" xmlns:cx8="http://schemas.microsoft.com/office/drawing/2016/5/14/chartex" xmlns:mc="http://schemas.openxmlformats.org/markup-compatibility/2006" xmlns:aink="http://schemas.microsoft.com/office/drawing/2016/ink" xmlns:am3d="http://schemas.microsoft.com/office/drawing/2017/model3d" xmlns:o="urn:schemas-microsoft-com:office:office" xmlns:oel="http://schemas.microsoft.com/office/2019/extlst" xmlns:r="http://schemas.openxmlformats.org/officeDocument/2006/relationships" xmlns:m="http://schemas.openxmlformats.org/officeDocument/2006/math" xmlns:v="urn:schemas-microsoft-com:vml" xmlns:wp14="http://schemas.microsoft.com/office/word/2010/wordprocessingDrawing" xmlns:wp="http://schemas.openxmlformats.org/drawingml/2006/wordprocessingDrawing" xmlns:w10="urn:schemas-microsoft-com:office:word" xmlns:w="http://schemas.openxmlformats.org/wordprocessingml/2006/main" xmlns:w14="http://schemas.microsoft.com/office/word/2010/wordml" xmlns:w15="http://schemas.microsoft.com/office/word/2012/wordml" xmlns:w16cex="http://schemas.microsoft.com/office/word/2018/wordml/cex" xmlns:w16cid="http://schemas.microsoft.com/office/word/2016/wordml/cid" xmlns:w16="http://schemas.microsoft.com/office/word/2018/wordml" xmlns:w16du="http://schemas.microsoft.com/office/word/2023/wordml/word16du" xmlns:w16sdtdh="http://schemas.microsoft.com/office/word/2020/wordml/sdtdatahash" xmlns:w16sdtfl="http://schemas.microsoft.com/office/word/2024/wordml/sdtformatlock" xmlns:w16se="http://schemas.microsoft.com/office/word/2015/wordml/symex" xmlns:wpg="http://schemas.microsoft.com/office/word/2010/wordprocessingGroup" xmlns:wpi="http://schemas.microsoft.com/office/word/2010/wordprocessingInk" xmlns:wne="http://schemas.microsoft.com/office/word/2006/wordml" xmlns:wps="http://schemas.microsoft.com/office/word/2010/wordprocessingShape" mc:Ignorable="w14 w15 w16se w16cid w16 w16cex w16sdtdh w16sdtfl w16du wp14">
+<w:ftr xmlns:wpc="http://schemas.microsoft.com/office/word/2010/wordprocessingCanvas" xmlns:cx="http://schemas.microsoft.com/office/drawing/2014/chartex" xmlns:cx1="http://schemas.microsoft.com/office/drawing/2015/9/8/chartex" xmlns:cx2="http://schemas.microsoft.com/office/drawing/2015/10/21/chartex" xmlns:cx3="http://schemas.microsoft.com/office/drawing/2016/5/9/chartex" xmlns:cx4="http://schemas.microsoft.com/office/drawing/2016/5/10/chartex" xmlns:cx5="http://schemas.microsoft.com/office/drawing/2016/5/11/chartex" xmlns:cx6="http://schemas.microsoft.com/office/drawing/2016/5/12/chartex" xmlns:cx7="http://schemas.microsoft.com/office/drawing/2016/5/13/chartex" xmlns:cx8="http://schemas.microsoft.com/office/drawing/2016/5/14/chartex" xmlns:mc="http://schemas.openxmlformats.org/markup-compatibility/2006" xmlns:aink="http://schemas.microsoft.com/office/drawing/2016/ink" xmlns:am3d="http://schemas.microsoft.com/office/drawing/2017/model3d" xmlns:o="urn:schemas-microsoft-com:office:office" xmlns:r="http://schemas.openxmlformats.org/officeDocument/2006/relationships" xmlns:m="http://schemas.openxmlformats.org/officeDocument/2006/math" xmlns:v="urn:schemas-microsoft-com:vml" xmlns:wp14="http://schemas.microsoft.com/office/word/2010/wordprocessingDrawing" xmlns:wp="http://schemas.openxmlformats.org/drawingml/2006/wordprocessingDrawing" xmlns:w10="urn:schemas-microsoft-com:office:word" xmlns:w="http://schemas.openxmlformats.org/wordprocessingml/2006/main" xmlns:w14="http://schemas.microsoft.com/office/word/2010/wordml" xmlns:w15="http://schemas.microsoft.com/office/word/2012/wordml" xmlns:w16cex="http://schemas.microsoft.com/office/word/2018/wordml/cex" xmlns:w16cid="http://schemas.microsoft.com/office/word/2016/wordml/cid" xmlns:w16="http://schemas.microsoft.com/office/word/2018/wordml" xmlns:w16se="http://schemas.microsoft.com/office/word/2015/wordml/symex" xmlns:wpg="http://schemas.microsoft.com/office/word/2010/wordprocessingGroup" xmlns:wpi="http://schemas.microsoft.com/office/word/2010/wordprocessingInk" xmlns:wne="http://schemas.microsoft.com/office/word/2006/wordml" xmlns:wps="http://schemas.microsoft.com/office/word/2010/wordprocessingShape" mc:Ignorable="w14 w15 w16se w16cid w16 w16cex wp14">
   <w:p>
     <w:pPr>
       <w:spacing w:before="240" w:after="0"/>
@@ -23033,7 +24479,7 @@
 </file>
 
 <file path=word/footer3.xml><?xml version="1.0" encoding="utf-8"?>
-<w:ftr xmlns:wpc="http://schemas.microsoft.com/office/word/2010/wordprocessingCanvas" xmlns:cx="http://schemas.microsoft.com/office/drawing/2014/chartex" xmlns:cx1="http://schemas.microsoft.com/office/drawing/2015/9/8/chartex" xmlns:cx2="http://schemas.microsoft.com/office/drawing/2015/10/21/chartex" xmlns:cx3="http://schemas.microsoft.com/office/drawing/2016/5/9/chartex" xmlns:cx4="http://schemas.microsoft.com/office/drawing/2016/5/10/chartex" xmlns:cx5="http://schemas.microsoft.com/office/drawing/2016/5/11/chartex" xmlns:cx6="http://schemas.microsoft.com/office/drawing/2016/5/12/chartex" xmlns:cx7="http://schemas.microsoft.com/office/drawing/2016/5/13/chartex" xmlns:cx8="http://schemas.microsoft.com/office/drawing/2016/5/14/chartex" xmlns:mc="http://schemas.openxmlformats.org/markup-compatibility/2006" xmlns:aink="http://schemas.microsoft.com/office/drawing/2016/ink" xmlns:am3d="http://schemas.microsoft.com/office/drawing/2017/model3d" xmlns:o="urn:schemas-microsoft-com:office:office" xmlns:oel="http://schemas.microsoft.com/office/2019/extlst" xmlns:r="http://schemas.openxmlformats.org/officeDocument/2006/relationships" xmlns:m="http://schemas.openxmlformats.org/officeDocument/2006/math" xmlns:v="urn:schemas-microsoft-com:vml" xmlns:wp14="http://schemas.microsoft.com/office/word/2010/wordprocessingDrawing" xmlns:wp="http://schemas.openxmlformats.org/drawingml/2006/wordprocessingDrawing" xmlns:w10="urn:schemas-microsoft-com:office:word" xmlns:w="http://schemas.openxmlformats.org/wordprocessingml/2006/main" xmlns:w14="http://schemas.microsoft.com/office/word/2010/wordml" xmlns:w15="http://schemas.microsoft.com/office/word/2012/wordml" xmlns:w16cex="http://schemas.microsoft.com/office/word/2018/wordml/cex" xmlns:w16cid="http://schemas.microsoft.com/office/word/2016/wordml/cid" xmlns:w16="http://schemas.microsoft.com/office/word/2018/wordml" xmlns:w16du="http://schemas.microsoft.com/office/word/2023/wordml/word16du" xmlns:w16sdtdh="http://schemas.microsoft.com/office/word/2020/wordml/sdtdatahash" xmlns:w16sdtfl="http://schemas.microsoft.com/office/word/2024/wordml/sdtformatlock" xmlns:w16se="http://schemas.microsoft.com/office/word/2015/wordml/symex" xmlns:wpg="http://schemas.microsoft.com/office/word/2010/wordprocessingGroup" xmlns:wpi="http://schemas.microsoft.com/office/word/2010/wordprocessingInk" xmlns:wne="http://schemas.microsoft.com/office/word/2006/wordml" xmlns:wps="http://schemas.microsoft.com/office/word/2010/wordprocessingShape" mc:Ignorable="w14 w15 w16se w16cid w16 w16cex w16sdtdh w16sdtfl w16du wp14">
+<w:ftr xmlns:wpc="http://schemas.microsoft.com/office/word/2010/wordprocessingCanvas" xmlns:cx="http://schemas.microsoft.com/office/drawing/2014/chartex" xmlns:cx1="http://schemas.microsoft.com/office/drawing/2015/9/8/chartex" xmlns:cx2="http://schemas.microsoft.com/office/drawing/2015/10/21/chartex" xmlns:cx3="http://schemas.microsoft.com/office/drawing/2016/5/9/chartex" xmlns:cx4="http://schemas.microsoft.com/office/drawing/2016/5/10/chartex" xmlns:cx5="http://schemas.microsoft.com/office/drawing/2016/5/11/chartex" xmlns:cx6="http://schemas.microsoft.com/office/drawing/2016/5/12/chartex" xmlns:cx7="http://schemas.microsoft.com/office/drawing/2016/5/13/chartex" xmlns:cx8="http://schemas.microsoft.com/office/drawing/2016/5/14/chartex" xmlns:mc="http://schemas.openxmlformats.org/markup-compatibility/2006" xmlns:aink="http://schemas.microsoft.com/office/drawing/2016/ink" xmlns:am3d="http://schemas.microsoft.com/office/drawing/2017/model3d" xmlns:o="urn:schemas-microsoft-com:office:office" xmlns:r="http://schemas.openxmlformats.org/officeDocument/2006/relationships" xmlns:m="http://schemas.openxmlformats.org/officeDocument/2006/math" xmlns:v="urn:schemas-microsoft-com:vml" xmlns:wp14="http://schemas.microsoft.com/office/word/2010/wordprocessingDrawing" xmlns:wp="http://schemas.openxmlformats.org/drawingml/2006/wordprocessingDrawing" xmlns:w10="urn:schemas-microsoft-com:office:word" xmlns:w="http://schemas.openxmlformats.org/wordprocessingml/2006/main" xmlns:w14="http://schemas.microsoft.com/office/word/2010/wordml" xmlns:w15="http://schemas.microsoft.com/office/word/2012/wordml" xmlns:w16cex="http://schemas.microsoft.com/office/word/2018/wordml/cex" xmlns:w16cid="http://schemas.microsoft.com/office/word/2016/wordml/cid" xmlns:w16="http://schemas.microsoft.com/office/word/2018/wordml" xmlns:w16se="http://schemas.microsoft.com/office/word/2015/wordml/symex" xmlns:wpg="http://schemas.microsoft.com/office/word/2010/wordprocessingGroup" xmlns:wpi="http://schemas.microsoft.com/office/word/2010/wordprocessingInk" xmlns:wne="http://schemas.microsoft.com/office/word/2006/wordml" xmlns:wps="http://schemas.microsoft.com/office/word/2010/wordprocessingShape" mc:Ignorable="w14 w15 w16se w16cid w16 w16cex wp14">
   <w:p>
     <w:pPr>
       <w:pStyle w:val="Footer"/>
@@ -23137,7 +24583,7 @@
 </file>
 
 <file path=word/footnotes.xml><?xml version="1.0" encoding="utf-8"?>
-<w:footnotes xmlns:wpc="http://schemas.microsoft.com/office/word/2010/wordprocessingCanvas" xmlns:cx="http://schemas.microsoft.com/office/drawing/2014/chartex" xmlns:cx1="http://schemas.microsoft.com/office/drawing/2015/9/8/chartex" xmlns:cx2="http://schemas.microsoft.com/office/drawing/2015/10/21/chartex" xmlns:cx3="http://schemas.microsoft.com/office/drawing/2016/5/9/chartex" xmlns:cx4="http://schemas.microsoft.com/office/drawing/2016/5/10/chartex" xmlns:cx5="http://schemas.microsoft.com/office/drawing/2016/5/11/chartex" xmlns:cx6="http://schemas.microsoft.com/office/drawing/2016/5/12/chartex" xmlns:cx7="http://schemas.microsoft.com/office/drawing/2016/5/13/chartex" xmlns:cx8="http://schemas.microsoft.com/office/drawing/2016/5/14/chartex" xmlns:mc="http://schemas.openxmlformats.org/markup-compatibility/2006" xmlns:aink="http://schemas.microsoft.com/office/drawing/2016/ink" xmlns:am3d="http://schemas.microsoft.com/office/drawing/2017/model3d" xmlns:o="urn:schemas-microsoft-com:office:office" xmlns:oel="http://schemas.microsoft.com/office/2019/extlst" xmlns:r="http://schemas.openxmlformats.org/officeDocument/2006/relationships" xmlns:m="http://schemas.openxmlformats.org/officeDocument/2006/math" xmlns:v="urn:schemas-microsoft-com:vml" xmlns:wp14="http://schemas.microsoft.com/office/word/2010/wordprocessingDrawing" xmlns:wp="http://schemas.openxmlformats.org/drawingml/2006/wordprocessingDrawing" xmlns:w10="urn:schemas-microsoft-com:office:word" xmlns:w="http://schemas.openxmlformats.org/wordprocessingml/2006/main" xmlns:w14="http://schemas.microsoft.com/office/word/2010/wordml" xmlns:w15="http://schemas.microsoft.com/office/word/2012/wordml" xmlns:w16cex="http://schemas.microsoft.com/office/word/2018/wordml/cex" xmlns:w16cid="http://schemas.microsoft.com/office/word/2016/wordml/cid" xmlns:w16="http://schemas.microsoft.com/office/word/2018/wordml" xmlns:w16du="http://schemas.microsoft.com/office/word/2023/wordml/word16du" xmlns:w16sdtdh="http://schemas.microsoft.com/office/word/2020/wordml/sdtdatahash" xmlns:w16sdtfl="http://schemas.microsoft.com/office/word/2024/wordml/sdtformatlock" xmlns:w16se="http://schemas.microsoft.com/office/word/2015/wordml/symex" xmlns:wpg="http://schemas.microsoft.com/office/word/2010/wordprocessingGroup" xmlns:wpi="http://schemas.microsoft.com/office/word/2010/wordprocessingInk" xmlns:wne="http://schemas.microsoft.com/office/word/2006/wordml" xmlns:wps="http://schemas.microsoft.com/office/word/2010/wordprocessingShape" mc:Ignorable="w14 w15 w16se w16cid w16 w16cex w16sdtdh w16sdtfl w16du wp14">
+<w:footnotes xmlns:wpc="http://schemas.microsoft.com/office/word/2010/wordprocessingCanvas" xmlns:cx="http://schemas.microsoft.com/office/drawing/2014/chartex" xmlns:cx1="http://schemas.microsoft.com/office/drawing/2015/9/8/chartex" xmlns:cx2="http://schemas.microsoft.com/office/drawing/2015/10/21/chartex" xmlns:cx3="http://schemas.microsoft.com/office/drawing/2016/5/9/chartex" xmlns:cx4="http://schemas.microsoft.com/office/drawing/2016/5/10/chartex" xmlns:cx5="http://schemas.microsoft.com/office/drawing/2016/5/11/chartex" xmlns:cx6="http://schemas.microsoft.com/office/drawing/2016/5/12/chartex" xmlns:cx7="http://schemas.microsoft.com/office/drawing/2016/5/13/chartex" xmlns:cx8="http://schemas.microsoft.com/office/drawing/2016/5/14/chartex" xmlns:mc="http://schemas.openxmlformats.org/markup-compatibility/2006" xmlns:aink="http://schemas.microsoft.com/office/drawing/2016/ink" xmlns:am3d="http://schemas.microsoft.com/office/drawing/2017/model3d" xmlns:o="urn:schemas-microsoft-com:office:office" xmlns:r="http://schemas.openxmlformats.org/officeDocument/2006/relationships" xmlns:m="http://schemas.openxmlformats.org/officeDocument/2006/math" xmlns:v="urn:schemas-microsoft-com:vml" xmlns:wp14="http://schemas.microsoft.com/office/word/2010/wordprocessingDrawing" xmlns:wp="http://schemas.openxmlformats.org/drawingml/2006/wordprocessingDrawing" xmlns:w10="urn:schemas-microsoft-com:office:word" xmlns:w="http://schemas.openxmlformats.org/wordprocessingml/2006/main" xmlns:w14="http://schemas.microsoft.com/office/word/2010/wordml" xmlns:w15="http://schemas.microsoft.com/office/word/2012/wordml" xmlns:w16cex="http://schemas.microsoft.com/office/word/2018/wordml/cex" xmlns:w16cid="http://schemas.microsoft.com/office/word/2016/wordml/cid" xmlns:w16="http://schemas.microsoft.com/office/word/2018/wordml" xmlns:w16se="http://schemas.microsoft.com/office/word/2015/wordml/symex" xmlns:wpg="http://schemas.microsoft.com/office/word/2010/wordprocessingGroup" xmlns:wpi="http://schemas.microsoft.com/office/word/2010/wordprocessingInk" xmlns:wne="http://schemas.microsoft.com/office/word/2006/wordml" xmlns:wps="http://schemas.microsoft.com/office/word/2010/wordprocessingShape" mc:Ignorable="w14 w15 w16se w16cid w16 w16cex wp14">
   <w:footnote w:type="separator" w:id="-1">
     <w:p>
       <w:pPr>
@@ -23184,7 +24630,7 @@
 </file>
 
 <file path=word/header1.xml><?xml version="1.0" encoding="utf-8"?>
-<w:hdr xmlns:wpc="http://schemas.microsoft.com/office/word/2010/wordprocessingCanvas" xmlns:cx="http://schemas.microsoft.com/office/drawing/2014/chartex" xmlns:cx1="http://schemas.microsoft.com/office/drawing/2015/9/8/chartex" xmlns:cx2="http://schemas.microsoft.com/office/drawing/2015/10/21/chartex" xmlns:cx3="http://schemas.microsoft.com/office/drawing/2016/5/9/chartex" xmlns:cx4="http://schemas.microsoft.com/office/drawing/2016/5/10/chartex" xmlns:cx5="http://schemas.microsoft.com/office/drawing/2016/5/11/chartex" xmlns:cx6="http://schemas.microsoft.com/office/drawing/2016/5/12/chartex" xmlns:cx7="http://schemas.microsoft.com/office/drawing/2016/5/13/chartex" xmlns:cx8="http://schemas.microsoft.com/office/drawing/2016/5/14/chartex" xmlns:mc="http://schemas.openxmlformats.org/markup-compatibility/2006" xmlns:aink="http://schemas.microsoft.com/office/drawing/2016/ink" xmlns:am3d="http://schemas.microsoft.com/office/drawing/2017/model3d" xmlns:o="urn:schemas-microsoft-com:office:office" xmlns:oel="http://schemas.microsoft.com/office/2019/extlst" xmlns:r="http://schemas.openxmlformats.org/officeDocument/2006/relationships" xmlns:m="http://schemas.openxmlformats.org/officeDocument/2006/math" xmlns:v="urn:schemas-microsoft-com:vml" xmlns:wp14="http://schemas.microsoft.com/office/word/2010/wordprocessingDrawing" xmlns:wp="http://schemas.openxmlformats.org/drawingml/2006/wordprocessingDrawing" xmlns:w10="urn:schemas-microsoft-com:office:word" xmlns:w="http://schemas.openxmlformats.org/wordprocessingml/2006/main" xmlns:w14="http://schemas.microsoft.com/office/word/2010/wordml" xmlns:w15="http://schemas.microsoft.com/office/word/2012/wordml" xmlns:w16cex="http://schemas.microsoft.com/office/word/2018/wordml/cex" xmlns:w16cid="http://schemas.microsoft.com/office/word/2016/wordml/cid" xmlns:w16="http://schemas.microsoft.com/office/word/2018/wordml" xmlns:w16du="http://schemas.microsoft.com/office/word/2023/wordml/word16du" xmlns:w16sdtdh="http://schemas.microsoft.com/office/word/2020/wordml/sdtdatahash" xmlns:w16sdtfl="http://schemas.microsoft.com/office/word/2024/wordml/sdtformatlock" xmlns:w16se="http://schemas.microsoft.com/office/word/2015/wordml/symex" xmlns:wpg="http://schemas.microsoft.com/office/word/2010/wordprocessingGroup" xmlns:wpi="http://schemas.microsoft.com/office/word/2010/wordprocessingInk" xmlns:wne="http://schemas.microsoft.com/office/word/2006/wordml" xmlns:wps="http://schemas.microsoft.com/office/word/2010/wordprocessingShape" mc:Ignorable="w14 w15 w16se w16cid w16 w16cex w16sdtdh w16sdtfl w16du wp14">
+<w:hdr xmlns:wpc="http://schemas.microsoft.com/office/word/2010/wordprocessingCanvas" xmlns:cx="http://schemas.microsoft.com/office/drawing/2014/chartex" xmlns:cx1="http://schemas.microsoft.com/office/drawing/2015/9/8/chartex" xmlns:cx2="http://schemas.microsoft.com/office/drawing/2015/10/21/chartex" xmlns:cx3="http://schemas.microsoft.com/office/drawing/2016/5/9/chartex" xmlns:cx4="http://schemas.microsoft.com/office/drawing/2016/5/10/chartex" xmlns:cx5="http://schemas.microsoft.com/office/drawing/2016/5/11/chartex" xmlns:cx6="http://schemas.microsoft.com/office/drawing/2016/5/12/chartex" xmlns:cx7="http://schemas.microsoft.com/office/drawing/2016/5/13/chartex" xmlns:cx8="http://schemas.microsoft.com/office/drawing/2016/5/14/chartex" xmlns:mc="http://schemas.openxmlformats.org/markup-compatibility/2006" xmlns:aink="http://schemas.microsoft.com/office/drawing/2016/ink" xmlns:am3d="http://schemas.microsoft.com/office/drawing/2017/model3d" xmlns:o="urn:schemas-microsoft-com:office:office" xmlns:r="http://schemas.openxmlformats.org/officeDocument/2006/relationships" xmlns:m="http://schemas.openxmlformats.org/officeDocument/2006/math" xmlns:v="urn:schemas-microsoft-com:vml" xmlns:wp14="http://schemas.microsoft.com/office/word/2010/wordprocessingDrawing" xmlns:wp="http://schemas.openxmlformats.org/drawingml/2006/wordprocessingDrawing" xmlns:w10="urn:schemas-microsoft-com:office:word" xmlns:w="http://schemas.openxmlformats.org/wordprocessingml/2006/main" xmlns:w14="http://schemas.microsoft.com/office/word/2010/wordml" xmlns:w15="http://schemas.microsoft.com/office/word/2012/wordml" xmlns:w16cex="http://schemas.microsoft.com/office/word/2018/wordml/cex" xmlns:w16cid="http://schemas.microsoft.com/office/word/2016/wordml/cid" xmlns:w16="http://schemas.microsoft.com/office/word/2018/wordml" xmlns:w16se="http://schemas.microsoft.com/office/word/2015/wordml/symex" xmlns:wpg="http://schemas.microsoft.com/office/word/2010/wordprocessingGroup" xmlns:wpi="http://schemas.microsoft.com/office/word/2010/wordprocessingInk" xmlns:wne="http://schemas.microsoft.com/office/word/2006/wordml" xmlns:wps="http://schemas.microsoft.com/office/word/2010/wordprocessingShape" mc:Ignorable="w14 w15 w16se w16cid w16 w16cex wp14">
   <w:p>
     <w:pPr>
       <w:pStyle w:val="Header"/>
@@ -23244,7 +24690,7 @@
 </file>
 
 <file path=word/numbering.xml><?xml version="1.0" encoding="utf-8"?>
-<w:numbering xmlns:wpc="http://schemas.microsoft.com/office/word/2010/wordprocessingCanvas" xmlns:cx="http://schemas.microsoft.com/office/drawing/2014/chartex" xmlns:cx1="http://schemas.microsoft.com/office/drawing/2015/9/8/chartex" xmlns:cx2="http://schemas.microsoft.com/office/drawing/2015/10/21/chartex" xmlns:cx3="http://schemas.microsoft.com/office/drawing/2016/5/9/chartex" xmlns:cx4="http://schemas.microsoft.com/office/drawing/2016/5/10/chartex" xmlns:cx5="http://schemas.microsoft.com/office/drawing/2016/5/11/chartex" xmlns:cx6="http://schemas.microsoft.com/office/drawing/2016/5/12/chartex" xmlns:cx7="http://schemas.microsoft.com/office/drawing/2016/5/13/chartex" xmlns:cx8="http://schemas.microsoft.com/office/drawing/2016/5/14/chartex" xmlns:mc="http://schemas.openxmlformats.org/markup-compatibility/2006" xmlns:aink="http://schemas.microsoft.com/office/drawing/2016/ink" xmlns:am3d="http://schemas.microsoft.com/office/drawing/2017/model3d" xmlns:o="urn:schemas-microsoft-com:office:office" xmlns:oel="http://schemas.microsoft.com/office/2019/extlst" xmlns:r="http://schemas.openxmlformats.org/officeDocument/2006/relationships" xmlns:m="http://schemas.openxmlformats.org/officeDocument/2006/math" xmlns:v="urn:schemas-microsoft-com:vml" xmlns:wp14="http://schemas.microsoft.com/office/word/2010/wordprocessingDrawing" xmlns:wp="http://schemas.openxmlformats.org/drawingml/2006/wordprocessingDrawing" xmlns:w10="urn:schemas-microsoft-com:office:word" xmlns:w="http://schemas.openxmlformats.org/wordprocessingml/2006/main" xmlns:w14="http://schemas.microsoft.com/office/word/2010/wordml" xmlns:w15="http://schemas.microsoft.com/office/word/2012/wordml" xmlns:w16cex="http://schemas.microsoft.com/office/word/2018/wordml/cex" xmlns:w16cid="http://schemas.microsoft.com/office/word/2016/wordml/cid" xmlns:w16="http://schemas.microsoft.com/office/word/2018/wordml" xmlns:w16du="http://schemas.microsoft.com/office/word/2023/wordml/word16du" xmlns:w16sdtdh="http://schemas.microsoft.com/office/word/2020/wordml/sdtdatahash" xmlns:w16sdtfl="http://schemas.microsoft.com/office/word/2024/wordml/sdtformatlock" xmlns:w16se="http://schemas.microsoft.com/office/word/2015/wordml/symex" xmlns:wpg="http://schemas.microsoft.com/office/word/2010/wordprocessingGroup" xmlns:wpi="http://schemas.microsoft.com/office/word/2010/wordprocessingInk" xmlns:wne="http://schemas.microsoft.com/office/word/2006/wordml" xmlns:wps="http://schemas.microsoft.com/office/word/2010/wordprocessingShape" mc:Ignorable="w14 w15 w16se w16cid w16 w16cex w16sdtdh w16sdtfl w16du wp14">
+<w:numbering xmlns:wpc="http://schemas.microsoft.com/office/word/2010/wordprocessingCanvas" xmlns:cx="http://schemas.microsoft.com/office/drawing/2014/chartex" xmlns:cx1="http://schemas.microsoft.com/office/drawing/2015/9/8/chartex" xmlns:cx2="http://schemas.microsoft.com/office/drawing/2015/10/21/chartex" xmlns:cx3="http://schemas.microsoft.com/office/drawing/2016/5/9/chartex" xmlns:cx4="http://schemas.microsoft.com/office/drawing/2016/5/10/chartex" xmlns:cx5="http://schemas.microsoft.com/office/drawing/2016/5/11/chartex" xmlns:cx6="http://schemas.microsoft.com/office/drawing/2016/5/12/chartex" xmlns:cx7="http://schemas.microsoft.com/office/drawing/2016/5/13/chartex" xmlns:cx8="http://schemas.microsoft.com/office/drawing/2016/5/14/chartex" xmlns:mc="http://schemas.openxmlformats.org/markup-compatibility/2006" xmlns:aink="http://schemas.microsoft.com/office/drawing/2016/ink" xmlns:am3d="http://schemas.microsoft.com/office/drawing/2017/model3d" xmlns:o="urn:schemas-microsoft-com:office:office" xmlns:r="http://schemas.openxmlformats.org/officeDocument/2006/relationships" xmlns:m="http://schemas.openxmlformats.org/officeDocument/2006/math" xmlns:v="urn:schemas-microsoft-com:vml" xmlns:wp14="http://schemas.microsoft.com/office/word/2010/wordprocessingDrawing" xmlns:wp="http://schemas.openxmlformats.org/drawingml/2006/wordprocessingDrawing" xmlns:w10="urn:schemas-microsoft-com:office:word" xmlns:w="http://schemas.openxmlformats.org/wordprocessingml/2006/main" xmlns:w14="http://schemas.microsoft.com/office/word/2010/wordml" xmlns:w15="http://schemas.microsoft.com/office/word/2012/wordml" xmlns:w16cex="http://schemas.microsoft.com/office/word/2018/wordml/cex" xmlns:w16cid="http://schemas.microsoft.com/office/word/2016/wordml/cid" xmlns:w16="http://schemas.microsoft.com/office/word/2018/wordml" xmlns:w16se="http://schemas.microsoft.com/office/word/2015/wordml/symex" xmlns:wpg="http://schemas.microsoft.com/office/word/2010/wordprocessingGroup" xmlns:wpi="http://schemas.microsoft.com/office/word/2010/wordprocessingInk" xmlns:wne="http://schemas.microsoft.com/office/word/2006/wordml" xmlns:wps="http://schemas.microsoft.com/office/word/2010/wordprocessingShape" mc:Ignorable="w14 w15 w16se w16cid w16 w16cex wp14">
   <w:abstractNum w:abstractNumId="0" w15:restartNumberingAfterBreak="0">
     <w:nsid w:val="04AB477D"/>
     <w:multiLevelType w:val="hybridMultilevel"/>
@@ -26314,40 +27760,40 @@
       </w:pPr>
     </w:lvl>
   </w:abstractNum>
-  <w:num w:numId="1" w16cid:durableId="127166980">
+  <w:num w:numId="1">
     <w:abstractNumId w:val="22"/>
   </w:num>
-  <w:num w:numId="2" w16cid:durableId="1627197850">
+  <w:num w:numId="2">
     <w:abstractNumId w:val="13"/>
   </w:num>
-  <w:num w:numId="3" w16cid:durableId="1629316503">
+  <w:num w:numId="3">
     <w:abstractNumId w:val="19"/>
   </w:num>
-  <w:num w:numId="4" w16cid:durableId="1421560161">
+  <w:num w:numId="4">
     <w:abstractNumId w:val="17"/>
   </w:num>
-  <w:num w:numId="5" w16cid:durableId="1687096976">
+  <w:num w:numId="5">
     <w:abstractNumId w:val="20"/>
   </w:num>
-  <w:num w:numId="6" w16cid:durableId="411658153">
+  <w:num w:numId="6">
     <w:abstractNumId w:val="3"/>
   </w:num>
-  <w:num w:numId="7" w16cid:durableId="2071414532">
+  <w:num w:numId="7">
     <w:abstractNumId w:val="8"/>
   </w:num>
-  <w:num w:numId="8" w16cid:durableId="660427482">
+  <w:num w:numId="8">
     <w:abstractNumId w:val="25"/>
   </w:num>
-  <w:num w:numId="9" w16cid:durableId="1981036717">
+  <w:num w:numId="9">
     <w:abstractNumId w:val="9"/>
   </w:num>
-  <w:num w:numId="10" w16cid:durableId="1414888852">
+  <w:num w:numId="10">
     <w:abstractNumId w:val="14"/>
   </w:num>
-  <w:num w:numId="11" w16cid:durableId="397754635">
+  <w:num w:numId="11">
     <w:abstractNumId w:val="18"/>
   </w:num>
-  <w:num w:numId="12" w16cid:durableId="828449686">
+  <w:num w:numId="12">
     <w:abstractNumId w:val="8"/>
     <w:lvlOverride w:ilvl="0">
       <w:startOverride w:val="1"/>
@@ -26377,13 +27823,13 @@
       <w:startOverride w:val="1"/>
     </w:lvlOverride>
   </w:num>
-  <w:num w:numId="13" w16cid:durableId="572084157">
+  <w:num w:numId="13">
     <w:abstractNumId w:val="12"/>
   </w:num>
-  <w:num w:numId="14" w16cid:durableId="666709668">
+  <w:num w:numId="14">
     <w:abstractNumId w:val="4"/>
   </w:num>
-  <w:num w:numId="15" w16cid:durableId="108090065">
+  <w:num w:numId="15">
     <w:abstractNumId w:val="22"/>
     <w:lvlOverride w:ilvl="0">
       <w:startOverride w:val="1"/>
@@ -26413,7 +27859,7 @@
       <w:startOverride w:val="1"/>
     </w:lvlOverride>
   </w:num>
-  <w:num w:numId="16" w16cid:durableId="340133476">
+  <w:num w:numId="16">
     <w:abstractNumId w:val="22"/>
     <w:lvlOverride w:ilvl="0">
       <w:startOverride w:val="1"/>
@@ -26443,10 +27889,10 @@
       <w:startOverride w:val="1"/>
     </w:lvlOverride>
   </w:num>
-  <w:num w:numId="17" w16cid:durableId="393427522">
+  <w:num w:numId="17">
     <w:abstractNumId w:val="0"/>
   </w:num>
-  <w:num w:numId="18" w16cid:durableId="1838111334">
+  <w:num w:numId="18">
     <w:abstractNumId w:val="22"/>
     <w:lvlOverride w:ilvl="0">
       <w:startOverride w:val="1"/>
@@ -26476,7 +27922,7 @@
       <w:startOverride w:val="1"/>
     </w:lvlOverride>
   </w:num>
-  <w:num w:numId="19" w16cid:durableId="1476534102">
+  <w:num w:numId="19">
     <w:abstractNumId w:val="22"/>
     <w:lvlOverride w:ilvl="0">
       <w:startOverride w:val="1"/>
@@ -26506,7 +27952,7 @@
       <w:startOverride w:val="1"/>
     </w:lvlOverride>
   </w:num>
-  <w:num w:numId="20" w16cid:durableId="1237010700">
+  <w:num w:numId="20">
     <w:abstractNumId w:val="22"/>
     <w:lvlOverride w:ilvl="0">
       <w:startOverride w:val="1"/>
@@ -26536,25 +27982,25 @@
       <w:startOverride w:val="1"/>
     </w:lvlOverride>
   </w:num>
-  <w:num w:numId="21" w16cid:durableId="1998915209">
+  <w:num w:numId="21">
     <w:abstractNumId w:val="6"/>
   </w:num>
-  <w:num w:numId="22" w16cid:durableId="1499730378">
+  <w:num w:numId="22">
     <w:abstractNumId w:val="16"/>
   </w:num>
-  <w:num w:numId="23" w16cid:durableId="1141189352">
+  <w:num w:numId="23">
     <w:abstractNumId w:val="24"/>
   </w:num>
-  <w:num w:numId="24" w16cid:durableId="1267925940">
+  <w:num w:numId="24">
     <w:abstractNumId w:val="21"/>
   </w:num>
-  <w:num w:numId="25" w16cid:durableId="1017081005">
+  <w:num w:numId="25">
     <w:abstractNumId w:val="5"/>
   </w:num>
-  <w:num w:numId="26" w16cid:durableId="1694107939">
+  <w:num w:numId="26">
     <w:abstractNumId w:val="1"/>
   </w:num>
-  <w:num w:numId="27" w16cid:durableId="1493250873">
+  <w:num w:numId="27">
     <w:abstractNumId w:val="22"/>
     <w:lvlOverride w:ilvl="0">
       <w:startOverride w:val="1"/>
@@ -26584,7 +28030,7 @@
       <w:startOverride w:val="1"/>
     </w:lvlOverride>
   </w:num>
-  <w:num w:numId="28" w16cid:durableId="411972235">
+  <w:num w:numId="28">
     <w:abstractNumId w:val="22"/>
     <w:lvlOverride w:ilvl="0">
       <w:startOverride w:val="1"/>
@@ -26614,7 +28060,7 @@
       <w:startOverride w:val="1"/>
     </w:lvlOverride>
   </w:num>
-  <w:num w:numId="29" w16cid:durableId="1960407188">
+  <w:num w:numId="29">
     <w:abstractNumId w:val="22"/>
     <w:lvlOverride w:ilvl="0">
       <w:startOverride w:val="1"/>
@@ -26644,7 +28090,7 @@
       <w:startOverride w:val="1"/>
     </w:lvlOverride>
   </w:num>
-  <w:num w:numId="30" w16cid:durableId="1004288064">
+  <w:num w:numId="30">
     <w:abstractNumId w:val="22"/>
     <w:lvlOverride w:ilvl="0">
       <w:startOverride w:val="1"/>
@@ -26674,7 +28120,7 @@
       <w:startOverride w:val="1"/>
     </w:lvlOverride>
   </w:num>
-  <w:num w:numId="31" w16cid:durableId="1341661228">
+  <w:num w:numId="31">
     <w:abstractNumId w:val="22"/>
     <w:lvlOverride w:ilvl="0">
       <w:startOverride w:val="1"/>
@@ -26704,7 +28150,7 @@
       <w:startOverride w:val="1"/>
     </w:lvlOverride>
   </w:num>
-  <w:num w:numId="32" w16cid:durableId="584530501">
+  <w:num w:numId="32">
     <w:abstractNumId w:val="22"/>
     <w:lvlOverride w:ilvl="0">
       <w:startOverride w:val="1"/>
@@ -26734,10 +28180,10 @@
       <w:startOverride w:val="1"/>
     </w:lvlOverride>
   </w:num>
-  <w:num w:numId="33" w16cid:durableId="527959731">
+  <w:num w:numId="33">
     <w:abstractNumId w:val="15"/>
   </w:num>
-  <w:num w:numId="34" w16cid:durableId="983774844">
+  <w:num w:numId="34">
     <w:abstractNumId w:val="22"/>
     <w:lvlOverride w:ilvl="0">
       <w:startOverride w:val="1"/>
@@ -26767,7 +28213,7 @@
       <w:startOverride w:val="1"/>
     </w:lvlOverride>
   </w:num>
-  <w:num w:numId="35" w16cid:durableId="1076511706">
+  <w:num w:numId="35">
     <w:abstractNumId w:val="22"/>
     <w:lvlOverride w:ilvl="0">
       <w:startOverride w:val="1"/>
@@ -26797,7 +28243,7 @@
       <w:startOverride w:val="1"/>
     </w:lvlOverride>
   </w:num>
-  <w:num w:numId="36" w16cid:durableId="1859201236">
+  <w:num w:numId="36">
     <w:abstractNumId w:val="22"/>
     <w:lvlOverride w:ilvl="0">
       <w:startOverride w:val="1"/>
@@ -26827,7 +28273,7 @@
       <w:startOverride w:val="1"/>
     </w:lvlOverride>
   </w:num>
-  <w:num w:numId="37" w16cid:durableId="1064717559">
+  <w:num w:numId="37">
     <w:abstractNumId w:val="22"/>
     <w:lvlOverride w:ilvl="0">
       <w:startOverride w:val="1"/>
@@ -26857,7 +28303,7 @@
       <w:startOverride w:val="1"/>
     </w:lvlOverride>
   </w:num>
-  <w:num w:numId="38" w16cid:durableId="1568146243">
+  <w:num w:numId="38">
     <w:abstractNumId w:val="8"/>
     <w:lvlOverride w:ilvl="0">
       <w:startOverride w:val="1"/>
@@ -26887,7 +28333,7 @@
       <w:startOverride w:val="1"/>
     </w:lvlOverride>
   </w:num>
-  <w:num w:numId="39" w16cid:durableId="557205626">
+  <w:num w:numId="39">
     <w:abstractNumId w:val="8"/>
     <w:lvlOverride w:ilvl="0">
       <w:startOverride w:val="1"/>
@@ -26917,34 +28363,34 @@
       <w:startOverride w:val="1"/>
     </w:lvlOverride>
   </w:num>
-  <w:num w:numId="40" w16cid:durableId="994141318">
+  <w:num w:numId="40">
     <w:abstractNumId w:val="7"/>
   </w:num>
-  <w:num w:numId="41" w16cid:durableId="153835960">
+  <w:num w:numId="41">
     <w:abstractNumId w:val="11"/>
   </w:num>
-  <w:num w:numId="42" w16cid:durableId="1640378444">
+  <w:num w:numId="42">
     <w:abstractNumId w:val="22"/>
   </w:num>
-  <w:num w:numId="43" w16cid:durableId="958609003">
+  <w:num w:numId="43">
     <w:abstractNumId w:val="22"/>
   </w:num>
-  <w:num w:numId="44" w16cid:durableId="2059622156">
+  <w:num w:numId="44">
     <w:abstractNumId w:val="22"/>
   </w:num>
-  <w:num w:numId="45" w16cid:durableId="2032488562">
+  <w:num w:numId="45">
     <w:abstractNumId w:val="22"/>
   </w:num>
-  <w:num w:numId="46" w16cid:durableId="804011224">
+  <w:num w:numId="46">
     <w:abstractNumId w:val="2"/>
   </w:num>
-  <w:num w:numId="47" w16cid:durableId="1790855848">
+  <w:num w:numId="47">
     <w:abstractNumId w:val="10"/>
   </w:num>
-  <w:num w:numId="48" w16cid:durableId="1125465558">
+  <w:num w:numId="48">
     <w:abstractNumId w:val="23"/>
   </w:num>
-  <w:num w:numId="49" w16cid:durableId="721758708">
+  <w:num w:numId="49">
     <w:abstractNumId w:val="8"/>
     <w:lvlOverride w:ilvl="0">
       <w:startOverride w:val="1"/>
@@ -26979,7 +28425,7 @@
 </file>
 
 <file path=word/styles.xml><?xml version="1.0" encoding="utf-8"?>
-<w:styles xmlns:mc="http://schemas.openxmlformats.org/markup-compatibility/2006" xmlns:r="http://schemas.openxmlformats.org/officeDocument/2006/relationships" xmlns:w="http://schemas.openxmlformats.org/wordprocessingml/2006/main" xmlns:w14="http://schemas.microsoft.com/office/word/2010/wordml" xmlns:w15="http://schemas.microsoft.com/office/word/2012/wordml" xmlns:w16cex="http://schemas.microsoft.com/office/word/2018/wordml/cex" xmlns:w16cid="http://schemas.microsoft.com/office/word/2016/wordml/cid" xmlns:w16="http://schemas.microsoft.com/office/word/2018/wordml" xmlns:w16du="http://schemas.microsoft.com/office/word/2023/wordml/word16du" xmlns:w16sdtdh="http://schemas.microsoft.com/office/word/2020/wordml/sdtdatahash" xmlns:w16sdtfl="http://schemas.microsoft.com/office/word/2024/wordml/sdtformatlock" xmlns:w16se="http://schemas.microsoft.com/office/word/2015/wordml/symex" mc:Ignorable="w14 w15 w16se w16cid w16 w16cex w16sdtdh w16sdtfl w16du">
+<w:styles xmlns:mc="http://schemas.openxmlformats.org/markup-compatibility/2006" xmlns:r="http://schemas.openxmlformats.org/officeDocument/2006/relationships" xmlns:w="http://schemas.openxmlformats.org/wordprocessingml/2006/main" xmlns:w14="http://schemas.microsoft.com/office/word/2010/wordml" xmlns:w15="http://schemas.microsoft.com/office/word/2012/wordml" xmlns:w16cex="http://schemas.microsoft.com/office/word/2018/wordml/cex" xmlns:w16cid="http://schemas.microsoft.com/office/word/2016/wordml/cid" xmlns:w16="http://schemas.microsoft.com/office/word/2018/wordml" xmlns:w16se="http://schemas.microsoft.com/office/word/2015/wordml/symex" mc:Ignorable="w14 w15 w16se w16cid w16 w16cex">
   <w:docDefaults>
     <w:rPrDefault>
       <w:rPr>

</xml_diff>